<commit_message>
user guide update for v1.0.0
</commit_message>
<xml_diff>
--- a/docs/user-guide/Church Operations User Guide.docx
+++ b/docs/user-guide/Church Operations User Guide.docx
@@ -488,7 +488,7 @@
                 <w:color w:val="202833"/>
                 <w:sz w:val="18"/>
               </w:rPr>
-              <w:t>Offerings, finance, budgets, reference data, reports, and official tax extracts</w:t>
+              <w:t>Offerings, finance, budgets, reports, and official tax extracts</w:t>
             </w:r>
           </w:p>
         </w:tc>
@@ -592,7 +592,7 @@
                 <w:color w:val="202833"/>
                 <w:sz w:val="18"/>
               </w:rPr>
-              <w:t>Dashboard, member records, and member-related reference data</w:t>
+              <w:t>Dashboard and member records</w:t>
             </w:r>
           </w:p>
         </w:tc>
@@ -1093,7 +1093,7 @@
                 <w:color w:val="202833"/>
                 <w:sz w:val="18"/>
               </w:rPr>
-              <w:t>Admin, Treasurer, Membership</w:t>
+              <w:t>Admin</w:t>
             </w:r>
           </w:p>
         </w:tc>
@@ -1442,7 +1442,7 @@
       <w:r>
         <w:drawing>
           <wp:inline xmlns:a="http://schemas.openxmlformats.org/drawingml/2006/main" xmlns:pic="http://schemas.openxmlformats.org/drawingml/2006/picture">
-            <wp:extent cx="4389120" cy="3049283"/>
+            <wp:extent cx="4389120" cy="2470398"/>
             <wp:docPr id="3" name="Picture 3" descr="Sign-in page"/>
             <wp:cNvGraphicFramePr>
               <a:graphicFrameLocks noChangeAspect="1"/>
@@ -1463,7 +1463,7 @@
                   <pic:spPr>
                     <a:xfrm>
                       <a:off x="0" y="0"/>
-                      <a:ext cx="4389120" cy="3049283"/>
+                      <a:ext cx="4389120" cy="2470398"/>
                     </a:xfrm>
                     <a:prstGeom prst="rect"/>
                   </pic:spPr>
@@ -1622,7 +1622,7 @@
       <w:r>
         <w:drawing>
           <wp:inline xmlns:a="http://schemas.openxmlformats.org/drawingml/2006/main" xmlns:pic="http://schemas.openxmlformats.org/drawingml/2006/picture">
-            <wp:extent cx="4389120" cy="3049283"/>
+            <wp:extent cx="4389120" cy="2470398"/>
             <wp:docPr id="4" name="Picture 4" descr="Required first-login password change"/>
             <wp:cNvGraphicFramePr>
               <a:graphicFrameLocks noChangeAspect="1"/>
@@ -1643,7 +1643,7 @@
                   <pic:spPr>
                     <a:xfrm>
                       <a:off x="0" y="0"/>
-                      <a:ext cx="4389120" cy="3049283"/>
+                      <a:ext cx="4389120" cy="2470398"/>
                     </a:xfrm>
                     <a:prstGeom prst="rect"/>
                   </pic:spPr>
@@ -1793,7 +1793,7 @@
       <w:r>
         <w:drawing>
           <wp:inline xmlns:a="http://schemas.openxmlformats.org/drawingml/2006/main" xmlns:pic="http://schemas.openxmlformats.org/drawingml/2006/picture">
-            <wp:extent cx="4389120" cy="3049283"/>
+            <wp:extent cx="4389120" cy="2470398"/>
             <wp:docPr id="5" name="Picture 5" descr="Request a password reset link"/>
             <wp:cNvGraphicFramePr>
               <a:graphicFrameLocks noChangeAspect="1"/>
@@ -1814,7 +1814,7 @@
                   <pic:spPr>
                     <a:xfrm>
                       <a:off x="0" y="0"/>
-                      <a:ext cx="4389120" cy="3049283"/>
+                      <a:ext cx="4389120" cy="2470398"/>
                     </a:xfrm>
                     <a:prstGeom prst="rect"/>
                   </pic:spPr>
@@ -1849,7 +1849,7 @@
       <w:r>
         <w:drawing>
           <wp:inline xmlns:a="http://schemas.openxmlformats.org/drawingml/2006/main" xmlns:pic="http://schemas.openxmlformats.org/drawingml/2006/picture">
-            <wp:extent cx="4389120" cy="3049283"/>
+            <wp:extent cx="4389120" cy="2470398"/>
             <wp:docPr id="6" name="Picture 6" descr="Set a new password from the emailed link"/>
             <wp:cNvGraphicFramePr>
               <a:graphicFrameLocks noChangeAspect="1"/>
@@ -1870,7 +1870,7 @@
                   <pic:spPr>
                     <a:xfrm>
                       <a:off x="0" y="0"/>
-                      <a:ext cx="4389120" cy="3049283"/>
+                      <a:ext cx="4389120" cy="2470398"/>
                     </a:xfrm>
                     <a:prstGeom prst="rect"/>
                   </pic:spPr>
@@ -1988,10 +1988,10 @@
         <w:rPr>
           <w:b/>
         </w:rPr>
-        <w:t>Offering Overview</w:t>
-      </w:r>
-      <w:r>
-        <w:t xml:space="preserve"> shows current-week, month-to-date, and year-to-date totals from active offering records.</w:t>
+        <w:t>Fiscal Snapshot</w:t>
+      </w:r>
+      <w:r>
+        <w:t xml:space="preserve"> shows active and newly registered members, year-to-date offering and expense performance against budget, and uncleared cheque totals.</w:t>
       </w:r>
     </w:p>
     <w:p>
@@ -2002,10 +2002,10 @@
         <w:rPr>
           <w:b/>
         </w:rPr>
-        <w:t>Fiscal Snapshot</w:t>
-      </w:r>
-      <w:r>
-        <w:t xml:space="preserve"> compares budgeted and actual income and expense for the configured fiscal year.</w:t>
+        <w:t>Offering Overview</w:t>
+      </w:r>
+      <w:r>
+        <w:t xml:space="preserve"> shows current-week, month-to-date, and year-to-date totals from active offering records.</w:t>
       </w:r>
     </w:p>
     <w:p>
@@ -2016,29 +2016,15 @@
         <w:rPr>
           <w:b/>
         </w:rPr>
-        <w:t>Membership</w:t>
-      </w:r>
-      <w:r>
-        <w:t xml:space="preserve"> shows total, active, and locked member accounts.</w:t>
+        <w:t>Offering Trend</w:t>
+      </w:r>
+      <w:r>
+        <w:t xml:space="preserve"> charts the last 12 Offering Sundays, including Sundays with no recorded offerings.</w:t>
       </w:r>
     </w:p>
     <w:p>
-      <w:pPr>
-        <w:pStyle w:val="ListBullet"/>
-      </w:pPr>
-      <w:r>
-        <w:rPr>
-          <w:b/>
-        </w:rPr>
-        <w:t>Recent Finance Activity</w:t>
-      </w:r>
-      <w:r>
-        <w:t xml:space="preserve"> summarizes recent income, expense, and transaction volume.</w:t>
-      </w:r>
-    </w:p>
-    <w:p>
-      <w:r>
-        <w:t>Use the left menu to open permitted functions. The church name, contact information, treasurer, current user initials, and role appear in the banner area.</w:t>
+      <w:r>
+        <w:t>Use the left menu to open permitted functions. The church name, contact information, treasurer, current user initials, and all assigned roles appear in the banner area.</w:t>
       </w:r>
     </w:p>
     <w:p>
@@ -2333,6 +2319,27 @@
       </w:r>
       <w:r>
         <w:t xml:space="preserve"> from church reference data.</w:t>
+      </w:r>
+    </w:p>
+    <w:p>
+      <w:pPr>
+        <w:pStyle w:val="ListNumber"/>
+        <w:numPr>
+          <w:ilvl w:val="0"/>
+          <w:numId w:val="14"/>
+        </w:numPr>
+      </w:pPr>
+      <w:r>
+        <w:t xml:space="preserve">Open </w:t>
+      </w:r>
+      <w:r>
+        <w:rPr>
+          <w:b/>
+        </w:rPr>
+        <w:t>Committees</w:t>
+      </w:r>
+      <w:r>
+        <w:t xml:space="preserve"> and select any applicable committee assignments.</w:t>
       </w:r>
     </w:p>
     <w:p>
@@ -2660,10 +2667,19 @@
         <w:rPr>
           <w:b/>
         </w:rPr>
-        <w:t>Fund/category</w:t>
-      </w:r>
-      <w:r>
-        <w:t xml:space="preserve"> or giving type.</w:t>
+        <w:t>Fund</w:t>
+      </w:r>
+      <w:r>
+        <w:t xml:space="preserve">, </w:t>
+      </w:r>
+      <w:r>
+        <w:rPr>
+          <w:b/>
+        </w:rPr>
+        <w:t>Category</w:t>
+      </w:r>
+      <w:r>
+        <w:t>, or giving type. Category choices follow the selected Fund.</w:t>
       </w:r>
     </w:p>
     <w:p>
@@ -2824,10 +2840,19 @@
         <w:rPr>
           <w:b/>
         </w:rPr>
-        <w:t>Fund/category</w:t>
-      </w:r>
-      <w:r>
-        <w:t xml:space="preserve"> and </w:t>
+        <w:t>Fund</w:t>
+      </w:r>
+      <w:r>
+        <w:t xml:space="preserve">, its </w:t>
+      </w:r>
+      <w:r>
+        <w:rPr>
+          <w:b/>
+        </w:rPr>
+        <w:t>Category</w:t>
+      </w:r>
+      <w:r>
+        <w:t xml:space="preserve">, and </w:t>
       </w:r>
       <w:r>
         <w:rPr>
@@ -3670,7 +3695,7 @@
         <w:t>Available to:</w:t>
       </w:r>
       <w:r>
-        <w:t xml:space="preserve"> Admin, Treasurer, Membership</w:t>
+        <w:t xml:space="preserve"> Admin</w:t>
       </w:r>
     </w:p>
     <w:p>
@@ -3680,7 +3705,7 @@
     </w:p>
     <w:p>
       <w:r>
-        <w:t>Supported types include group code, membership status, offering fund/category, payment method, financial category, and financial sub-category.</w:t>
+        <w:t>Supported types include group code, membership status, committee code, offering fund/category, payment method, financial category, and financial sub-category.</w:t>
       </w:r>
     </w:p>
     <w:p>
@@ -3763,7 +3788,7 @@
         </w:numPr>
       </w:pPr>
       <w:r>
-        <w:t>For a financial sub-category, select its parent category.</w:t>
+        <w:t>For an offering category or financial sub-category, select its parent fund or category.</w:t>
       </w:r>
     </w:p>
     <w:p>
@@ -3801,7 +3826,7 @@
     </w:p>
     <w:p>
       <w:r>
-        <w:t>Inactive values remain stored but are omitted from normal dropdown choices.</w:t>
+        <w:t>The code is the value's key and cannot be changed after creation. Inactive values remain stored but are omitted from normal dropdown choices. A value cannot be deleted while member, offering, finance, budget, or archive data uses it.</w:t>
       </w:r>
     </w:p>
     <w:p>
@@ -3976,7 +4001,7 @@
         </w:numPr>
       </w:pPr>
       <w:r>
-        <w:t>Review totals by offering Sunday, fund, giving type, and payment method.</w:t>
+        <w:t>Review labelled totals by offering Sunday, fund, category, giving type, and payment method.</w:t>
       </w:r>
     </w:p>
     <w:p>
@@ -4218,12 +4243,113 @@
         </w:numPr>
       </w:pPr>
       <w:r>
-        <w:t>Review budget, actual, and variance by income/expense category and sub-category.</w:t>
+        <w:t xml:space="preserve">Review labelled income/expense categories, budget, actual, Budget vs. Actual percentage, and variance. A zero budget shows </w:t>
+      </w:r>
+      <w:r>
+        <w:rPr>
+          <w:rFonts w:ascii="Courier New" w:hAnsi="Courier New"/>
+          <w:color w:val="123047"/>
+          <w:sz w:val="19"/>
+        </w:rPr>
+        <w:t>-</w:t>
+      </w:r>
+      <w:r>
+        <w:t xml:space="preserve"> for the percentage.</w:t>
       </w:r>
     </w:p>
     <w:p>
-      <w:r>
-        <w:t xml:space="preserve">For any visible report, select </w:t>
+      <w:pPr>
+        <w:pStyle w:val="Heading2"/>
+      </w:pPr>
+      <w:r>
+        <w:t>Quarterly Financial Report</w:t>
+      </w:r>
+    </w:p>
+    <w:p>
+      <w:pPr>
+        <w:pStyle w:val="ListNumber"/>
+        <w:numPr>
+          <w:ilvl w:val="0"/>
+          <w:numId w:val="29"/>
+        </w:numPr>
+      </w:pPr>
+      <w:r>
+        <w:t xml:space="preserve">Select </w:t>
+      </w:r>
+      <w:r>
+        <w:rPr>
+          <w:b/>
+        </w:rPr>
+        <w:t>Quarterly Financial Report</w:t>
+      </w:r>
+      <w:r>
+        <w:t>.</w:t>
+      </w:r>
+    </w:p>
+    <w:p>
+      <w:pPr>
+        <w:pStyle w:val="ListNumber"/>
+        <w:numPr>
+          <w:ilvl w:val="0"/>
+          <w:numId w:val="29"/>
+        </w:numPr>
+      </w:pPr>
+      <w:r>
+        <w:t>Select the calendar year and quarter.</w:t>
+      </w:r>
+    </w:p>
+    <w:p>
+      <w:pPr>
+        <w:pStyle w:val="ListNumber"/>
+        <w:numPr>
+          <w:ilvl w:val="0"/>
+          <w:numId w:val="29"/>
+        </w:numPr>
+      </w:pPr>
+      <w:r>
+        <w:t>Select the Offering download for the quarterly offering workbook or the Expenditure download for the quarterly expense workbook.</w:t>
+      </w:r>
+    </w:p>
+    <w:p>
+      <w:pPr>
+        <w:pStyle w:val="ListNumber"/>
+        <w:numPr>
+          <w:ilvl w:val="0"/>
+          <w:numId w:val="29"/>
+        </w:numPr>
+      </w:pPr>
+      <w:r>
+        <w:t xml:space="preserve">Review the configured carry-over row in Offering and the configured </w:t>
+      </w:r>
+      <w:r>
+        <w:rPr>
+          <w:rFonts w:ascii="Courier New" w:hAnsi="Courier New"/>
+          <w:color w:val="123047"/>
+          <w:sz w:val="19"/>
+        </w:rPr>
+        <w:t>CONTINGENCY</w:t>
+      </w:r>
+      <w:r>
+        <w:t xml:space="preserve"> Financial Category label in Expenditure.</w:t>
+      </w:r>
+    </w:p>
+    <w:p>
+      <w:r>
+        <w:t xml:space="preserve">Both workbooks use Letter landscape print settings with scaling set to </w:t>
+      </w:r>
+      <w:r>
+        <w:rPr>
+          <w:b/>
+        </w:rPr>
+        <w:t>Adjust to 100%</w:t>
+      </w:r>
+      <w:r>
+        <w:t>.</w:t>
+      </w:r>
+    </w:p>
+    <w:p>
+      <w:r>
+        <w:t xml:space="preserve">For table reports that show </w:t>
       </w:r>
       <w:r>
         <w:rPr>
@@ -4232,7 +4358,7 @@
         <w:t>Export CSV</w:t>
       </w:r>
       <w:r>
-        <w:t xml:space="preserve"> to download the current report results.</w:t>
+        <w:t>, select it to download the current report results.</w:t>
       </w:r>
     </w:p>
     <w:p>
@@ -4245,7 +4371,7 @@
         <w:drawing>
           <wp:inline xmlns:a="http://schemas.openxmlformats.org/drawingml/2006/main" xmlns:pic="http://schemas.openxmlformats.org/drawingml/2006/picture">
             <wp:extent cx="6172200" cy="4286250"/>
-            <wp:docPr id="13" name="Picture 13" descr="Report tabs, filters, results, and CSV export"/>
+            <wp:docPr id="13" name="Picture 13" descr="Quarterly Financial Report controls and Excel downloads"/>
             <wp:cNvGraphicFramePr>
               <a:graphicFrameLocks noChangeAspect="1"/>
             </wp:cNvGraphicFramePr>
@@ -4288,7 +4414,7 @@
           <w:color w:val="667085"/>
           <w:sz w:val="17"/>
         </w:rPr>
-        <w:t>Report tabs, filters, results, and CSV export</w:t>
+        <w:t>Quarterly Financial Report controls and Excel downloads</w:t>
       </w:r>
     </w:p>
     <w:p>
@@ -4320,7 +4446,7 @@
         <w:pStyle w:val="ListNumber"/>
         <w:numPr>
           <w:ilvl w:val="0"/>
-          <w:numId w:val="29"/>
+          <w:numId w:val="30"/>
         </w:numPr>
       </w:pPr>
       <w:r>
@@ -4341,7 +4467,7 @@
         <w:pStyle w:val="ListNumber"/>
         <w:numPr>
           <w:ilvl w:val="0"/>
-          <w:numId w:val="29"/>
+          <w:numId w:val="30"/>
         </w:numPr>
       </w:pPr>
       <w:r>
@@ -4353,7 +4479,7 @@
         <w:pStyle w:val="ListNumber"/>
         <w:numPr>
           <w:ilvl w:val="0"/>
-          <w:numId w:val="29"/>
+          <w:numId w:val="30"/>
         </w:numPr>
       </w:pPr>
       <w:r>
@@ -4365,7 +4491,7 @@
         <w:pStyle w:val="ListNumber"/>
         <w:numPr>
           <w:ilvl w:val="0"/>
-          <w:numId w:val="29"/>
+          <w:numId w:val="30"/>
         </w:numPr>
       </w:pPr>
       <w:r>
@@ -4466,7 +4592,7 @@
         <w:pStyle w:val="ListNumber"/>
         <w:numPr>
           <w:ilvl w:val="0"/>
-          <w:numId w:val="30"/>
+          <w:numId w:val="31"/>
         </w:numPr>
       </w:pPr>
       <w:r>
@@ -4487,7 +4613,7 @@
         <w:pStyle w:val="ListNumber"/>
         <w:numPr>
           <w:ilvl w:val="0"/>
-          <w:numId w:val="30"/>
+          <w:numId w:val="31"/>
         </w:numPr>
       </w:pPr>
       <w:r>
@@ -4499,7 +4625,7 @@
         <w:pStyle w:val="ListNumber"/>
         <w:numPr>
           <w:ilvl w:val="0"/>
-          <w:numId w:val="30"/>
+          <w:numId w:val="31"/>
         </w:numPr>
       </w:pPr>
       <w:r>
@@ -5007,6 +5133,12 @@
     </w:lvlOverride>
   </w:num>
   <w:num w:numId="30">
+    <w:abstractNumId w:val="7"/>
+    <w:lvlOverride w:ilvl="0">
+      <w:startOverride w:val="1"/>
+    </w:lvlOverride>
+  </w:num>
+  <w:num w:numId="31">
     <w:abstractNumId w:val="7"/>
     <w:lvlOverride w:ilvl="0">
       <w:startOverride w:val="1"/>

</xml_diff>

<commit_message>
docs: document runtime church settings
</commit_message>
<xml_diff>
--- a/docs/user-guide/Church Operations User Guide.docx
+++ b/docs/user-guide/Church Operations User Guide.docx
@@ -89,46 +89,6 @@
     </w:p>
     <w:p>
       <w:pPr>
-        <w:spacing w:after="560"/>
-        <w:jc w:val="center"/>
-      </w:pPr>
-      <w:r>
-        <w:drawing>
-          <wp:inline xmlns:a="http://schemas.openxmlformats.org/drawingml/2006/main" xmlns:pic="http://schemas.openxmlformats.org/drawingml/2006/picture">
-            <wp:extent cx="6035040" cy="1482507"/>
-            <wp:docPr id="2" name="Picture 2" descr="Church banner"/>
-            <wp:cNvGraphicFramePr>
-              <a:graphicFrameLocks noChangeAspect="1"/>
-            </wp:cNvGraphicFramePr>
-            <a:graphic>
-              <a:graphicData uri="http://schemas.openxmlformats.org/drawingml/2006/picture">
-                <pic:pic>
-                  <pic:nvPicPr>
-                    <pic:cNvPr id="0" name="church-banner.png"/>
-                    <pic:cNvPicPr/>
-                  </pic:nvPicPr>
-                  <pic:blipFill>
-                    <a:blip r:embed="rId12"/>
-                    <a:stretch>
-                      <a:fillRect/>
-                    </a:stretch>
-                  </pic:blipFill>
-                  <pic:spPr>
-                    <a:xfrm>
-                      <a:off x="0" y="0"/>
-                      <a:ext cx="6035040" cy="1482507"/>
-                    </a:xfrm>
-                    <a:prstGeom prst="rect"/>
-                  </pic:spPr>
-                </pic:pic>
-              </a:graphicData>
-            </a:graphic>
-          </wp:inline>
-        </w:drawing>
-      </w:r>
-    </w:p>
-    <w:p>
-      <w:pPr>
         <w:spacing w:after="100"/>
         <w:jc w:val="center"/>
       </w:pPr>
@@ -255,6 +215,14 @@
       </w:pPr>
       <w:r>
         <w:t>My Profile</w:t>
+      </w:r>
+    </w:p>
+    <w:p>
+      <w:pPr>
+        <w:pStyle w:val="ListBullet"/>
+      </w:pPr>
+      <w:r>
+        <w:t>System Administration</w:t>
       </w:r>
     </w:p>
     <w:p>
@@ -1276,6 +1244,58 @@
                 <w:color w:val="202833"/>
                 <w:sz w:val="18"/>
               </w:rPr>
+              <w:t>System Administration</w:t>
+            </w:r>
+          </w:p>
+        </w:tc>
+        <w:tc>
+          <w:tcPr>
+            <w:tcW w:type="dxa" w:w="5040"/>
+            <w:tcMar>
+              <w:top w:w="100" w:type="dxa"/>
+              <w:start w:w="120" w:type="dxa"/>
+              <w:bottom w:w="100" w:type="dxa"/>
+              <w:end w:w="120" w:type="dxa"/>
+            </w:tcMar>
+            <w:vAlign w:val="center"/>
+          </w:tcPr>
+          <w:p>
+            <w:pPr>
+              <w:spacing w:after="0"/>
+            </w:pPr>
+            <w:r>
+              <w:rPr>
+                <w:rFonts w:ascii="Aptos" w:hAnsi="Aptos"/>
+                <w:color w:val="202833"/>
+                <w:sz w:val="18"/>
+              </w:rPr>
+              <w:t>Admin</w:t>
+            </w:r>
+          </w:p>
+        </w:tc>
+      </w:tr>
+      <w:tr>
+        <w:tc>
+          <w:tcPr>
+            <w:tcW w:type="dxa" w:w="5040"/>
+            <w:tcMar>
+              <w:top w:w="100" w:type="dxa"/>
+              <w:start w:w="120" w:type="dxa"/>
+              <w:bottom w:w="100" w:type="dxa"/>
+              <w:end w:w="120" w:type="dxa"/>
+            </w:tcMar>
+            <w:vAlign w:val="center"/>
+          </w:tcPr>
+          <w:p>
+            <w:pPr>
+              <w:spacing w:after="0"/>
+            </w:pPr>
+            <w:r>
+              <w:rPr>
+                <w:rFonts w:ascii="Aptos" w:hAnsi="Aptos"/>
+                <w:color w:val="202833"/>
+                <w:sz w:val="18"/>
+              </w:rPr>
               <w:t>Password reset and Logout</w:t>
             </w:r>
           </w:p>
@@ -1313,13 +1333,9 @@
       </w:pPr>
     </w:p>
     <w:p>
-      <w:r>
-        <w:br w:type="page"/>
-      </w:r>
-    </w:p>
-    <w:p>
       <w:pPr>
         <w:pStyle w:val="Heading1"/>
+        <w:pageBreakBefore/>
       </w:pPr>
       <w:r>
         <w:t>Getting Started</w:t>
@@ -1443,7 +1459,7 @@
         <w:drawing>
           <wp:inline xmlns:a="http://schemas.openxmlformats.org/drawingml/2006/main" xmlns:pic="http://schemas.openxmlformats.org/drawingml/2006/picture">
             <wp:extent cx="4389120" cy="2470398"/>
-            <wp:docPr id="3" name="Picture 3" descr="Sign-in page"/>
+            <wp:docPr id="2" name="Picture 2" descr="Sign-in page"/>
             <wp:cNvGraphicFramePr>
               <a:graphicFrameLocks noChangeAspect="1"/>
             </wp:cNvGraphicFramePr>
@@ -1455,7 +1471,7 @@
                     <pic:cNvPicPr/>
                   </pic:nvPicPr>
                   <pic:blipFill>
-                    <a:blip r:embed="rId13"/>
+                    <a:blip r:embed="rId12"/>
                     <a:stretch>
                       <a:fillRect/>
                     </a:stretch>
@@ -1623,7 +1639,7 @@
         <w:drawing>
           <wp:inline xmlns:a="http://schemas.openxmlformats.org/drawingml/2006/main" xmlns:pic="http://schemas.openxmlformats.org/drawingml/2006/picture">
             <wp:extent cx="4389120" cy="2470398"/>
-            <wp:docPr id="4" name="Picture 4" descr="Required first-login password change"/>
+            <wp:docPr id="3" name="Picture 3" descr="Required first-login password change"/>
             <wp:cNvGraphicFramePr>
               <a:graphicFrameLocks noChangeAspect="1"/>
             </wp:cNvGraphicFramePr>
@@ -1635,7 +1651,7 @@
                     <pic:cNvPicPr/>
                   </pic:nvPicPr>
                   <pic:blipFill>
-                    <a:blip r:embed="rId14"/>
+                    <a:blip r:embed="rId13"/>
                     <a:stretch>
                       <a:fillRect/>
                     </a:stretch>
@@ -2098,7 +2114,7 @@
         <w:drawing>
           <wp:inline xmlns:a="http://schemas.openxmlformats.org/drawingml/2006/main" xmlns:pic="http://schemas.openxmlformats.org/drawingml/2006/picture">
             <wp:extent cx="4389120" cy="2470398"/>
-            <wp:docPr id="5" name="Picture 5" descr="Request a password reset link"/>
+            <wp:docPr id="4" name="Picture 4" descr="Request a password reset link"/>
             <wp:cNvGraphicFramePr>
               <a:graphicFrameLocks noChangeAspect="1"/>
             </wp:cNvGraphicFramePr>
@@ -2110,7 +2126,7 @@
                     <pic:cNvPicPr/>
                   </pic:nvPicPr>
                   <pic:blipFill>
-                    <a:blip r:embed="rId15"/>
+                    <a:blip r:embed="rId14"/>
                     <a:stretch>
                       <a:fillRect/>
                     </a:stretch>
@@ -2154,7 +2170,7 @@
         <w:drawing>
           <wp:inline xmlns:a="http://schemas.openxmlformats.org/drawingml/2006/main" xmlns:pic="http://schemas.openxmlformats.org/drawingml/2006/picture">
             <wp:extent cx="4389120" cy="2470398"/>
-            <wp:docPr id="6" name="Picture 6" descr="Set a new password from the emailed link"/>
+            <wp:docPr id="5" name="Picture 5" descr="Set a new password from the emailed link"/>
             <wp:cNvGraphicFramePr>
               <a:graphicFrameLocks noChangeAspect="1"/>
             </wp:cNvGraphicFramePr>
@@ -2166,7 +2182,7 @@
                     <pic:cNvPicPr/>
                   </pic:nvPicPr>
                   <pic:blipFill>
-                    <a:blip r:embed="rId16"/>
+                    <a:blip r:embed="rId15"/>
                     <a:stretch>
                       <a:fillRect/>
                     </a:stretch>
@@ -2256,13 +2272,9 @@
       </w:pPr>
     </w:p>
     <w:p>
-      <w:r>
-        <w:br w:type="page"/>
-      </w:r>
-    </w:p>
-    <w:p>
       <w:pPr>
         <w:pStyle w:val="Heading1"/>
+        <w:pageBreakBefore/>
       </w:pPr>
       <w:r>
         <w:t>Dashboard</w:t>
@@ -2341,7 +2353,7 @@
         <w:drawing>
           <wp:inline xmlns:a="http://schemas.openxmlformats.org/drawingml/2006/main" xmlns:pic="http://schemas.openxmlformats.org/drawingml/2006/picture">
             <wp:extent cx="6172200" cy="4286250"/>
-            <wp:docPr id="7" name="Picture 7" descr="Dashboard overview"/>
+            <wp:docPr id="6" name="Picture 6" descr="Dashboard overview"/>
             <wp:cNvGraphicFramePr>
               <a:graphicFrameLocks noChangeAspect="1"/>
             </wp:cNvGraphicFramePr>
@@ -2353,7 +2365,7 @@
                     <pic:cNvPicPr/>
                   </pic:nvPicPr>
                   <pic:blipFill>
-                    <a:blip r:embed="rId17"/>
+                    <a:blip r:embed="rId16"/>
                     <a:stretch>
                       <a:fillRect/>
                     </a:stretch>
@@ -2388,13 +2400,9 @@
       </w:r>
     </w:p>
     <w:p>
-      <w:r>
-        <w:br w:type="page"/>
-      </w:r>
-    </w:p>
-    <w:p>
       <w:pPr>
         <w:pStyle w:val="Heading1"/>
+        <w:pageBreakBefore/>
       </w:pPr>
       <w:r>
         <w:t>Member Information</w:t>
@@ -2802,7 +2810,7 @@
         <w:drawing>
           <wp:inline xmlns:a="http://schemas.openxmlformats.org/drawingml/2006/main" xmlns:pic="http://schemas.openxmlformats.org/drawingml/2006/picture">
             <wp:extent cx="6172200" cy="4288055"/>
-            <wp:docPr id="8" name="Picture 8" descr="Member search and registration screen"/>
+            <wp:docPr id="7" name="Picture 7" descr="Member search and registration screen"/>
             <wp:cNvGraphicFramePr>
               <a:graphicFrameLocks noChangeAspect="1"/>
             </wp:cNvGraphicFramePr>
@@ -2814,7 +2822,7 @@
                     <pic:cNvPicPr/>
                   </pic:nvPicPr>
                   <pic:blipFill>
-                    <a:blip r:embed="rId18"/>
+                    <a:blip r:embed="rId17"/>
                     <a:stretch>
                       <a:fillRect/>
                     </a:stretch>
@@ -2904,13 +2912,9 @@
       </w:pPr>
     </w:p>
     <w:p>
-      <w:r>
-        <w:br w:type="page"/>
-      </w:r>
-    </w:p>
-    <w:p>
       <w:pPr>
         <w:pStyle w:val="Heading1"/>
+        <w:pageBreakBefore/>
       </w:pPr>
       <w:r>
         <w:t>Offering Management</w:t>
@@ -3287,7 +3291,7 @@
         <w:drawing>
           <wp:inline xmlns:a="http://schemas.openxmlformats.org/drawingml/2006/main" xmlns:pic="http://schemas.openxmlformats.org/drawingml/2006/picture">
             <wp:extent cx="6172200" cy="4288055"/>
-            <wp:docPr id="9" name="Picture 9" descr="Offering list and entry form"/>
+            <wp:docPr id="8" name="Picture 8" descr="Offering list and entry form"/>
             <wp:cNvGraphicFramePr>
               <a:graphicFrameLocks noChangeAspect="1"/>
             </wp:cNvGraphicFramePr>
@@ -3296,6 +3300,366 @@
                 <pic:pic>
                   <pic:nvPicPr>
                     <pic:cNvPr id="0" name="06-offerings.png"/>
+                    <pic:cNvPicPr/>
+                  </pic:nvPicPr>
+                  <pic:blipFill>
+                    <a:blip r:embed="rId18"/>
+                    <a:stretch>
+                      <a:fillRect/>
+                    </a:stretch>
+                  </pic:blipFill>
+                  <pic:spPr>
+                    <a:xfrm>
+                      <a:off x="0" y="0"/>
+                      <a:ext cx="6172200" cy="4288055"/>
+                    </a:xfrm>
+                    <a:prstGeom prst="rect"/>
+                  </pic:spPr>
+                </pic:pic>
+              </a:graphicData>
+            </a:graphic>
+          </wp:inline>
+        </w:drawing>
+      </w:r>
+    </w:p>
+    <w:p>
+      <w:pPr>
+        <w:spacing w:after="160"/>
+        <w:jc w:val="center"/>
+      </w:pPr>
+      <w:r>
+        <w:rPr>
+          <w:rFonts w:ascii="Aptos" w:hAnsi="Aptos"/>
+          <w:i/>
+          <w:color w:val="667085"/>
+          <w:sz w:val="17"/>
+        </w:rPr>
+        <w:t>Offering list and entry form</w:t>
+      </w:r>
+    </w:p>
+    <w:p>
+      <w:pPr>
+        <w:pStyle w:val="Heading1"/>
+        <w:pageBreakBefore/>
+      </w:pPr>
+      <w:r>
+        <w:t>Financial Management</w:t>
+      </w:r>
+    </w:p>
+    <w:p>
+      <w:r>
+        <w:rPr>
+          <w:b/>
+        </w:rPr>
+        <w:t>Available to:</w:t>
+      </w:r>
+      <w:r>
+        <w:t xml:space="preserve"> Admin, Treasurer</w:t>
+      </w:r>
+    </w:p>
+    <w:p>
+      <w:pPr>
+        <w:pStyle w:val="Heading2"/>
+      </w:pPr>
+      <w:r>
+        <w:t>Review financial activity</w:t>
+      </w:r>
+    </w:p>
+    <w:p>
+      <w:pPr>
+        <w:pStyle w:val="ListNumber"/>
+        <w:numPr>
+          <w:ilvl w:val="0"/>
+          <w:numId w:val="20"/>
+        </w:numPr>
+      </w:pPr>
+      <w:r>
+        <w:t xml:space="preserve">Select </w:t>
+      </w:r>
+      <w:r>
+        <w:rPr>
+          <w:b/>
+        </w:rPr>
+        <w:t>Finance</w:t>
+      </w:r>
+      <w:r>
+        <w:t>.</w:t>
+      </w:r>
+    </w:p>
+    <w:p>
+      <w:pPr>
+        <w:pStyle w:val="ListNumber"/>
+        <w:numPr>
+          <w:ilvl w:val="0"/>
+          <w:numId w:val="20"/>
+        </w:numPr>
+      </w:pPr>
+      <w:r>
+        <w:t xml:space="preserve">Filter by category and by </w:t>
+      </w:r>
+      <w:r>
+        <w:rPr>
+          <w:b/>
+        </w:rPr>
+        <w:t>Income</w:t>
+      </w:r>
+      <w:r>
+        <w:t xml:space="preserve">, </w:t>
+      </w:r>
+      <w:r>
+        <w:rPr>
+          <w:b/>
+        </w:rPr>
+        <w:t>Expense</w:t>
+      </w:r>
+      <w:r>
+        <w:t>, or both.</w:t>
+      </w:r>
+    </w:p>
+    <w:p>
+      <w:pPr>
+        <w:pStyle w:val="ListNumber"/>
+        <w:numPr>
+          <w:ilvl w:val="0"/>
+          <w:numId w:val="20"/>
+        </w:numPr>
+      </w:pPr>
+      <w:r>
+        <w:t xml:space="preserve">Select </w:t>
+      </w:r>
+      <w:r>
+        <w:rPr>
+          <w:b/>
+        </w:rPr>
+        <w:t>Refresh</w:t>
+      </w:r>
+      <w:r>
+        <w:t>.</w:t>
+      </w:r>
+    </w:p>
+    <w:p>
+      <w:pPr>
+        <w:pStyle w:val="ListNumber"/>
+        <w:numPr>
+          <w:ilvl w:val="0"/>
+          <w:numId w:val="20"/>
+        </w:numPr>
+      </w:pPr>
+      <w:r>
+        <w:t>Review net, income, and expense totals above the table.</w:t>
+      </w:r>
+    </w:p>
+    <w:p>
+      <w:r>
+        <w:t>Offering income is shown as daily category summaries and is read-only in Finance. Manual expenses can be maintained here.</w:t>
+      </w:r>
+    </w:p>
+    <w:p>
+      <w:pPr>
+        <w:pStyle w:val="Heading2"/>
+      </w:pPr>
+      <w:r>
+        <w:t>Record an expense</w:t>
+      </w:r>
+    </w:p>
+    <w:p>
+      <w:pPr>
+        <w:pStyle w:val="ListNumber"/>
+        <w:numPr>
+          <w:ilvl w:val="0"/>
+          <w:numId w:val="21"/>
+        </w:numPr>
+      </w:pPr>
+      <w:r>
+        <w:t xml:space="preserve">Select </w:t>
+      </w:r>
+      <w:r>
+        <w:rPr>
+          <w:b/>
+        </w:rPr>
+        <w:t>Add expense</w:t>
+      </w:r>
+      <w:r>
+        <w:t>.</w:t>
+      </w:r>
+    </w:p>
+    <w:p>
+      <w:pPr>
+        <w:pStyle w:val="ListNumber"/>
+        <w:numPr>
+          <w:ilvl w:val="0"/>
+          <w:numId w:val="21"/>
+        </w:numPr>
+      </w:pPr>
+      <w:r>
+        <w:t>Enter transaction date and amount.</w:t>
+      </w:r>
+    </w:p>
+    <w:p>
+      <w:pPr>
+        <w:pStyle w:val="ListNumber"/>
+        <w:numPr>
+          <w:ilvl w:val="0"/>
+          <w:numId w:val="21"/>
+        </w:numPr>
+      </w:pPr>
+      <w:r>
+        <w:t xml:space="preserve">Choose a category. The </w:t>
+      </w:r>
+      <w:r>
+        <w:rPr>
+          <w:b/>
+        </w:rPr>
+        <w:t>Sub-category</w:t>
+      </w:r>
+      <w:r>
+        <w:t xml:space="preserve"> list is filtered by the selected category.</w:t>
+      </w:r>
+    </w:p>
+    <w:p>
+      <w:pPr>
+        <w:pStyle w:val="ListNumber"/>
+        <w:numPr>
+          <w:ilvl w:val="0"/>
+          <w:numId w:val="21"/>
+        </w:numPr>
+      </w:pPr>
+      <w:r>
+        <w:t xml:space="preserve">Set </w:t>
+      </w:r>
+      <w:r>
+        <w:rPr>
+          <w:b/>
+        </w:rPr>
+        <w:t>HST included</w:t>
+      </w:r>
+      <w:r>
+        <w:t xml:space="preserve"> and </w:t>
+      </w:r>
+      <w:r>
+        <w:rPr>
+          <w:b/>
+        </w:rPr>
+        <w:t>Cheque cleared</w:t>
+      </w:r>
+      <w:r>
+        <w:t xml:space="preserve"> when applicable.</w:t>
+      </w:r>
+    </w:p>
+    <w:p>
+      <w:pPr>
+        <w:pStyle w:val="ListNumber"/>
+        <w:numPr>
+          <w:ilvl w:val="0"/>
+          <w:numId w:val="21"/>
+        </w:numPr>
+      </w:pPr>
+      <w:r>
+        <w:t>Enter cheque number, payable party, approving treasurer, and memo as available.</w:t>
+      </w:r>
+    </w:p>
+    <w:p>
+      <w:pPr>
+        <w:pStyle w:val="ListNumber"/>
+        <w:numPr>
+          <w:ilvl w:val="0"/>
+          <w:numId w:val="21"/>
+        </w:numPr>
+      </w:pPr>
+      <w:r>
+        <w:t xml:space="preserve">Select </w:t>
+      </w:r>
+      <w:r>
+        <w:rPr>
+          <w:b/>
+        </w:rPr>
+        <w:t>Save expense</w:t>
+      </w:r>
+      <w:r>
+        <w:t>.</w:t>
+      </w:r>
+    </w:p>
+    <w:p>
+      <w:pPr>
+        <w:pStyle w:val="Heading2"/>
+      </w:pPr>
+      <w:r>
+        <w:t>Edit or delete an expense</w:t>
+      </w:r>
+    </w:p>
+    <w:p>
+      <w:pPr>
+        <w:pStyle w:val="ListNumber"/>
+        <w:numPr>
+          <w:ilvl w:val="0"/>
+          <w:numId w:val="22"/>
+        </w:numPr>
+      </w:pPr>
+      <w:r>
+        <w:t>Select a manual expense row.</w:t>
+      </w:r>
+    </w:p>
+    <w:p>
+      <w:pPr>
+        <w:pStyle w:val="ListNumber"/>
+        <w:numPr>
+          <w:ilvl w:val="0"/>
+          <w:numId w:val="22"/>
+        </w:numPr>
+      </w:pPr>
+      <w:r>
+        <w:t xml:space="preserve">Update it and select </w:t>
+      </w:r>
+      <w:r>
+        <w:rPr>
+          <w:b/>
+        </w:rPr>
+        <w:t>Save changes</w:t>
+      </w:r>
+      <w:r>
+        <w:t xml:space="preserve">, or select </w:t>
+      </w:r>
+      <w:r>
+        <w:rPr>
+          <w:b/>
+        </w:rPr>
+        <w:t>Cancel</w:t>
+      </w:r>
+      <w:r>
+        <w:t>.</w:t>
+      </w:r>
+    </w:p>
+    <w:p>
+      <w:pPr>
+        <w:pStyle w:val="ListNumber"/>
+        <w:numPr>
+          <w:ilvl w:val="0"/>
+          <w:numId w:val="22"/>
+        </w:numPr>
+      </w:pPr>
+      <w:r>
+        <w:t>Use the row's trash-bin icon to delete a manual expense after confirmation.</w:t>
+      </w:r>
+    </w:p>
+    <w:p>
+      <w:pPr>
+        <w:keepNext/>
+        <w:spacing w:before="100" w:after="60"/>
+        <w:jc w:val="center"/>
+      </w:pPr>
+      <w:r>
+        <w:drawing>
+          <wp:inline xmlns:a="http://schemas.openxmlformats.org/drawingml/2006/main" xmlns:pic="http://schemas.openxmlformats.org/drawingml/2006/picture">
+            <wp:extent cx="6172200" cy="4288055"/>
+            <wp:docPr id="9" name="Picture 9" descr="Financial activity and expense form"/>
+            <wp:cNvGraphicFramePr>
+              <a:graphicFrameLocks noChangeAspect="1"/>
+            </wp:cNvGraphicFramePr>
+            <a:graphic>
+              <a:graphicData uri="http://schemas.openxmlformats.org/drawingml/2006/picture">
+                <pic:pic>
+                  <pic:nvPicPr>
+                    <pic:cNvPr id="0" name="07-finance.png"/>
                     <pic:cNvPicPr/>
                   </pic:nvPicPr>
                   <pic:blipFill>
@@ -3330,20 +3694,16 @@
           <w:color w:val="667085"/>
           <w:sz w:val="17"/>
         </w:rPr>
-        <w:t>Offering list and entry form</w:t>
+        <w:t>Financial activity and expense form</w:t>
       </w:r>
     </w:p>
     <w:p>
-      <w:r>
-        <w:br w:type="page"/>
-      </w:r>
-    </w:p>
-    <w:p>
       <w:pPr>
         <w:pStyle w:val="Heading1"/>
-      </w:pPr>
-      <w:r>
-        <w:t>Financial Management</w:t>
+        <w:pageBreakBefore/>
+      </w:pPr>
+      <w:r>
+        <w:t>Budget Management</w:t>
       </w:r>
     </w:p>
     <w:p>
@@ -3358,11 +3718,16 @@
       </w:r>
     </w:p>
     <w:p>
+      <w:r>
+        <w:t>Budgets are prepared by fiscal year for offering income by fund/category and for expenses by category and sub-category.</w:t>
+      </w:r>
+    </w:p>
+    <w:p>
       <w:pPr>
         <w:pStyle w:val="Heading2"/>
       </w:pPr>
       <w:r>
-        <w:t>Review financial activity</w:t>
+        <w:t>Review budgets</w:t>
       </w:r>
     </w:p>
     <w:p>
@@ -3370,7 +3735,7 @@
         <w:pStyle w:val="ListNumber"/>
         <w:numPr>
           <w:ilvl w:val="0"/>
-          <w:numId w:val="20"/>
+          <w:numId w:val="23"/>
         </w:numPr>
       </w:pPr>
       <w:r>
@@ -3380,7 +3745,7 @@
         <w:rPr>
           <w:b/>
         </w:rPr>
-        <w:t>Finance</w:t>
+        <w:t>Budgets</w:t>
       </w:r>
       <w:r>
         <w:t>.</w:t>
@@ -3391,20 +3756,82 @@
         <w:pStyle w:val="ListNumber"/>
         <w:numPr>
           <w:ilvl w:val="0"/>
-          <w:numId w:val="20"/>
+          <w:numId w:val="23"/>
         </w:numPr>
       </w:pPr>
       <w:r>
-        <w:t xml:space="preserve">Filter by category and by </w:t>
+        <w:t>Enter the fiscal year and optionally choose a budget type.</w:t>
+      </w:r>
+    </w:p>
+    <w:p>
+      <w:pPr>
+        <w:pStyle w:val="ListNumber"/>
+        <w:numPr>
+          <w:ilvl w:val="0"/>
+          <w:numId w:val="23"/>
+        </w:numPr>
+      </w:pPr>
+      <w:r>
+        <w:t xml:space="preserve">Select </w:t>
       </w:r>
       <w:r>
         <w:rPr>
           <w:b/>
         </w:rPr>
-        <w:t>Income</w:t>
-      </w:r>
-      <w:r>
-        <w:t xml:space="preserve">, </w:t>
+        <w:t>Refresh</w:t>
+      </w:r>
+      <w:r>
+        <w:t>.</w:t>
+      </w:r>
+    </w:p>
+    <w:p>
+      <w:pPr>
+        <w:pStyle w:val="Heading2"/>
+      </w:pPr>
+      <w:r>
+        <w:t>Add or update a budget</w:t>
+      </w:r>
+    </w:p>
+    <w:p>
+      <w:pPr>
+        <w:pStyle w:val="ListNumber"/>
+        <w:numPr>
+          <w:ilvl w:val="0"/>
+          <w:numId w:val="24"/>
+        </w:numPr>
+      </w:pPr>
+      <w:r>
+        <w:t xml:space="preserve">Select </w:t>
+      </w:r>
+      <w:r>
+        <w:rPr>
+          <w:b/>
+        </w:rPr>
+        <w:t>Add budget</w:t>
+      </w:r>
+      <w:r>
+        <w:t>.</w:t>
+      </w:r>
+    </w:p>
+    <w:p>
+      <w:pPr>
+        <w:pStyle w:val="ListNumber"/>
+        <w:numPr>
+          <w:ilvl w:val="0"/>
+          <w:numId w:val="24"/>
+        </w:numPr>
+      </w:pPr>
+      <w:r>
+        <w:t xml:space="preserve">Choose </w:t>
+      </w:r>
+      <w:r>
+        <w:rPr>
+          <w:b/>
+        </w:rPr>
+        <w:t>Offering income</w:t>
+      </w:r>
+      <w:r>
+        <w:t xml:space="preserve"> or </w:t>
       </w:r>
       <w:r>
         <w:rPr>
@@ -3413,7 +3840,7 @@
         <w:t>Expense</w:t>
       </w:r>
       <w:r>
-        <w:t>, or both.</w:t>
+        <w:t>.</w:t>
       </w:r>
     </w:p>
     <w:p>
@@ -3421,20 +3848,20 @@
         <w:pStyle w:val="ListNumber"/>
         <w:numPr>
           <w:ilvl w:val="0"/>
-          <w:numId w:val="20"/>
+          <w:numId w:val="24"/>
         </w:numPr>
       </w:pPr>
       <w:r>
-        <w:t xml:space="preserve">Select </w:t>
+        <w:t xml:space="preserve">Enter the fiscal year and </w:t>
       </w:r>
       <w:r>
         <w:rPr>
           <w:b/>
         </w:rPr>
-        <w:t>Refresh</w:t>
-      </w:r>
-      <w:r>
-        <w:t>.</w:t>
+        <w:t>Budget</w:t>
+      </w:r>
+      <w:r>
+        <w:t xml:space="preserve"> amount.</w:t>
       </w:r>
     </w:p>
     <w:p>
@@ -3442,24 +3869,11 @@
         <w:pStyle w:val="ListNumber"/>
         <w:numPr>
           <w:ilvl w:val="0"/>
-          <w:numId w:val="20"/>
+          <w:numId w:val="24"/>
         </w:numPr>
       </w:pPr>
       <w:r>
-        <w:t>Review net, income, and expense totals above the table.</w:t>
-      </w:r>
-    </w:p>
-    <w:p>
-      <w:r>
-        <w:t>Offering income is shown as daily category summaries and is read-only in Finance. Manual expenses can be maintained here.</w:t>
-      </w:r>
-    </w:p>
-    <w:p>
-      <w:pPr>
-        <w:pStyle w:val="Heading2"/>
-      </w:pPr>
-      <w:r>
-        <w:t>Record an expense</w:t>
+        <w:t>Choose the category and, for expenses, the applicable sub-category.</w:t>
       </w:r>
     </w:p>
     <w:p>
@@ -3467,17 +3881,17 @@
         <w:pStyle w:val="ListNumber"/>
         <w:numPr>
           <w:ilvl w:val="0"/>
-          <w:numId w:val="21"/>
+          <w:numId w:val="24"/>
         </w:numPr>
       </w:pPr>
       <w:r>
-        <w:t xml:space="preserve">Select </w:t>
+        <w:t xml:space="preserve">Add an optional memo and select </w:t>
       </w:r>
       <w:r>
         <w:rPr>
           <w:b/>
         </w:rPr>
-        <w:t>Add expense</w:t>
+        <w:t>Save budget</w:t>
       </w:r>
       <w:r>
         <w:t>.</w:t>
@@ -3488,127 +3902,11 @@
         <w:pStyle w:val="ListNumber"/>
         <w:numPr>
           <w:ilvl w:val="0"/>
-          <w:numId w:val="21"/>
+          <w:numId w:val="24"/>
         </w:numPr>
       </w:pPr>
       <w:r>
-        <w:t>Enter transaction date and amount.</w:t>
-      </w:r>
-    </w:p>
-    <w:p>
-      <w:pPr>
-        <w:pStyle w:val="ListNumber"/>
-        <w:numPr>
-          <w:ilvl w:val="0"/>
-          <w:numId w:val="21"/>
-        </w:numPr>
-      </w:pPr>
-      <w:r>
-        <w:t xml:space="preserve">Choose a category. The </w:t>
-      </w:r>
-      <w:r>
-        <w:rPr>
-          <w:b/>
-        </w:rPr>
-        <w:t>Sub-category</w:t>
-      </w:r>
-      <w:r>
-        <w:t xml:space="preserve"> list is filtered by the selected category.</w:t>
-      </w:r>
-    </w:p>
-    <w:p>
-      <w:pPr>
-        <w:pStyle w:val="ListNumber"/>
-        <w:numPr>
-          <w:ilvl w:val="0"/>
-          <w:numId w:val="21"/>
-        </w:numPr>
-      </w:pPr>
-      <w:r>
-        <w:t xml:space="preserve">Set </w:t>
-      </w:r>
-      <w:r>
-        <w:rPr>
-          <w:b/>
-        </w:rPr>
-        <w:t>HST included</w:t>
-      </w:r>
-      <w:r>
-        <w:t xml:space="preserve"> and </w:t>
-      </w:r>
-      <w:r>
-        <w:rPr>
-          <w:b/>
-        </w:rPr>
-        <w:t>Cheque cleared</w:t>
-      </w:r>
-      <w:r>
-        <w:t xml:space="preserve"> when applicable.</w:t>
-      </w:r>
-    </w:p>
-    <w:p>
-      <w:pPr>
-        <w:pStyle w:val="ListNumber"/>
-        <w:numPr>
-          <w:ilvl w:val="0"/>
-          <w:numId w:val="21"/>
-        </w:numPr>
-      </w:pPr>
-      <w:r>
-        <w:t>Enter cheque number, payable party, approving treasurer, and memo as available.</w:t>
-      </w:r>
-    </w:p>
-    <w:p>
-      <w:pPr>
-        <w:pStyle w:val="ListNumber"/>
-        <w:numPr>
-          <w:ilvl w:val="0"/>
-          <w:numId w:val="21"/>
-        </w:numPr>
-      </w:pPr>
-      <w:r>
-        <w:t xml:space="preserve">Select </w:t>
-      </w:r>
-      <w:r>
-        <w:rPr>
-          <w:b/>
-        </w:rPr>
-        <w:t>Save expense</w:t>
-      </w:r>
-      <w:r>
-        <w:t>.</w:t>
-      </w:r>
-    </w:p>
-    <w:p>
-      <w:pPr>
-        <w:pStyle w:val="Heading2"/>
-      </w:pPr>
-      <w:r>
-        <w:t>Edit or delete an expense</w:t>
-      </w:r>
-    </w:p>
-    <w:p>
-      <w:pPr>
-        <w:pStyle w:val="ListNumber"/>
-        <w:numPr>
-          <w:ilvl w:val="0"/>
-          <w:numId w:val="22"/>
-        </w:numPr>
-      </w:pPr>
-      <w:r>
-        <w:t>Select a manual expense row.</w:t>
-      </w:r>
-    </w:p>
-    <w:p>
-      <w:pPr>
-        <w:pStyle w:val="ListNumber"/>
-        <w:numPr>
-          <w:ilvl w:val="0"/>
-          <w:numId w:val="22"/>
-        </w:numPr>
-      </w:pPr>
-      <w:r>
-        <w:t xml:space="preserve">Update it and select </w:t>
+        <w:t xml:space="preserve">To edit, select an existing row, update the details, and select </w:t>
       </w:r>
       <w:r>
         <w:rPr>
@@ -3617,28 +3915,7 @@
         <w:t>Save changes</w:t>
       </w:r>
       <w:r>
-        <w:t xml:space="preserve">, or select </w:t>
-      </w:r>
-      <w:r>
-        <w:rPr>
-          <w:b/>
-        </w:rPr>
-        <w:t>Cancel</w:t>
-      </w:r>
-      <w:r>
         <w:t>.</w:t>
-      </w:r>
-    </w:p>
-    <w:p>
-      <w:pPr>
-        <w:pStyle w:val="ListNumber"/>
-        <w:numPr>
-          <w:ilvl w:val="0"/>
-          <w:numId w:val="22"/>
-        </w:numPr>
-      </w:pPr>
-      <w:r>
-        <w:t>Use the row's trash-bin icon to delete a manual expense after confirmation.</w:t>
       </w:r>
     </w:p>
     <w:p>
@@ -3650,8 +3927,8 @@
       <w:r>
         <w:drawing>
           <wp:inline xmlns:a="http://schemas.openxmlformats.org/drawingml/2006/main" xmlns:pic="http://schemas.openxmlformats.org/drawingml/2006/picture">
-            <wp:extent cx="6172200" cy="4288055"/>
-            <wp:docPr id="10" name="Picture 10" descr="Financial activity and expense form"/>
+            <wp:extent cx="6172200" cy="4286250"/>
+            <wp:docPr id="10" name="Picture 10" descr="Fiscal-year budget list and entry form"/>
             <wp:cNvGraphicFramePr>
               <a:graphicFrameLocks noChangeAspect="1"/>
             </wp:cNvGraphicFramePr>
@@ -3659,7 +3936,7 @@
               <a:graphicData uri="http://schemas.openxmlformats.org/drawingml/2006/picture">
                 <pic:pic>
                   <pic:nvPicPr>
-                    <pic:cNvPr id="0" name="07-finance.png"/>
+                    <pic:cNvPr id="0" name="08-budgets.png"/>
                     <pic:cNvPicPr/>
                   </pic:nvPicPr>
                   <pic:blipFill>
@@ -3671,7 +3948,7 @@
                   <pic:spPr>
                     <a:xfrm>
                       <a:off x="0" y="0"/>
-                      <a:ext cx="6172200" cy="4288055"/>
+                      <a:ext cx="6172200" cy="4286250"/>
                     </a:xfrm>
                     <a:prstGeom prst="rect"/>
                   </pic:spPr>
@@ -3694,20 +3971,16 @@
           <w:color w:val="667085"/>
           <w:sz w:val="17"/>
         </w:rPr>
-        <w:t>Financial activity and expense form</w:t>
+        <w:t>Fiscal-year budget list and entry form</w:t>
       </w:r>
     </w:p>
     <w:p>
-      <w:r>
-        <w:br w:type="page"/>
-      </w:r>
-    </w:p>
-    <w:p>
       <w:pPr>
         <w:pStyle w:val="Heading1"/>
-      </w:pPr>
-      <w:r>
-        <w:t>Budget Management</w:t>
+        <w:pageBreakBefore/>
+      </w:pPr>
+      <w:r>
+        <w:t>Reference Data</w:t>
       </w:r>
     </w:p>
     <w:p>
@@ -3718,20 +3991,25 @@
         <w:t>Available to:</w:t>
       </w:r>
       <w:r>
-        <w:t xml:space="preserve"> Admin, Treasurer</w:t>
+        <w:t xml:space="preserve"> Admin</w:t>
       </w:r>
     </w:p>
     <w:p>
       <w:r>
-        <w:t>Budgets are prepared by fiscal year for offering income by fund/category and for expenses by category and sub-category.</w:t>
+        <w:t>Reference data supplies church-specific dropdown values for member, offering, finance, and budget forms.</w:t>
       </w:r>
     </w:p>
     <w:p>
+      <w:r>
+        <w:t>Supported types include group code, membership status, committee code, offering fund/category, payment method, financial category, and financial sub-category.</w:t>
+      </w:r>
+    </w:p>
+    <w:p>
       <w:pPr>
         <w:pStyle w:val="Heading2"/>
       </w:pPr>
       <w:r>
-        <w:t>Review budgets</w:t>
+        <w:t>Create or update a value</w:t>
       </w:r>
     </w:p>
     <w:p>
@@ -3739,7 +4017,7 @@
         <w:pStyle w:val="ListNumber"/>
         <w:numPr>
           <w:ilvl w:val="0"/>
-          <w:numId w:val="23"/>
+          <w:numId w:val="25"/>
         </w:numPr>
       </w:pPr>
       <w:r>
@@ -3749,7 +4027,7 @@
         <w:rPr>
           <w:b/>
         </w:rPr>
-        <w:t>Budgets</w:t>
+        <w:t>Reference Data</w:t>
       </w:r>
       <w:r>
         <w:t>.</w:t>
@@ -3760,23 +4038,11 @@
         <w:pStyle w:val="ListNumber"/>
         <w:numPr>
           <w:ilvl w:val="0"/>
-          <w:numId w:val="23"/>
+          <w:numId w:val="25"/>
         </w:numPr>
       </w:pPr>
       <w:r>
-        <w:t>Enter the fiscal year and optionally choose a budget type.</w:t>
-      </w:r>
-    </w:p>
-    <w:p>
-      <w:pPr>
-        <w:pStyle w:val="ListNumber"/>
-        <w:numPr>
-          <w:ilvl w:val="0"/>
-          <w:numId w:val="23"/>
-        </w:numPr>
-      </w:pPr>
-      <w:r>
-        <w:t xml:space="preserve">Select </w:t>
+        <w:t xml:space="preserve">Choose the reference type and select </w:t>
       </w:r>
       <w:r>
         <w:rPr>
@@ -3790,18 +4056,10 @@
     </w:p>
     <w:p>
       <w:pPr>
-        <w:pStyle w:val="Heading2"/>
-      </w:pPr>
-      <w:r>
-        <w:t>Add or update a budget</w:t>
-      </w:r>
-    </w:p>
-    <w:p>
-      <w:pPr>
         <w:pStyle w:val="ListNumber"/>
         <w:numPr>
           <w:ilvl w:val="0"/>
-          <w:numId w:val="24"/>
+          <w:numId w:val="25"/>
         </w:numPr>
       </w:pPr>
       <w:r>
@@ -3811,10 +4069,10 @@
         <w:rPr>
           <w:b/>
         </w:rPr>
-        <w:t>Add budget</w:t>
-      </w:r>
-      <w:r>
-        <w:t>.</w:t>
+        <w:t>New value</w:t>
+      </w:r>
+      <w:r>
+        <w:t>, enter an uppercase code, user-facing label, sort order, and active status.</w:t>
       </w:r>
     </w:p>
     <w:p>
@@ -3822,26 +4080,29 @@
         <w:pStyle w:val="ListNumber"/>
         <w:numPr>
           <w:ilvl w:val="0"/>
-          <w:numId w:val="24"/>
+          <w:numId w:val="25"/>
         </w:numPr>
       </w:pPr>
       <w:r>
-        <w:t xml:space="preserve">Choose </w:t>
+        <w:t>For an offering category or financial sub-category, select its parent fund or category.</w:t>
+      </w:r>
+    </w:p>
+    <w:p>
+      <w:pPr>
+        <w:pStyle w:val="ListNumber"/>
+        <w:numPr>
+          <w:ilvl w:val="0"/>
+          <w:numId w:val="25"/>
+        </w:numPr>
+      </w:pPr>
+      <w:r>
+        <w:t xml:space="preserve">Select </w:t>
       </w:r>
       <w:r>
         <w:rPr>
           <w:b/>
         </w:rPr>
-        <w:t>Offering income</w:t>
-      </w:r>
-      <w:r>
-        <w:t xml:space="preserve"> or </w:t>
-      </w:r>
-      <w:r>
-        <w:rPr>
-          <w:b/>
-        </w:rPr>
-        <w:t>Expense</w:t>
+        <w:t>Create value</w:t>
       </w:r>
       <w:r>
         <w:t>.</w:t>
@@ -3852,74 +4113,16 @@
         <w:pStyle w:val="ListNumber"/>
         <w:numPr>
           <w:ilvl w:val="0"/>
-          <w:numId w:val="24"/>
+          <w:numId w:val="25"/>
         </w:numPr>
       </w:pPr>
       <w:r>
-        <w:t xml:space="preserve">Enter the fiscal year and </w:t>
-      </w:r>
-      <w:r>
-        <w:rPr>
-          <w:b/>
-        </w:rPr>
-        <w:t>Budget</w:t>
-      </w:r>
-      <w:r>
-        <w:t xml:space="preserve"> amount.</w:t>
+        <w:t>To edit, select a row, update the details, and save.</w:t>
       </w:r>
     </w:p>
     <w:p>
-      <w:pPr>
-        <w:pStyle w:val="ListNumber"/>
-        <w:numPr>
-          <w:ilvl w:val="0"/>
-          <w:numId w:val="24"/>
-        </w:numPr>
-      </w:pPr>
-      <w:r>
-        <w:t>Choose the category and, for expenses, the applicable sub-category.</w:t>
-      </w:r>
-    </w:p>
-    <w:p>
-      <w:pPr>
-        <w:pStyle w:val="ListNumber"/>
-        <w:numPr>
-          <w:ilvl w:val="0"/>
-          <w:numId w:val="24"/>
-        </w:numPr>
-      </w:pPr>
-      <w:r>
-        <w:t xml:space="preserve">Add an optional memo and select </w:t>
-      </w:r>
-      <w:r>
-        <w:rPr>
-          <w:b/>
-        </w:rPr>
-        <w:t>Save budget</w:t>
-      </w:r>
-      <w:r>
-        <w:t>.</w:t>
-      </w:r>
-    </w:p>
-    <w:p>
-      <w:pPr>
-        <w:pStyle w:val="ListNumber"/>
-        <w:numPr>
-          <w:ilvl w:val="0"/>
-          <w:numId w:val="24"/>
-        </w:numPr>
-      </w:pPr>
-      <w:r>
-        <w:t xml:space="preserve">To edit, select an existing row, update the details, and select </w:t>
-      </w:r>
-      <w:r>
-        <w:rPr>
-          <w:b/>
-        </w:rPr>
-        <w:t>Save changes</w:t>
-      </w:r>
-      <w:r>
-        <w:t>.</w:t>
+      <w:r>
+        <w:t>The code is the value's key and cannot be changed after creation. Inactive values remain stored but are omitted from normal dropdown choices. A value cannot be deleted while member, offering, finance, budget, or archive data uses it.</w:t>
       </w:r>
     </w:p>
     <w:p>
@@ -3932,7 +4135,7 @@
         <w:drawing>
           <wp:inline xmlns:a="http://schemas.openxmlformats.org/drawingml/2006/main" xmlns:pic="http://schemas.openxmlformats.org/drawingml/2006/picture">
             <wp:extent cx="6172200" cy="4286250"/>
-            <wp:docPr id="11" name="Picture 11" descr="Fiscal-year budget list and entry form"/>
+            <wp:docPr id="11" name="Picture 11" descr="Reference data maintenance"/>
             <wp:cNvGraphicFramePr>
               <a:graphicFrameLocks noChangeAspect="1"/>
             </wp:cNvGraphicFramePr>
@@ -3940,7 +4143,7 @@
               <a:graphicData uri="http://schemas.openxmlformats.org/drawingml/2006/picture">
                 <pic:pic>
                   <pic:nvPicPr>
-                    <pic:cNvPr id="0" name="08-budgets.png"/>
+                    <pic:cNvPr id="0" name="09-reference-data.png"/>
                     <pic:cNvPicPr/>
                   </pic:nvPicPr>
                   <pic:blipFill>
@@ -3975,20 +4178,16 @@
           <w:color w:val="667085"/>
           <w:sz w:val="17"/>
         </w:rPr>
-        <w:t>Fiscal-year budget list and entry form</w:t>
+        <w:t>Reference data maintenance</w:t>
       </w:r>
     </w:p>
     <w:p>
-      <w:r>
-        <w:br w:type="page"/>
-      </w:r>
-    </w:p>
-    <w:p>
       <w:pPr>
         <w:pStyle w:val="Heading1"/>
-      </w:pPr>
-      <w:r>
-        <w:t>Reference Data</w:t>
+        <w:pageBreakBefore/>
+      </w:pPr>
+      <w:r>
+        <w:t>Reports</w:t>
       </w:r>
     </w:p>
     <w:p>
@@ -3999,25 +4198,15 @@
         <w:t>Available to:</w:t>
       </w:r>
       <w:r>
-        <w:t xml:space="preserve"> Admin</w:t>
+        <w:t xml:space="preserve"> Admin, Treasurer, Pastor, Viewer. The Official Tax Return is available only to Treasurer.</w:t>
       </w:r>
     </w:p>
     <w:p>
-      <w:r>
-        <w:t>Reference data supplies church-specific dropdown values for member, offering, finance, and budget forms.</w:t>
-      </w:r>
-    </w:p>
-    <w:p>
-      <w:r>
-        <w:t>Supported types include group code, membership status, committee code, offering fund/category, payment method, financial category, and financial sub-category.</w:t>
-      </w:r>
-    </w:p>
-    <w:p>
       <w:pPr>
         <w:pStyle w:val="Heading2"/>
       </w:pPr>
       <w:r>
-        <w:t>Create or update a value</w:t>
+        <w:t>Weekly Offering Status</w:t>
       </w:r>
     </w:p>
     <w:p>
@@ -4025,7 +4214,7 @@
         <w:pStyle w:val="ListNumber"/>
         <w:numPr>
           <w:ilvl w:val="0"/>
-          <w:numId w:val="25"/>
+          <w:numId w:val="26"/>
         </w:numPr>
       </w:pPr>
       <w:r>
@@ -4035,7 +4224,16 @@
         <w:rPr>
           <w:b/>
         </w:rPr>
-        <w:t>Reference Data</w:t>
+        <w:t>Reports</w:t>
+      </w:r>
+      <w:r>
+        <w:t xml:space="preserve">, then </w:t>
+      </w:r>
+      <w:r>
+        <w:rPr>
+          <w:b/>
+        </w:rPr>
+        <w:t>Weekly offerings</w:t>
       </w:r>
       <w:r>
         <w:t>.</w:t>
@@ -4046,17 +4244,41 @@
         <w:pStyle w:val="ListNumber"/>
         <w:numPr>
           <w:ilvl w:val="0"/>
-          <w:numId w:val="25"/>
+          <w:numId w:val="26"/>
         </w:numPr>
       </w:pPr>
       <w:r>
-        <w:t xml:space="preserve">Choose the reference type and select </w:t>
+        <w:t>Set start and end dates. The end date is included in the report range.</w:t>
+      </w:r>
+    </w:p>
+    <w:p>
+      <w:pPr>
+        <w:pStyle w:val="ListNumber"/>
+        <w:numPr>
+          <w:ilvl w:val="0"/>
+          <w:numId w:val="26"/>
+        </w:numPr>
+      </w:pPr>
+      <w:r>
+        <w:t>Optionally filter by fund/category and payment method.</w:t>
+      </w:r>
+    </w:p>
+    <w:p>
+      <w:pPr>
+        <w:pStyle w:val="ListNumber"/>
+        <w:numPr>
+          <w:ilvl w:val="0"/>
+          <w:numId w:val="26"/>
+        </w:numPr>
+      </w:pPr>
+      <w:r>
+        <w:t xml:space="preserve">Select </w:t>
       </w:r>
       <w:r>
         <w:rPr>
           <w:b/>
         </w:rPr>
-        <w:t>Refresh</w:t>
+        <w:t>Run report</w:t>
       </w:r>
       <w:r>
         <w:t>.</w:t>
@@ -4067,7 +4289,27 @@
         <w:pStyle w:val="ListNumber"/>
         <w:numPr>
           <w:ilvl w:val="0"/>
-          <w:numId w:val="25"/>
+          <w:numId w:val="26"/>
+        </w:numPr>
+      </w:pPr>
+      <w:r>
+        <w:t>Review labelled totals by offering Sunday, fund, category, giving type, and payment method.</w:t>
+      </w:r>
+    </w:p>
+    <w:p>
+      <w:pPr>
+        <w:pStyle w:val="Heading2"/>
+      </w:pPr>
+      <w:r>
+        <w:t>Offering Summary</w:t>
+      </w:r>
+    </w:p>
+    <w:p>
+      <w:pPr>
+        <w:pStyle w:val="ListNumber"/>
+        <w:numPr>
+          <w:ilvl w:val="0"/>
+          <w:numId w:val="27"/>
         </w:numPr>
       </w:pPr>
       <w:r>
@@ -4077,10 +4319,10 @@
         <w:rPr>
           <w:b/>
         </w:rPr>
-        <w:t>New value</w:t>
-      </w:r>
-      <w:r>
-        <w:t>, enter an uppercase code, user-facing label, sort order, and active status.</w:t>
+        <w:t>Member offerings</w:t>
+      </w:r>
+      <w:r>
+        <w:t>.</w:t>
       </w:r>
     </w:p>
     <w:p>
@@ -4088,11 +4330,11 @@
         <w:pStyle w:val="ListNumber"/>
         <w:numPr>
           <w:ilvl w:val="0"/>
-          <w:numId w:val="25"/>
+          <w:numId w:val="27"/>
         </w:numPr>
       </w:pPr>
       <w:r>
-        <w:t>For an offering category or financial sub-category, select its parent fund or category.</w:t>
+        <w:t>Set the inclusive date range.</w:t>
       </w:r>
     </w:p>
     <w:p>
@@ -4100,7 +4342,19 @@
         <w:pStyle w:val="ListNumber"/>
         <w:numPr>
           <w:ilvl w:val="0"/>
-          <w:numId w:val="25"/>
+          <w:numId w:val="27"/>
+        </w:numPr>
+      </w:pPr>
+      <w:r>
+        <w:t>Optionally enter an offering number and select a fund/category.</w:t>
+      </w:r>
+    </w:p>
+    <w:p>
+      <w:pPr>
+        <w:pStyle w:val="ListNumber"/>
+        <w:numPr>
+          <w:ilvl w:val="0"/>
+          <w:numId w:val="27"/>
         </w:numPr>
       </w:pPr>
       <w:r>
@@ -4110,10 +4364,29 @@
         <w:rPr>
           <w:b/>
         </w:rPr>
-        <w:t>Create value</w:t>
-      </w:r>
-      <w:r>
-        <w:t>.</w:t>
+        <w:t>Run report</w:t>
+      </w:r>
+      <w:r>
+        <w:t>. Results are ordered by offering number.</w:t>
+      </w:r>
+    </w:p>
+    <w:p>
+      <w:pPr>
+        <w:pStyle w:val="Heading2"/>
+      </w:pPr>
+      <w:r>
+        <w:t>Official Tax Return</w:t>
+      </w:r>
+    </w:p>
+    <w:p>
+      <w:r>
+        <w:rPr>
+          <w:b/>
+        </w:rPr>
+        <w:t>Available to:</w:t>
+      </w:r>
+      <w:r>
+        <w:t xml:space="preserve"> Treasurer</w:t>
       </w:r>
     </w:p>
     <w:p>
@@ -4121,16 +4394,263 @@
         <w:pStyle w:val="ListNumber"/>
         <w:numPr>
           <w:ilvl w:val="0"/>
-          <w:numId w:val="25"/>
+          <w:numId w:val="28"/>
         </w:numPr>
       </w:pPr>
       <w:r>
-        <w:t>To edit, select a row, update the details, and save.</w:t>
+        <w:t xml:space="preserve">Select </w:t>
+      </w:r>
+      <w:r>
+        <w:rPr>
+          <w:b/>
+        </w:rPr>
+        <w:t>Official tax</w:t>
+      </w:r>
+      <w:r>
+        <w:t>.</w:t>
       </w:r>
     </w:p>
     <w:p>
-      <w:r>
-        <w:t>The code is the value's key and cannot be changed after creation. Inactive values remain stored but are omitted from normal dropdown choices. A value cannot be deleted while member, offering, finance, budget, or archive data uses it.</w:t>
+      <w:pPr>
+        <w:pStyle w:val="ListNumber"/>
+        <w:numPr>
+          <w:ilvl w:val="0"/>
+          <w:numId w:val="28"/>
+        </w:numPr>
+      </w:pPr>
+      <w:r>
+        <w:t>Enter the tax year and optionally an offering number.</w:t>
+      </w:r>
+    </w:p>
+    <w:p>
+      <w:pPr>
+        <w:pStyle w:val="ListNumber"/>
+        <w:numPr>
+          <w:ilvl w:val="0"/>
+          <w:numId w:val="28"/>
+        </w:numPr>
+      </w:pPr>
+      <w:r>
+        <w:t xml:space="preserve">Select </w:t>
+      </w:r>
+      <w:r>
+        <w:rPr>
+          <w:b/>
+        </w:rPr>
+        <w:t>Run report</w:t>
+      </w:r>
+      <w:r>
+        <w:t>.</w:t>
+      </w:r>
+    </w:p>
+    <w:p>
+      <w:pPr>
+        <w:pStyle w:val="ListNumber"/>
+        <w:numPr>
+          <w:ilvl w:val="0"/>
+          <w:numId w:val="28"/>
+        </w:numPr>
+      </w:pPr>
+      <w:r>
+        <w:t>Review results ordered by offering number and giving date.</w:t>
+      </w:r>
+    </w:p>
+    <w:p>
+      <w:pPr>
+        <w:pStyle w:val="ListNumber"/>
+        <w:numPr>
+          <w:ilvl w:val="0"/>
+          <w:numId w:val="28"/>
+        </w:numPr>
+      </w:pPr>
+      <w:r>
+        <w:t xml:space="preserve">Select </w:t>
+      </w:r>
+      <w:r>
+        <w:rPr>
+          <w:b/>
+        </w:rPr>
+        <w:t>Export CSV</w:t>
+      </w:r>
+      <w:r>
+        <w:t xml:space="preserve"> for tax-receipt preparation.</w:t>
+      </w:r>
+    </w:p>
+    <w:p>
+      <w:pPr>
+        <w:pStyle w:val="Heading2"/>
+      </w:pPr>
+      <w:r>
+        <w:t>Financial Actual vs Budget</w:t>
+      </w:r>
+    </w:p>
+    <w:p>
+      <w:pPr>
+        <w:pStyle w:val="ListNumber"/>
+        <w:numPr>
+          <w:ilvl w:val="0"/>
+          <w:numId w:val="29"/>
+        </w:numPr>
+      </w:pPr>
+      <w:r>
+        <w:t xml:space="preserve">Select </w:t>
+      </w:r>
+      <w:r>
+        <w:rPr>
+          <w:b/>
+        </w:rPr>
+        <w:t>Budget performance</w:t>
+      </w:r>
+      <w:r>
+        <w:t>.</w:t>
+      </w:r>
+    </w:p>
+    <w:p>
+      <w:pPr>
+        <w:pStyle w:val="ListNumber"/>
+        <w:numPr>
+          <w:ilvl w:val="0"/>
+          <w:numId w:val="29"/>
+        </w:numPr>
+      </w:pPr>
+      <w:r>
+        <w:t xml:space="preserve">Enter the fiscal year and select </w:t>
+      </w:r>
+      <w:r>
+        <w:rPr>
+          <w:b/>
+        </w:rPr>
+        <w:t>Run report</w:t>
+      </w:r>
+      <w:r>
+        <w:t>.</w:t>
+      </w:r>
+    </w:p>
+    <w:p>
+      <w:pPr>
+        <w:pStyle w:val="ListNumber"/>
+        <w:numPr>
+          <w:ilvl w:val="0"/>
+          <w:numId w:val="29"/>
+        </w:numPr>
+      </w:pPr>
+      <w:r>
+        <w:t xml:space="preserve">Review labelled income/expense categories, budget, actual, Budget vs. Actual percentage, and variance. A zero budget shows </w:t>
+      </w:r>
+      <w:r>
+        <w:rPr>
+          <w:rFonts w:ascii="Courier New" w:hAnsi="Courier New"/>
+          <w:color w:val="123047"/>
+          <w:sz w:val="19"/>
+        </w:rPr>
+        <w:t>-</w:t>
+      </w:r>
+      <w:r>
+        <w:t xml:space="preserve"> for the percentage.</w:t>
+      </w:r>
+    </w:p>
+    <w:p>
+      <w:pPr>
+        <w:pStyle w:val="Heading2"/>
+      </w:pPr>
+      <w:r>
+        <w:t>Quarterly Financial Report</w:t>
+      </w:r>
+    </w:p>
+    <w:p>
+      <w:pPr>
+        <w:pStyle w:val="ListNumber"/>
+        <w:numPr>
+          <w:ilvl w:val="0"/>
+          <w:numId w:val="30"/>
+        </w:numPr>
+      </w:pPr>
+      <w:r>
+        <w:t xml:space="preserve">Select </w:t>
+      </w:r>
+      <w:r>
+        <w:rPr>
+          <w:b/>
+        </w:rPr>
+        <w:t>Quarterly Financial Report</w:t>
+      </w:r>
+      <w:r>
+        <w:t>.</w:t>
+      </w:r>
+    </w:p>
+    <w:p>
+      <w:pPr>
+        <w:pStyle w:val="ListNumber"/>
+        <w:numPr>
+          <w:ilvl w:val="0"/>
+          <w:numId w:val="30"/>
+        </w:numPr>
+      </w:pPr>
+      <w:r>
+        <w:t>Select the calendar year and quarter.</w:t>
+      </w:r>
+    </w:p>
+    <w:p>
+      <w:pPr>
+        <w:pStyle w:val="ListNumber"/>
+        <w:numPr>
+          <w:ilvl w:val="0"/>
+          <w:numId w:val="30"/>
+        </w:numPr>
+      </w:pPr>
+      <w:r>
+        <w:t>Select the Offering download for the quarterly offering workbook or the Expenditure download for the quarterly expense workbook.</w:t>
+      </w:r>
+    </w:p>
+    <w:p>
+      <w:pPr>
+        <w:pStyle w:val="ListNumber"/>
+        <w:numPr>
+          <w:ilvl w:val="0"/>
+          <w:numId w:val="30"/>
+        </w:numPr>
+      </w:pPr>
+      <w:r>
+        <w:t xml:space="preserve">Review the configured carry-over row in Offering and the configured </w:t>
+      </w:r>
+      <w:r>
+        <w:rPr>
+          <w:rFonts w:ascii="Courier New" w:hAnsi="Courier New"/>
+          <w:color w:val="123047"/>
+          <w:sz w:val="19"/>
+        </w:rPr>
+        <w:t>CONTINGENCY</w:t>
+      </w:r>
+      <w:r>
+        <w:t xml:space="preserve"> Financial Category label in Expenditure.</w:t>
+      </w:r>
+    </w:p>
+    <w:p>
+      <w:r>
+        <w:t xml:space="preserve">Both workbooks use Letter landscape print settings with scaling set to </w:t>
+      </w:r>
+      <w:r>
+        <w:rPr>
+          <w:b/>
+        </w:rPr>
+        <w:t>Adjust to 100%</w:t>
+      </w:r>
+      <w:r>
+        <w:t>.</w:t>
+      </w:r>
+    </w:p>
+    <w:p>
+      <w:r>
+        <w:t xml:space="preserve">For table reports that show </w:t>
+      </w:r>
+      <w:r>
+        <w:rPr>
+          <w:b/>
+        </w:rPr>
+        <w:t>Export CSV</w:t>
+      </w:r>
+      <w:r>
+        <w:t>, select it to download the current report results.</w:t>
       </w:r>
     </w:p>
     <w:p>
@@ -4143,7 +4663,7 @@
         <w:drawing>
           <wp:inline xmlns:a="http://schemas.openxmlformats.org/drawingml/2006/main" xmlns:pic="http://schemas.openxmlformats.org/drawingml/2006/picture">
             <wp:extent cx="6172200" cy="4286250"/>
-            <wp:docPr id="12" name="Picture 12" descr="Reference data maintenance"/>
+            <wp:docPr id="12" name="Picture 12" descr="Quarterly Financial Report controls and Excel downloads"/>
             <wp:cNvGraphicFramePr>
               <a:graphicFrameLocks noChangeAspect="1"/>
             </wp:cNvGraphicFramePr>
@@ -4151,7 +4671,7 @@
               <a:graphicData uri="http://schemas.openxmlformats.org/drawingml/2006/picture">
                 <pic:pic>
                   <pic:nvPicPr>
-                    <pic:cNvPr id="0" name="09-reference-data.png"/>
+                    <pic:cNvPr id="0" name="10-reports.png"/>
                     <pic:cNvPicPr/>
                   </pic:nvPicPr>
                   <pic:blipFill>
@@ -4186,20 +4706,16 @@
           <w:color w:val="667085"/>
           <w:sz w:val="17"/>
         </w:rPr>
-        <w:t>Reference data maintenance</w:t>
+        <w:t>Quarterly Financial Report controls and Excel downloads</w:t>
       </w:r>
     </w:p>
     <w:p>
-      <w:r>
-        <w:br w:type="page"/>
-      </w:r>
-    </w:p>
-    <w:p>
       <w:pPr>
         <w:pStyle w:val="Heading1"/>
-      </w:pPr>
-      <w:r>
-        <w:t>Reports</w:t>
+        <w:pageBreakBefore/>
+      </w:pPr>
+      <w:r>
+        <w:t>My Profile</w:t>
       </w:r>
     </w:p>
     <w:p>
@@ -4210,15 +4726,7 @@
         <w:t>Available to:</w:t>
       </w:r>
       <w:r>
-        <w:t xml:space="preserve"> Admin, Treasurer, Pastor, Viewer. The Official Tax Return is available only to Treasurer.</w:t>
-      </w:r>
-    </w:p>
-    <w:p>
-      <w:pPr>
-        <w:pStyle w:val="Heading2"/>
-      </w:pPr>
-      <w:r>
-        <w:t>Weekly Offering Status</w:t>
+        <w:t xml:space="preserve"> Admin, Member</w:t>
       </w:r>
     </w:p>
     <w:p>
@@ -4226,7 +4734,7 @@
         <w:pStyle w:val="ListNumber"/>
         <w:numPr>
           <w:ilvl w:val="0"/>
-          <w:numId w:val="26"/>
+          <w:numId w:val="31"/>
         </w:numPr>
       </w:pPr>
       <w:r>
@@ -4236,433 +4744,55 @@
         <w:rPr>
           <w:b/>
         </w:rPr>
-        <w:t>Reports</w:t>
-      </w:r>
-      <w:r>
-        <w:t xml:space="preserve">, then </w:t>
+        <w:t>My Profile</w:t>
+      </w:r>
+      <w:r>
+        <w:t>.</w:t>
+      </w:r>
+    </w:p>
+    <w:p>
+      <w:pPr>
+        <w:pStyle w:val="ListNumber"/>
+        <w:numPr>
+          <w:ilvl w:val="0"/>
+          <w:numId w:val="31"/>
+        </w:numPr>
+      </w:pPr>
+      <w:r>
+        <w:t>Review the primary email, which is the login ID and cannot be changed here.</w:t>
+      </w:r>
+    </w:p>
+    <w:p>
+      <w:pPr>
+        <w:pStyle w:val="ListNumber"/>
+        <w:numPr>
+          <w:ilvl w:val="0"/>
+          <w:numId w:val="31"/>
+        </w:numPr>
+      </w:pPr>
+      <w:r>
+        <w:t>Update display name, nickname, secondary email, phone numbers, address, and notes.</w:t>
+      </w:r>
+    </w:p>
+    <w:p>
+      <w:pPr>
+        <w:pStyle w:val="ListNumber"/>
+        <w:numPr>
+          <w:ilvl w:val="0"/>
+          <w:numId w:val="31"/>
+        </w:numPr>
+      </w:pPr>
+      <w:r>
+        <w:t xml:space="preserve">Select </w:t>
       </w:r>
       <w:r>
         <w:rPr>
           <w:b/>
         </w:rPr>
-        <w:t>Weekly offerings</w:t>
+        <w:t>Save profile</w:t>
       </w:r>
       <w:r>
         <w:t>.</w:t>
-      </w:r>
-    </w:p>
-    <w:p>
-      <w:pPr>
-        <w:pStyle w:val="ListNumber"/>
-        <w:numPr>
-          <w:ilvl w:val="0"/>
-          <w:numId w:val="26"/>
-        </w:numPr>
-      </w:pPr>
-      <w:r>
-        <w:t>Set start and end dates. The end date is included in the report range.</w:t>
-      </w:r>
-    </w:p>
-    <w:p>
-      <w:pPr>
-        <w:pStyle w:val="ListNumber"/>
-        <w:numPr>
-          <w:ilvl w:val="0"/>
-          <w:numId w:val="26"/>
-        </w:numPr>
-      </w:pPr>
-      <w:r>
-        <w:t>Optionally filter by fund/category and payment method.</w:t>
-      </w:r>
-    </w:p>
-    <w:p>
-      <w:pPr>
-        <w:pStyle w:val="ListNumber"/>
-        <w:numPr>
-          <w:ilvl w:val="0"/>
-          <w:numId w:val="26"/>
-        </w:numPr>
-      </w:pPr>
-      <w:r>
-        <w:t xml:space="preserve">Select </w:t>
-      </w:r>
-      <w:r>
-        <w:rPr>
-          <w:b/>
-        </w:rPr>
-        <w:t>Run report</w:t>
-      </w:r>
-      <w:r>
-        <w:t>.</w:t>
-      </w:r>
-    </w:p>
-    <w:p>
-      <w:pPr>
-        <w:pStyle w:val="ListNumber"/>
-        <w:numPr>
-          <w:ilvl w:val="0"/>
-          <w:numId w:val="26"/>
-        </w:numPr>
-      </w:pPr>
-      <w:r>
-        <w:t>Review labelled totals by offering Sunday, fund, category, giving type, and payment method.</w:t>
-      </w:r>
-    </w:p>
-    <w:p>
-      <w:pPr>
-        <w:pStyle w:val="Heading2"/>
-      </w:pPr>
-      <w:r>
-        <w:t>Offering Summary</w:t>
-      </w:r>
-    </w:p>
-    <w:p>
-      <w:pPr>
-        <w:pStyle w:val="ListNumber"/>
-        <w:numPr>
-          <w:ilvl w:val="0"/>
-          <w:numId w:val="27"/>
-        </w:numPr>
-      </w:pPr>
-      <w:r>
-        <w:t xml:space="preserve">Select </w:t>
-      </w:r>
-      <w:r>
-        <w:rPr>
-          <w:b/>
-        </w:rPr>
-        <w:t>Member offerings</w:t>
-      </w:r>
-      <w:r>
-        <w:t>.</w:t>
-      </w:r>
-    </w:p>
-    <w:p>
-      <w:pPr>
-        <w:pStyle w:val="ListNumber"/>
-        <w:numPr>
-          <w:ilvl w:val="0"/>
-          <w:numId w:val="27"/>
-        </w:numPr>
-      </w:pPr>
-      <w:r>
-        <w:t>Set the inclusive date range.</w:t>
-      </w:r>
-    </w:p>
-    <w:p>
-      <w:pPr>
-        <w:pStyle w:val="ListNumber"/>
-        <w:numPr>
-          <w:ilvl w:val="0"/>
-          <w:numId w:val="27"/>
-        </w:numPr>
-      </w:pPr>
-      <w:r>
-        <w:t>Optionally enter an offering number and select a fund/category.</w:t>
-      </w:r>
-    </w:p>
-    <w:p>
-      <w:pPr>
-        <w:pStyle w:val="ListNumber"/>
-        <w:numPr>
-          <w:ilvl w:val="0"/>
-          <w:numId w:val="27"/>
-        </w:numPr>
-      </w:pPr>
-      <w:r>
-        <w:t xml:space="preserve">Select </w:t>
-      </w:r>
-      <w:r>
-        <w:rPr>
-          <w:b/>
-        </w:rPr>
-        <w:t>Run report</w:t>
-      </w:r>
-      <w:r>
-        <w:t>. Results are ordered by offering number.</w:t>
-      </w:r>
-    </w:p>
-    <w:p>
-      <w:pPr>
-        <w:pStyle w:val="Heading2"/>
-      </w:pPr>
-      <w:r>
-        <w:t>Official Tax Return</w:t>
-      </w:r>
-    </w:p>
-    <w:p>
-      <w:r>
-        <w:rPr>
-          <w:b/>
-        </w:rPr>
-        <w:t>Available to:</w:t>
-      </w:r>
-      <w:r>
-        <w:t xml:space="preserve"> Treasurer</w:t>
-      </w:r>
-    </w:p>
-    <w:p>
-      <w:pPr>
-        <w:pStyle w:val="ListNumber"/>
-        <w:numPr>
-          <w:ilvl w:val="0"/>
-          <w:numId w:val="28"/>
-        </w:numPr>
-      </w:pPr>
-      <w:r>
-        <w:t xml:space="preserve">Select </w:t>
-      </w:r>
-      <w:r>
-        <w:rPr>
-          <w:b/>
-        </w:rPr>
-        <w:t>Official tax</w:t>
-      </w:r>
-      <w:r>
-        <w:t>.</w:t>
-      </w:r>
-    </w:p>
-    <w:p>
-      <w:pPr>
-        <w:pStyle w:val="ListNumber"/>
-        <w:numPr>
-          <w:ilvl w:val="0"/>
-          <w:numId w:val="28"/>
-        </w:numPr>
-      </w:pPr>
-      <w:r>
-        <w:t>Enter the tax year and optionally an offering number.</w:t>
-      </w:r>
-    </w:p>
-    <w:p>
-      <w:pPr>
-        <w:pStyle w:val="ListNumber"/>
-        <w:numPr>
-          <w:ilvl w:val="0"/>
-          <w:numId w:val="28"/>
-        </w:numPr>
-      </w:pPr>
-      <w:r>
-        <w:t xml:space="preserve">Select </w:t>
-      </w:r>
-      <w:r>
-        <w:rPr>
-          <w:b/>
-        </w:rPr>
-        <w:t>Run report</w:t>
-      </w:r>
-      <w:r>
-        <w:t>.</w:t>
-      </w:r>
-    </w:p>
-    <w:p>
-      <w:pPr>
-        <w:pStyle w:val="ListNumber"/>
-        <w:numPr>
-          <w:ilvl w:val="0"/>
-          <w:numId w:val="28"/>
-        </w:numPr>
-      </w:pPr>
-      <w:r>
-        <w:t>Review results ordered by offering number and giving date.</w:t>
-      </w:r>
-    </w:p>
-    <w:p>
-      <w:pPr>
-        <w:pStyle w:val="ListNumber"/>
-        <w:numPr>
-          <w:ilvl w:val="0"/>
-          <w:numId w:val="28"/>
-        </w:numPr>
-      </w:pPr>
-      <w:r>
-        <w:t xml:space="preserve">Select </w:t>
-      </w:r>
-      <w:r>
-        <w:rPr>
-          <w:b/>
-        </w:rPr>
-        <w:t>Export CSV</w:t>
-      </w:r>
-      <w:r>
-        <w:t xml:space="preserve"> for tax-receipt preparation.</w:t>
-      </w:r>
-    </w:p>
-    <w:p>
-      <w:pPr>
-        <w:pStyle w:val="Heading2"/>
-      </w:pPr>
-      <w:r>
-        <w:t>Financial Actual vs Budget</w:t>
-      </w:r>
-    </w:p>
-    <w:p>
-      <w:pPr>
-        <w:pStyle w:val="ListNumber"/>
-        <w:numPr>
-          <w:ilvl w:val="0"/>
-          <w:numId w:val="29"/>
-        </w:numPr>
-      </w:pPr>
-      <w:r>
-        <w:t xml:space="preserve">Select </w:t>
-      </w:r>
-      <w:r>
-        <w:rPr>
-          <w:b/>
-        </w:rPr>
-        <w:t>Budget performance</w:t>
-      </w:r>
-      <w:r>
-        <w:t>.</w:t>
-      </w:r>
-    </w:p>
-    <w:p>
-      <w:pPr>
-        <w:pStyle w:val="ListNumber"/>
-        <w:numPr>
-          <w:ilvl w:val="0"/>
-          <w:numId w:val="29"/>
-        </w:numPr>
-      </w:pPr>
-      <w:r>
-        <w:t xml:space="preserve">Enter the fiscal year and select </w:t>
-      </w:r>
-      <w:r>
-        <w:rPr>
-          <w:b/>
-        </w:rPr>
-        <w:t>Run report</w:t>
-      </w:r>
-      <w:r>
-        <w:t>.</w:t>
-      </w:r>
-    </w:p>
-    <w:p>
-      <w:pPr>
-        <w:pStyle w:val="ListNumber"/>
-        <w:numPr>
-          <w:ilvl w:val="0"/>
-          <w:numId w:val="29"/>
-        </w:numPr>
-      </w:pPr>
-      <w:r>
-        <w:t xml:space="preserve">Review labelled income/expense categories, budget, actual, Budget vs. Actual percentage, and variance. A zero budget shows </w:t>
-      </w:r>
-      <w:r>
-        <w:rPr>
-          <w:rFonts w:ascii="Courier New" w:hAnsi="Courier New"/>
-          <w:color w:val="123047"/>
-          <w:sz w:val="19"/>
-        </w:rPr>
-        <w:t>-</w:t>
-      </w:r>
-      <w:r>
-        <w:t xml:space="preserve"> for the percentage.</w:t>
-      </w:r>
-    </w:p>
-    <w:p>
-      <w:pPr>
-        <w:pStyle w:val="Heading2"/>
-      </w:pPr>
-      <w:r>
-        <w:t>Quarterly Financial Report</w:t>
-      </w:r>
-    </w:p>
-    <w:p>
-      <w:pPr>
-        <w:pStyle w:val="ListNumber"/>
-        <w:numPr>
-          <w:ilvl w:val="0"/>
-          <w:numId w:val="30"/>
-        </w:numPr>
-      </w:pPr>
-      <w:r>
-        <w:t xml:space="preserve">Select </w:t>
-      </w:r>
-      <w:r>
-        <w:rPr>
-          <w:b/>
-        </w:rPr>
-        <w:t>Quarterly Financial Report</w:t>
-      </w:r>
-      <w:r>
-        <w:t>.</w:t>
-      </w:r>
-    </w:p>
-    <w:p>
-      <w:pPr>
-        <w:pStyle w:val="ListNumber"/>
-        <w:numPr>
-          <w:ilvl w:val="0"/>
-          <w:numId w:val="30"/>
-        </w:numPr>
-      </w:pPr>
-      <w:r>
-        <w:t>Select the calendar year and quarter.</w:t>
-      </w:r>
-    </w:p>
-    <w:p>
-      <w:pPr>
-        <w:pStyle w:val="ListNumber"/>
-        <w:numPr>
-          <w:ilvl w:val="0"/>
-          <w:numId w:val="30"/>
-        </w:numPr>
-      </w:pPr>
-      <w:r>
-        <w:t>Select the Offering download for the quarterly offering workbook or the Expenditure download for the quarterly expense workbook.</w:t>
-      </w:r>
-    </w:p>
-    <w:p>
-      <w:pPr>
-        <w:pStyle w:val="ListNumber"/>
-        <w:numPr>
-          <w:ilvl w:val="0"/>
-          <w:numId w:val="30"/>
-        </w:numPr>
-      </w:pPr>
-      <w:r>
-        <w:t xml:space="preserve">Review the configured carry-over row in Offering and the configured </w:t>
-      </w:r>
-      <w:r>
-        <w:rPr>
-          <w:rFonts w:ascii="Courier New" w:hAnsi="Courier New"/>
-          <w:color w:val="123047"/>
-          <w:sz w:val="19"/>
-        </w:rPr>
-        <w:t>CONTINGENCY</w:t>
-      </w:r>
-      <w:r>
-        <w:t xml:space="preserve"> Financial Category label in Expenditure.</w:t>
-      </w:r>
-    </w:p>
-    <w:p>
-      <w:r>
-        <w:t xml:space="preserve">Both workbooks use Letter landscape print settings with scaling set to </w:t>
-      </w:r>
-      <w:r>
-        <w:rPr>
-          <w:b/>
-        </w:rPr>
-        <w:t>Adjust to 100%</w:t>
-      </w:r>
-      <w:r>
-        <w:t>.</w:t>
-      </w:r>
-    </w:p>
-    <w:p>
-      <w:r>
-        <w:t xml:space="preserve">For table reports that show </w:t>
-      </w:r>
-      <w:r>
-        <w:rPr>
-          <w:b/>
-        </w:rPr>
-        <w:t>Export CSV</w:t>
-      </w:r>
-      <w:r>
-        <w:t>, select it to download the current report results.</w:t>
       </w:r>
     </w:p>
     <w:p>
@@ -4675,7 +4805,7 @@
         <w:drawing>
           <wp:inline xmlns:a="http://schemas.openxmlformats.org/drawingml/2006/main" xmlns:pic="http://schemas.openxmlformats.org/drawingml/2006/picture">
             <wp:extent cx="6172200" cy="4286250"/>
-            <wp:docPr id="13" name="Picture 13" descr="Quarterly Financial Report controls and Excel downloads"/>
+            <wp:docPr id="13" name="Picture 13" descr="Personal profile maintenance"/>
             <wp:cNvGraphicFramePr>
               <a:graphicFrameLocks noChangeAspect="1"/>
             </wp:cNvGraphicFramePr>
@@ -4683,7 +4813,7 @@
               <a:graphicData uri="http://schemas.openxmlformats.org/drawingml/2006/picture">
                 <pic:pic>
                   <pic:nvPicPr>
-                    <pic:cNvPr id="0" name="10-reports.png"/>
+                    <pic:cNvPr id="0" name="11-profile.png"/>
                     <pic:cNvPicPr/>
                   </pic:nvPicPr>
                   <pic:blipFill>
@@ -4718,20 +4848,16 @@
           <w:color w:val="667085"/>
           <w:sz w:val="17"/>
         </w:rPr>
-        <w:t>Quarterly Financial Report controls and Excel downloads</w:t>
+        <w:t>Personal profile maintenance</w:t>
       </w:r>
     </w:p>
     <w:p>
-      <w:r>
-        <w:br w:type="page"/>
-      </w:r>
-    </w:p>
-    <w:p>
       <w:pPr>
         <w:pStyle w:val="Heading1"/>
-      </w:pPr>
-      <w:r>
-        <w:t>My Profile</w:t>
+        <w:pageBreakBefore/>
+      </w:pPr>
+      <w:r>
+        <w:t>System Administration</w:t>
       </w:r>
     </w:p>
     <w:p>
@@ -4742,153 +4868,25 @@
         <w:t>Available to:</w:t>
       </w:r>
       <w:r>
-        <w:t xml:space="preserve"> Admin, Member</w:t>
+        <w:t xml:space="preserve"> Admin</w:t>
       </w:r>
     </w:p>
     <w:p>
-      <w:pPr>
-        <w:pStyle w:val="ListNumber"/>
-        <w:numPr>
-          <w:ilvl w:val="0"/>
-          <w:numId w:val="31"/>
-        </w:numPr>
-      </w:pPr>
-      <w:r>
-        <w:t xml:space="preserve">Select </w:t>
-      </w:r>
-      <w:r>
-        <w:rPr>
-          <w:b/>
-        </w:rPr>
-        <w:t>My Profile</w:t>
-      </w:r>
-      <w:r>
-        <w:t>.</w:t>
+      <w:r>
+        <w:t>System Administration contains the Full Backup, Full Restore, Fiscal Archive, Church Settings, and Email Settings workflows. These functions affect the whole church database or application-wide configuration and should be used only from an authorized church device.</w:t>
       </w:r>
     </w:p>
     <w:p>
       <w:pPr>
-        <w:pStyle w:val="ListNumber"/>
-        <w:numPr>
-          <w:ilvl w:val="0"/>
-          <w:numId w:val="31"/>
-        </w:numPr>
-      </w:pPr>
-      <w:r>
-        <w:t>Review the primary email, which is the login ID and cannot be changed here.</w:t>
+        <w:pStyle w:val="Heading2"/>
+      </w:pPr>
+      <w:r>
+        <w:t>Church Settings</w:t>
       </w:r>
     </w:p>
     <w:p>
-      <w:pPr>
-        <w:pStyle w:val="ListNumber"/>
-        <w:numPr>
-          <w:ilvl w:val="0"/>
-          <w:numId w:val="31"/>
-        </w:numPr>
-      </w:pPr>
-      <w:r>
-        <w:t>Update display name, nickname, secondary email, phone numbers, address, and notes.</w:t>
-      </w:r>
-    </w:p>
-    <w:p>
-      <w:pPr>
-        <w:pStyle w:val="ListNumber"/>
-        <w:numPr>
-          <w:ilvl w:val="0"/>
-          <w:numId w:val="31"/>
-        </w:numPr>
-      </w:pPr>
-      <w:r>
-        <w:t xml:space="preserve">Select </w:t>
-      </w:r>
-      <w:r>
-        <w:rPr>
-          <w:b/>
-        </w:rPr>
-        <w:t>Save profile</w:t>
-      </w:r>
-      <w:r>
-        <w:t>.</w:t>
-      </w:r>
-    </w:p>
-    <w:p>
-      <w:pPr>
-        <w:keepNext/>
-        <w:spacing w:before="100" w:after="60"/>
-        <w:jc w:val="center"/>
-      </w:pPr>
-      <w:r>
-        <w:drawing>
-          <wp:inline xmlns:a="http://schemas.openxmlformats.org/drawingml/2006/main" xmlns:pic="http://schemas.openxmlformats.org/drawingml/2006/picture">
-            <wp:extent cx="6172200" cy="4286250"/>
-            <wp:docPr id="14" name="Picture 14" descr="Personal profile maintenance"/>
-            <wp:cNvGraphicFramePr>
-              <a:graphicFrameLocks noChangeAspect="1"/>
-            </wp:cNvGraphicFramePr>
-            <a:graphic>
-              <a:graphicData uri="http://schemas.openxmlformats.org/drawingml/2006/picture">
-                <pic:pic>
-                  <pic:nvPicPr>
-                    <pic:cNvPr id="0" name="11-profile.png"/>
-                    <pic:cNvPicPr/>
-                  </pic:nvPicPr>
-                  <pic:blipFill>
-                    <a:blip r:embed="rId24"/>
-                    <a:stretch>
-                      <a:fillRect/>
-                    </a:stretch>
-                  </pic:blipFill>
-                  <pic:spPr>
-                    <a:xfrm>
-                      <a:off x="0" y="0"/>
-                      <a:ext cx="6172200" cy="4286250"/>
-                    </a:xfrm>
-                    <a:prstGeom prst="rect"/>
-                  </pic:spPr>
-                </pic:pic>
-              </a:graphicData>
-            </a:graphic>
-          </wp:inline>
-        </w:drawing>
-      </w:r>
-    </w:p>
-    <w:p>
-      <w:pPr>
-        <w:spacing w:after="160"/>
-        <w:jc w:val="center"/>
-      </w:pPr>
-      <w:r>
-        <w:rPr>
-          <w:rFonts w:ascii="Aptos" w:hAnsi="Aptos"/>
-          <w:i/>
-          <w:color w:val="667085"/>
-          <w:sz w:val="17"/>
-        </w:rPr>
-        <w:t>Personal profile maintenance</w:t>
-      </w:r>
-    </w:p>
-    <w:p>
-      <w:r>
-        <w:br w:type="page"/>
-      </w:r>
-    </w:p>
-    <w:p>
-      <w:pPr>
-        <w:pStyle w:val="Heading1"/>
-      </w:pPr>
-      <w:r>
-        <w:t>Logout</w:t>
-      </w:r>
-    </w:p>
-    <w:p>
-      <w:r>
-        <w:rPr>
-          <w:b/>
-        </w:rPr>
-        <w:t>Available to:</w:t>
-      </w:r>
-      <w:r>
-        <w:t xml:space="preserve"> All signed-in users</w:t>
+      <w:r>
+        <w:t>Administrators can change the church identity and branding without editing server files or restarting the application.</w:t>
       </w:r>
     </w:p>
     <w:p>
@@ -4906,10 +4904,19 @@
         <w:rPr>
           <w:b/>
         </w:rPr>
-        <w:t>Logout</w:t>
-      </w:r>
-      <w:r>
-        <w:t xml:space="preserve"> at the bottom of the left menu.</w:t>
+        <w:t>System Administration</w:t>
+      </w:r>
+      <w:r>
+        <w:t xml:space="preserve">, then </w:t>
+      </w:r>
+      <w:r>
+        <w:rPr>
+          <w:b/>
+        </w:rPr>
+        <w:t>Church Settings</w:t>
+      </w:r>
+      <w:r>
+        <w:t>.</w:t>
       </w:r>
     </w:p>
     <w:p>
@@ -4921,7 +4928,7 @@
         </w:numPr>
       </w:pPr>
       <w:r>
-        <w:t>The current session is invalidated and the sign-in page opens.</w:t>
+        <w:t>Enter the church name and address. These two fields are required.</w:t>
       </w:r>
     </w:p>
     <w:p>
@@ -4933,22 +4940,572 @@
         </w:numPr>
       </w:pPr>
       <w:r>
-        <w:t>Sign in again to begin a new session.</w:t>
+        <w:t>Enter the contact information, treasurer name, charity registration number, receipt issue location, and church website as applicable.</w:t>
       </w:r>
     </w:p>
     <w:p>
-      <w:r>
-        <w:t>Do not leave Church Operations open on a shared or unattended computer.</w:t>
+      <w:pPr>
+        <w:pStyle w:val="ListNumber"/>
+        <w:numPr>
+          <w:ilvl w:val="0"/>
+          <w:numId w:val="32"/>
+        </w:numPr>
+      </w:pPr>
+      <w:r>
+        <w:t>To replace the church logo or dashboard banner, select a PNG or JPEG image no larger than 5 MB. The preview shows the current image until a replacement is selected.</w:t>
       </w:r>
     </w:p>
     <w:p>
-      <w:r>
-        <w:br w:type="page"/>
+      <w:pPr>
+        <w:pStyle w:val="ListNumber"/>
+        <w:numPr>
+          <w:ilvl w:val="0"/>
+          <w:numId w:val="32"/>
+        </w:numPr>
+      </w:pPr>
+      <w:r>
+        <w:t xml:space="preserve">Select </w:t>
+      </w:r>
+      <w:r>
+        <w:rPr>
+          <w:b/>
+        </w:rPr>
+        <w:t>Save church settings</w:t>
+      </w:r>
+      <w:r>
+        <w:t>.</w:t>
       </w:r>
     </w:p>
     <w:p>
+      <w:r>
+        <w:t>Saved changes appear immediately without signing in again. The church name and logo update in the left menu, and the banner and contact information update on the dashboard. New official tax receipt PDFs and quarterly and yearly financial workbooks use the saved church information and logo. Reports already issued or closed remain unchanged.</w:t>
+      </w:r>
+    </w:p>
+    <w:p>
+      <w:r>
+        <w:t xml:space="preserve">Uploaded branding and church settings are stored in the database and included in a full backup. The application version appears below </w:t>
+      </w:r>
+      <w:r>
+        <w:rPr>
+          <w:b/>
+        </w:rPr>
+        <w:t>Church Operations</w:t>
+      </w:r>
+      <w:r>
+        <w:t xml:space="preserve"> in the left menu and is supplied by the deployed application build; it cannot be edited on this page.</w:t>
+      </w:r>
+    </w:p>
+    <w:p>
+      <w:pPr>
+        <w:pStyle w:val="Heading2"/>
+      </w:pPr>
+      <w:r>
+        <w:t>Reset church settings</w:t>
+      </w:r>
+    </w:p>
+    <w:p>
+      <w:pPr>
+        <w:pStyle w:val="ListNumber"/>
+        <w:numPr>
+          <w:ilvl w:val="0"/>
+          <w:numId w:val="33"/>
+        </w:numPr>
+      </w:pPr>
+      <w:r>
+        <w:t xml:space="preserve">Select </w:t>
+      </w:r>
+      <w:r>
+        <w:rPr>
+          <w:b/>
+        </w:rPr>
+        <w:t>Reset church settings</w:t>
+      </w:r>
+      <w:r>
+        <w:t>.</w:t>
+      </w:r>
+    </w:p>
+    <w:p>
+      <w:pPr>
+        <w:pStyle w:val="ListNumber"/>
+        <w:numPr>
+          <w:ilvl w:val="0"/>
+          <w:numId w:val="33"/>
+        </w:numPr>
+      </w:pPr>
+      <w:r>
+        <w:t xml:space="preserve">Review the warning and select </w:t>
+      </w:r>
+      <w:r>
+        <w:rPr>
+          <w:b/>
+        </w:rPr>
+        <w:t>Confirm reset church settings</w:t>
+      </w:r>
+      <w:r>
+        <w:t>.</w:t>
+      </w:r>
+    </w:p>
+    <w:p>
+      <w:pPr>
+        <w:pStyle w:val="ListNumber"/>
+        <w:numPr>
+          <w:ilvl w:val="0"/>
+          <w:numId w:val="33"/>
+        </w:numPr>
+      </w:pPr>
+      <w:r>
+        <w:t>The database settings and uploaded branding are removed. The application immediately returns to the church information and bundled images configured by the server.</w:t>
+      </w:r>
+    </w:p>
+    <w:p>
+      <w:pPr>
+        <w:pStyle w:val="Heading2"/>
+      </w:pPr>
+      <w:r>
+        <w:t>Email Settings</w:t>
+      </w:r>
+    </w:p>
+    <w:p>
+      <w:r>
+        <w:t>Administrators can change the SMTP host, port, username, password, and sender address without restarting the application.</w:t>
+      </w:r>
+    </w:p>
+    <w:p>
+      <w:pPr>
+        <w:pStyle w:val="ListNumber"/>
+        <w:numPr>
+          <w:ilvl w:val="0"/>
+          <w:numId w:val="34"/>
+        </w:numPr>
+      </w:pPr>
+      <w:r>
+        <w:t xml:space="preserve">Select </w:t>
+      </w:r>
+      <w:r>
+        <w:rPr>
+          <w:b/>
+        </w:rPr>
+        <w:t>System Administration</w:t>
+      </w:r>
+      <w:r>
+        <w:t xml:space="preserve">, then </w:t>
+      </w:r>
+      <w:r>
+        <w:rPr>
+          <w:b/>
+        </w:rPr>
+        <w:t>Email Settings</w:t>
+      </w:r>
+      <w:r>
+        <w:t>.</w:t>
+      </w:r>
+    </w:p>
+    <w:p>
+      <w:pPr>
+        <w:pStyle w:val="ListNumber"/>
+        <w:numPr>
+          <w:ilvl w:val="0"/>
+          <w:numId w:val="34"/>
+        </w:numPr>
+      </w:pPr>
+      <w:r>
+        <w:t xml:space="preserve">Enter the SMTP host, port, username, and </w:t>
+      </w:r>
+      <w:r>
+        <w:rPr>
+          <w:b/>
+        </w:rPr>
+        <w:t>From address</w:t>
+      </w:r>
+      <w:r>
+        <w:t xml:space="preserve"> supplied by the email provider.</w:t>
+      </w:r>
+    </w:p>
+    <w:p>
+      <w:pPr>
+        <w:pStyle w:val="ListNumber"/>
+        <w:numPr>
+          <w:ilvl w:val="0"/>
+          <w:numId w:val="34"/>
+        </w:numPr>
+      </w:pPr>
+      <w:r>
+        <w:t xml:space="preserve">Enter </w:t>
+      </w:r>
+      <w:r>
+        <w:rPr>
+          <w:b/>
+        </w:rPr>
+        <w:t>SMTP password</w:t>
+      </w:r>
+      <w:r>
+        <w:t xml:space="preserve"> when setting or replacing the provider password. Leave it blank to keep the currently configured password.</w:t>
+      </w:r>
+    </w:p>
+    <w:p>
+      <w:pPr>
+        <w:pStyle w:val="ListNumber"/>
+        <w:numPr>
+          <w:ilvl w:val="0"/>
+          <w:numId w:val="34"/>
+        </w:numPr>
+      </w:pPr>
+      <w:r>
+        <w:t xml:space="preserve">Enter an accessible address in </w:t>
+      </w:r>
+      <w:r>
+        <w:rPr>
+          <w:b/>
+        </w:rPr>
+        <w:t>Test recipient</w:t>
+      </w:r>
+      <w:r>
+        <w:t xml:space="preserve"> and select </w:t>
+      </w:r>
+      <w:r>
+        <w:rPr>
+          <w:b/>
+        </w:rPr>
+        <w:t>Send test email</w:t>
+      </w:r>
+      <w:r>
+        <w:t>.</w:t>
+      </w:r>
+    </w:p>
+    <w:p>
+      <w:pPr>
+        <w:pStyle w:val="ListNumber"/>
+        <w:numPr>
+          <w:ilvl w:val="0"/>
+          <w:numId w:val="34"/>
+        </w:numPr>
+      </w:pPr>
+      <w:r>
+        <w:t xml:space="preserve">Confirm that the message arrives. </w:t>
+      </w:r>
+      <w:r>
+        <w:rPr>
+          <w:b/>
+        </w:rPr>
+        <w:t>Save settings</w:t>
+      </w:r>
+      <w:r>
+        <w:t xml:space="preserve"> becomes available only after the exact values on screen pass the test.</w:t>
+      </w:r>
+    </w:p>
+    <w:p>
+      <w:pPr>
+        <w:pStyle w:val="ListNumber"/>
+        <w:numPr>
+          <w:ilvl w:val="0"/>
+          <w:numId w:val="34"/>
+        </w:numPr>
+      </w:pPr>
+      <w:r>
+        <w:t xml:space="preserve">Select </w:t>
+      </w:r>
+      <w:r>
+        <w:rPr>
+          <w:b/>
+        </w:rPr>
+        <w:t>Save settings</w:t>
+      </w:r>
+      <w:r>
+        <w:t>. Password-reset messages use the saved configuration immediately.</w:t>
+      </w:r>
+    </w:p>
+    <w:p>
+      <w:r>
+        <w:t xml:space="preserve">The status identifies whether the active values come from </w:t>
+      </w:r>
+      <w:r>
+        <w:rPr>
+          <w:b/>
+        </w:rPr>
+        <w:t>Database settings</w:t>
+      </w:r>
+      <w:r>
+        <w:t xml:space="preserve"> or </w:t>
+      </w:r>
+      <w:r>
+        <w:rPr>
+          <w:b/>
+        </w:rPr>
+        <w:t>Server defaults</w:t>
+      </w:r>
+      <w:r>
+        <w:t xml:space="preserve"> and whether a password is configured. It never displays the password. Select the information icon for the administration guide.</w:t>
+      </w:r>
+    </w:p>
+    <w:p>
+      <w:pPr>
+        <w:pStyle w:val="Heading2"/>
+      </w:pPr>
+      <w:r>
+        <w:t>Reset email settings</w:t>
+      </w:r>
+    </w:p>
+    <w:p>
+      <w:pPr>
+        <w:pStyle w:val="ListNumber"/>
+        <w:numPr>
+          <w:ilvl w:val="0"/>
+          <w:numId w:val="35"/>
+        </w:numPr>
+      </w:pPr>
+      <w:r>
+        <w:t xml:space="preserve">Enter a valid </w:t>
+      </w:r>
+      <w:r>
+        <w:rPr>
+          <w:b/>
+        </w:rPr>
+        <w:t>Test recipient</w:t>
+      </w:r>
+      <w:r>
+        <w:t>.</w:t>
+      </w:r>
+    </w:p>
+    <w:p>
+      <w:pPr>
+        <w:pStyle w:val="ListNumber"/>
+        <w:numPr>
+          <w:ilvl w:val="0"/>
+          <w:numId w:val="35"/>
+        </w:numPr>
+      </w:pPr>
+      <w:r>
+        <w:t xml:space="preserve">Select </w:t>
+      </w:r>
+      <w:r>
+        <w:rPr>
+          <w:b/>
+        </w:rPr>
+        <w:t>Reset to server defaults</w:t>
+      </w:r>
+      <w:r>
+        <w:t xml:space="preserve"> and confirm.</w:t>
+      </w:r>
+    </w:p>
+    <w:p>
+      <w:pPr>
+        <w:pStyle w:val="ListNumber"/>
+        <w:numPr>
+          <w:ilvl w:val="0"/>
+          <w:numId w:val="35"/>
+        </w:numPr>
+      </w:pPr>
+      <w:r>
+        <w:t xml:space="preserve">The application tests the values from </w:t>
+      </w:r>
+      <w:r>
+        <w:rPr>
+          <w:rFonts w:ascii="Courier New" w:hAnsi="Courier New"/>
+          <w:color w:val="123047"/>
+          <w:sz w:val="19"/>
+        </w:rPr>
+        <w:t>.env</w:t>
+      </w:r>
+      <w:r>
+        <w:t xml:space="preserve"> first. The database override is removed only when that test succeeds.</w:t>
+      </w:r>
+    </w:p>
+    <w:p>
+      <w:pPr>
+        <w:pStyle w:val="Heading2"/>
+      </w:pPr>
+      <w:r>
+        <w:t>Server administrator responsibilities</w:t>
+      </w:r>
+    </w:p>
+    <w:p>
+      <w:pPr>
+        <w:pStyle w:val="ListBullet"/>
+      </w:pPr>
+      <w:r>
+        <w:rPr>
+          <w:rFonts w:ascii="Courier New" w:hAnsi="Courier New"/>
+          <w:color w:val="123047"/>
+          <w:sz w:val="19"/>
+        </w:rPr>
+        <w:t>MAIL_SMTP_AUTH</w:t>
+      </w:r>
+      <w:r>
+        <w:t xml:space="preserve">, </w:t>
+      </w:r>
+      <w:r>
+        <w:rPr>
+          <w:rFonts w:ascii="Courier New" w:hAnsi="Courier New"/>
+          <w:color w:val="123047"/>
+          <w:sz w:val="19"/>
+        </w:rPr>
+        <w:t>MAIL_SMTP_STARTTLS</w:t>
+      </w:r>
+      <w:r>
+        <w:t xml:space="preserve">, and </w:t>
+      </w:r>
+      <w:r>
+        <w:rPr>
+          <w:rFonts w:ascii="Courier New" w:hAnsi="Courier New"/>
+          <w:color w:val="123047"/>
+          <w:sz w:val="19"/>
+        </w:rPr>
+        <w:t>PASSWORD_RESET_FRONTEND_BASE_URL</w:t>
+      </w:r>
+      <w:r>
+        <w:t xml:space="preserve"> remain in </w:t>
+      </w:r>
+      <w:r>
+        <w:rPr>
+          <w:rFonts w:ascii="Courier New" w:hAnsi="Courier New"/>
+          <w:color w:val="123047"/>
+          <w:sz w:val="19"/>
+        </w:rPr>
+        <w:t>.env</w:t>
+      </w:r>
+      <w:r>
+        <w:t xml:space="preserve"> and require a backend restart when changed.</w:t>
+      </w:r>
+    </w:p>
+    <w:p>
+      <w:pPr>
+        <w:pStyle w:val="ListBullet"/>
+      </w:pPr>
+      <w:r>
+        <w:t xml:space="preserve">Generate </w:t>
+      </w:r>
+      <w:r>
+        <w:rPr>
+          <w:rFonts w:ascii="Courier New" w:hAnsi="Courier New"/>
+          <w:color w:val="123047"/>
+          <w:sz w:val="19"/>
+        </w:rPr>
+        <w:t>CHURCH_SETTINGS_ENCRYPTION_KEY</w:t>
+      </w:r>
+      <w:r>
+        <w:t xml:space="preserve"> once as a Base64-encoded 32-byte key, keep it secret, and do not change or lose it.</w:t>
+      </w:r>
+    </w:p>
+    <w:p>
+      <w:pPr>
+        <w:pStyle w:val="ListBullet"/>
+      </w:pPr>
+      <w:r>
+        <w:t>The SMTP password is encrypted in MongoDB. A full backup includes that encrypted value but never includes the encryption key.</w:t>
+      </w:r>
+    </w:p>
+    <w:p>
+      <w:pPr>
+        <w:pStyle w:val="ListBullet"/>
+      </w:pPr>
+      <w:r>
+        <w:t xml:space="preserve">A server that restores the backup must use the same </w:t>
+      </w:r>
+      <w:r>
+        <w:rPr>
+          <w:rFonts w:ascii="Courier New" w:hAnsi="Courier New"/>
+          <w:color w:val="123047"/>
+          <w:sz w:val="19"/>
+        </w:rPr>
+        <w:t>CHURCH_SETTINGS_ENCRYPTION_KEY</w:t>
+      </w:r>
+      <w:r>
+        <w:t>, or the restored SMTP password cannot be decrypted.</w:t>
+      </w:r>
+    </w:p>
+    <w:p>
+      <w:pPr>
+        <w:pStyle w:val="ListBullet"/>
+      </w:pPr>
+      <w:r>
+        <w:t xml:space="preserve">Keep the </w:t>
+      </w:r>
+      <w:r>
+        <w:rPr>
+          <w:rFonts w:ascii="Courier New" w:hAnsi="Courier New"/>
+          <w:color w:val="123047"/>
+          <w:sz w:val="19"/>
+        </w:rPr>
+        <w:t>.env</w:t>
+      </w:r>
+      <w:r>
+        <w:t xml:space="preserve"> file and encryption key in a secure church-controlled password manager or secret store, separate from database backup files.</w:t>
+      </w:r>
+    </w:p>
+    <w:p>
       <w:pPr>
         <w:pStyle w:val="Heading1"/>
+        <w:pageBreakBefore/>
+      </w:pPr>
+      <w:r>
+        <w:t>Logout</w:t>
+      </w:r>
+    </w:p>
+    <w:p>
+      <w:r>
+        <w:rPr>
+          <w:b/>
+        </w:rPr>
+        <w:t>Available to:</w:t>
+      </w:r>
+      <w:r>
+        <w:t xml:space="preserve"> All signed-in users</w:t>
+      </w:r>
+    </w:p>
+    <w:p>
+      <w:pPr>
+        <w:pStyle w:val="ListNumber"/>
+        <w:numPr>
+          <w:ilvl w:val="0"/>
+          <w:numId w:val="36"/>
+        </w:numPr>
+      </w:pPr>
+      <w:r>
+        <w:t xml:space="preserve">Select </w:t>
+      </w:r>
+      <w:r>
+        <w:rPr>
+          <w:b/>
+        </w:rPr>
+        <w:t>Logout</w:t>
+      </w:r>
+      <w:r>
+        <w:t xml:space="preserve"> at the bottom of the left menu.</w:t>
+      </w:r>
+    </w:p>
+    <w:p>
+      <w:pPr>
+        <w:pStyle w:val="ListNumber"/>
+        <w:numPr>
+          <w:ilvl w:val="0"/>
+          <w:numId w:val="36"/>
+        </w:numPr>
+      </w:pPr>
+      <w:r>
+        <w:t>The current session is invalidated and the sign-in page opens.</w:t>
+      </w:r>
+    </w:p>
+    <w:p>
+      <w:pPr>
+        <w:pStyle w:val="ListNumber"/>
+        <w:numPr>
+          <w:ilvl w:val="0"/>
+          <w:numId w:val="36"/>
+        </w:numPr>
+      </w:pPr>
+      <w:r>
+        <w:t>Sign in again to begin a new session.</w:t>
+      </w:r>
+    </w:p>
+    <w:p>
+      <w:r>
+        <w:t>Do not leave Church Operations open on a shared or unattended computer.</w:t>
+      </w:r>
+    </w:p>
+    <w:p>
+      <w:pPr>
+        <w:pStyle w:val="Heading1"/>
+        <w:pageBreakBefore/>
       </w:pPr>
       <w:r>
         <w:t>Troubleshooting and Security Notes</w:t>
@@ -5449,6 +6006,30 @@
     </w:lvlOverride>
   </w:num>
   <w:num w:numId="32">
+    <w:abstractNumId w:val="7"/>
+    <w:lvlOverride w:ilvl="0">
+      <w:startOverride w:val="1"/>
+    </w:lvlOverride>
+  </w:num>
+  <w:num w:numId="33">
+    <w:abstractNumId w:val="7"/>
+    <w:lvlOverride w:ilvl="0">
+      <w:startOverride w:val="1"/>
+    </w:lvlOverride>
+  </w:num>
+  <w:num w:numId="34">
+    <w:abstractNumId w:val="7"/>
+    <w:lvlOverride w:ilvl="0">
+      <w:startOverride w:val="1"/>
+    </w:lvlOverride>
+  </w:num>
+  <w:num w:numId="35">
+    <w:abstractNumId w:val="7"/>
+    <w:lvlOverride w:ilvl="0">
+      <w:startOverride w:val="1"/>
+    </w:lvlOverride>
+  </w:num>
+  <w:num w:numId="36">
     <w:abstractNumId w:val="7"/>
     <w:lvlOverride w:ilvl="0">
       <w:startOverride w:val="1"/>

</xml_diff>

<commit_message>
docs: explain runtime operational settings
</commit_message>
<xml_diff>
--- a/docs/user-guide/Church Operations User Guide.docx
+++ b/docs/user-guide/Church Operations User Guide.docx
@@ -4952,7 +4952,16 @@
         </w:numPr>
       </w:pPr>
       <w:r>
-        <w:t>To replace the church logo or dashboard banner, select a PNG or JPEG image no larger than 5 MB. The preview shows the current image until a replacement is selected.</w:t>
+        <w:t xml:space="preserve">Under </w:t>
+      </w:r>
+      <w:r>
+        <w:rPr>
+          <w:b/>
+        </w:rPr>
+        <w:t>Operational Settings</w:t>
+      </w:r>
+      <w:r>
+        <w:t>, select the church time zone and the month when the fiscal year starts.</w:t>
       </w:r>
     </w:p>
     <w:p>
@@ -4964,6 +4973,39 @@
         </w:numPr>
       </w:pPr>
       <w:r>
+        <w:t xml:space="preserve">Set </w:t>
+      </w:r>
+      <w:r>
+        <w:rPr>
+          <w:b/>
+        </w:rPr>
+        <w:t>List page size</w:t>
+      </w:r>
+      <w:r>
+        <w:t xml:space="preserve"> from 5 through 100 and select how long a prepared data operation remains available.</w:t>
+      </w:r>
+    </w:p>
+    <w:p>
+      <w:pPr>
+        <w:pStyle w:val="ListNumber"/>
+        <w:numPr>
+          <w:ilvl w:val="0"/>
+          <w:numId w:val="32"/>
+        </w:numPr>
+      </w:pPr>
+      <w:r>
+        <w:t>To replace the church logo or dashboard banner, select a PNG or JPEG image no larger than 5 MB. The preview shows the current image until a replacement is selected.</w:t>
+      </w:r>
+    </w:p>
+    <w:p>
+      <w:pPr>
+        <w:pStyle w:val="ListNumber"/>
+        <w:numPr>
+          <w:ilvl w:val="0"/>
+          <w:numId w:val="32"/>
+        </w:numPr>
+      </w:pPr>
+      <w:r>
         <w:t xml:space="preserve">Select </w:t>
       </w:r>
       <w:r>
@@ -4977,8 +5019,69 @@
       </w:r>
     </w:p>
     <w:p>
-      <w:r>
-        <w:t>Saved changes appear immediately without signing in again. The church name and logo update in the left menu, and the banner and contact information update on the dashboard. New official tax receipt PDFs and quarterly and yearly financial workbooks use the saved church information and logo. Previously downloaded files and closed year-end report snapshots remain unchanged.</w:t>
+      <w:pPr>
+        <w:keepNext/>
+        <w:spacing w:before="100" w:after="60"/>
+        <w:jc w:val="center"/>
+      </w:pPr>
+      <w:r>
+        <w:drawing>
+          <wp:inline xmlns:a="http://schemas.openxmlformats.org/drawingml/2006/main" xmlns:pic="http://schemas.openxmlformats.org/drawingml/2006/picture">
+            <wp:extent cx="6172200" cy="3859085"/>
+            <wp:docPr id="14" name="Picture 14" descr="Church information, operational settings, and branding"/>
+            <wp:cNvGraphicFramePr>
+              <a:graphicFrameLocks noChangeAspect="1"/>
+            </wp:cNvGraphicFramePr>
+            <a:graphic>
+              <a:graphicData uri="http://schemas.openxmlformats.org/drawingml/2006/picture">
+                <pic:pic>
+                  <pic:nvPicPr>
+                    <pic:cNvPr id="0" name="13-church-settings.png"/>
+                    <pic:cNvPicPr/>
+                  </pic:nvPicPr>
+                  <pic:blipFill>
+                    <a:blip r:embed="rId24"/>
+                    <a:stretch>
+                      <a:fillRect/>
+                    </a:stretch>
+                  </pic:blipFill>
+                  <pic:spPr>
+                    <a:xfrm>
+                      <a:off x="0" y="0"/>
+                      <a:ext cx="6172200" cy="3859085"/>
+                    </a:xfrm>
+                    <a:prstGeom prst="rect"/>
+                  </pic:spPr>
+                </pic:pic>
+              </a:graphicData>
+            </a:graphic>
+          </wp:inline>
+        </w:drawing>
+      </w:r>
+    </w:p>
+    <w:p>
+      <w:pPr>
+        <w:spacing w:after="160"/>
+        <w:jc w:val="center"/>
+      </w:pPr>
+      <w:r>
+        <w:rPr>
+          <w:rFonts w:ascii="Aptos" w:hAnsi="Aptos"/>
+          <w:i/>
+          <w:color w:val="667085"/>
+          <w:sz w:val="17"/>
+        </w:rPr>
+        <w:t>Church information, operational settings, and branding</w:t>
+      </w:r>
+    </w:p>
+    <w:p>
+      <w:r>
+        <w:t>Saved changes appear immediately without signing in again or restarting the server. The church name and logo update in the left menu, and the banner and contact information update on the dashboard. Open lists return to page 1 and use the new page size. Dashboard totals, live reports, archive periods, and year-end closing eligibility use the selected time zone and fiscal-year start month.</w:t>
+      </w:r>
+    </w:p>
+    <w:p>
+      <w:r>
+        <w:t>New official tax receipt PDFs and quarterly and yearly financial workbooks use the saved church information and logo. Previously downloaded files, issued tax receipts, closed year-end report snapshots, and existing fiscal archives remain unchanged. A restore operation that was already prepared keeps its original expiry time; the new duration applies to the next prepared operation.</w:t>
       </w:r>
     </w:p>
     <w:p>
@@ -5054,7 +5157,7 @@
         </w:numPr>
       </w:pPr>
       <w:r>
-        <w:t>The database settings and uploaded branding are removed. The application immediately returns to the church information and bundled images configured by the server.</w:t>
+        <w:t>The database settings and uploaded branding are removed. The application immediately returns to the church information, operational values, and bundled images configured by the server.</w:t>
       </w:r>
     </w:p>
     <w:p>

</xml_diff>

<commit_message>
Final version user guide
</commit_message>
<xml_diff>
--- a/docs/user-guide/Church Operations User Guide.docx
+++ b/docs/user-guide/Church Operations User Guide.docx
@@ -2,46 +2,6 @@
 <file path=word/document.xml><?xml version="1.0" encoding="utf-8"?>
 <w:document xmlns:wpc="http://schemas.microsoft.com/office/word/2010/wordprocessingCanvas" xmlns:mo="http://schemas.microsoft.com/office/mac/office/2008/main" xmlns:mc="http://schemas.openxmlformats.org/markup-compatibility/2006" xmlns:mv="urn:schemas-microsoft-com:mac:vml" xmlns:o="urn:schemas-microsoft-com:office:office" xmlns:r="http://schemas.openxmlformats.org/officeDocument/2006/relationships" xmlns:m="http://schemas.openxmlformats.org/officeDocument/2006/math" xmlns:v="urn:schemas-microsoft-com:vml" xmlns:wp14="http://schemas.microsoft.com/office/word/2010/wordprocessingDrawing" xmlns:wp="http://schemas.openxmlformats.org/drawingml/2006/wordprocessingDrawing" xmlns:w10="urn:schemas-microsoft-com:office:word" xmlns:w="http://schemas.openxmlformats.org/wordprocessingml/2006/main" xmlns:w14="http://schemas.microsoft.com/office/word/2010/wordml" xmlns:wpg="http://schemas.microsoft.com/office/word/2010/wordprocessingGroup" xmlns:wpi="http://schemas.microsoft.com/office/word/2010/wordprocessingInk" xmlns:wne="http://schemas.microsoft.com/office/word/2006/wordml" xmlns:wps="http://schemas.microsoft.com/office/word/2010/wordprocessingShape" mc:Ignorable="w14 wp14">
   <w:body>
-    <w:p>
-      <w:pPr>
-        <w:spacing w:after="440"/>
-        <w:jc w:val="center"/>
-      </w:pPr>
-      <w:r>
-        <w:drawing>
-          <wp:inline xmlns:a="http://schemas.openxmlformats.org/drawingml/2006/main" xmlns:pic="http://schemas.openxmlformats.org/drawingml/2006/picture">
-            <wp:extent cx="1965960" cy="667128"/>
-            <wp:docPr id="1" name="Picture 1" descr="Capstone Presbyterian Church logo"/>
-            <wp:cNvGraphicFramePr>
-              <a:graphicFrameLocks noChangeAspect="1"/>
-            </wp:cNvGraphicFramePr>
-            <a:graphic>
-              <a:graphicData uri="http://schemas.openxmlformats.org/drawingml/2006/picture">
-                <pic:pic>
-                  <pic:nvPicPr>
-                    <pic:cNvPr id="0" name="church_logo.png"/>
-                    <pic:cNvPicPr/>
-                  </pic:nvPicPr>
-                  <pic:blipFill>
-                    <a:blip r:embed="rId11"/>
-                    <a:stretch>
-                      <a:fillRect/>
-                    </a:stretch>
-                  </pic:blipFill>
-                  <pic:spPr>
-                    <a:xfrm>
-                      <a:off x="0" y="0"/>
-                      <a:ext cx="1965960" cy="667128"/>
-                    </a:xfrm>
-                    <a:prstGeom prst="rect"/>
-                  </pic:spPr>
-                </pic:pic>
-              </a:graphicData>
-            </a:graphic>
-          </wp:inline>
-        </w:drawing>
-      </w:r>
-    </w:p>
     <w:p>
       <w:pPr>
         <w:spacing w:after="160"/>
@@ -1458,8 +1418,8 @@
       <w:r>
         <w:drawing>
           <wp:inline xmlns:a="http://schemas.openxmlformats.org/drawingml/2006/main" xmlns:pic="http://schemas.openxmlformats.org/drawingml/2006/picture">
-            <wp:extent cx="4389120" cy="2470398"/>
-            <wp:docPr id="2" name="Picture 2" descr="Sign-in page"/>
+            <wp:extent cx="4389120" cy="2470228"/>
+            <wp:docPr id="1" name="Picture 1" descr="Sign-in page"/>
             <wp:cNvGraphicFramePr>
               <a:graphicFrameLocks noChangeAspect="1"/>
             </wp:cNvGraphicFramePr>
@@ -1471,7 +1431,7 @@
                     <pic:cNvPicPr/>
                   </pic:nvPicPr>
                   <pic:blipFill>
-                    <a:blip r:embed="rId12"/>
+                    <a:blip r:embed="rId11"/>
                     <a:stretch>
                       <a:fillRect/>
                     </a:stretch>
@@ -1479,7 +1439,7 @@
                   <pic:spPr>
                     <a:xfrm>
                       <a:off x="0" y="0"/>
-                      <a:ext cx="4389120" cy="2470398"/>
+                      <a:ext cx="4389120" cy="2470228"/>
                     </a:xfrm>
                     <a:prstGeom prst="rect"/>
                   </pic:spPr>
@@ -1639,7 +1599,7 @@
         <w:drawing>
           <wp:inline xmlns:a="http://schemas.openxmlformats.org/drawingml/2006/main" xmlns:pic="http://schemas.openxmlformats.org/drawingml/2006/picture">
             <wp:extent cx="4389120" cy="2470398"/>
-            <wp:docPr id="3" name="Picture 3" descr="Required first-login password change"/>
+            <wp:docPr id="2" name="Picture 2" descr="Required first-login password change"/>
             <wp:cNvGraphicFramePr>
               <a:graphicFrameLocks noChangeAspect="1"/>
             </wp:cNvGraphicFramePr>
@@ -1651,7 +1611,7 @@
                     <pic:cNvPicPr/>
                   </pic:nvPicPr>
                   <pic:blipFill>
-                    <a:blip r:embed="rId13"/>
+                    <a:blip r:embed="rId12"/>
                     <a:stretch>
                       <a:fillRect/>
                     </a:stretch>
@@ -2113,8 +2073,8 @@
       <w:r>
         <w:drawing>
           <wp:inline xmlns:a="http://schemas.openxmlformats.org/drawingml/2006/main" xmlns:pic="http://schemas.openxmlformats.org/drawingml/2006/picture">
-            <wp:extent cx="4389120" cy="2470398"/>
-            <wp:docPr id="4" name="Picture 4" descr="Request a password reset link"/>
+            <wp:extent cx="4389120" cy="3049283"/>
+            <wp:docPr id="3" name="Picture 3" descr="Request a password reset link"/>
             <wp:cNvGraphicFramePr>
               <a:graphicFrameLocks noChangeAspect="1"/>
             </wp:cNvGraphicFramePr>
@@ -2126,7 +2086,7 @@
                     <pic:cNvPicPr/>
                   </pic:nvPicPr>
                   <pic:blipFill>
-                    <a:blip r:embed="rId14"/>
+                    <a:blip r:embed="rId13"/>
                     <a:stretch>
                       <a:fillRect/>
                     </a:stretch>
@@ -2134,7 +2094,7 @@
                   <pic:spPr>
                     <a:xfrm>
                       <a:off x="0" y="0"/>
-                      <a:ext cx="4389120" cy="2470398"/>
+                      <a:ext cx="4389120" cy="3049283"/>
                     </a:xfrm>
                     <a:prstGeom prst="rect"/>
                   </pic:spPr>
@@ -2169,8 +2129,8 @@
       <w:r>
         <w:drawing>
           <wp:inline xmlns:a="http://schemas.openxmlformats.org/drawingml/2006/main" xmlns:pic="http://schemas.openxmlformats.org/drawingml/2006/picture">
-            <wp:extent cx="4389120" cy="2470398"/>
-            <wp:docPr id="5" name="Picture 5" descr="Set a new password from the emailed link"/>
+            <wp:extent cx="4389120" cy="3049283"/>
+            <wp:docPr id="4" name="Picture 4" descr="Set a new password from the emailed link"/>
             <wp:cNvGraphicFramePr>
               <a:graphicFrameLocks noChangeAspect="1"/>
             </wp:cNvGraphicFramePr>
@@ -2182,7 +2142,7 @@
                     <pic:cNvPicPr/>
                   </pic:nvPicPr>
                   <pic:blipFill>
-                    <a:blip r:embed="rId15"/>
+                    <a:blip r:embed="rId14"/>
                     <a:stretch>
                       <a:fillRect/>
                     </a:stretch>
@@ -2190,7 +2150,7 @@
                   <pic:spPr>
                     <a:xfrm>
                       <a:off x="0" y="0"/>
-                      <a:ext cx="4389120" cy="2470398"/>
+                      <a:ext cx="4389120" cy="3049283"/>
                     </a:xfrm>
                     <a:prstGeom prst="rect"/>
                   </pic:spPr>
@@ -2353,7 +2313,7 @@
         <w:drawing>
           <wp:inline xmlns:a="http://schemas.openxmlformats.org/drawingml/2006/main" xmlns:pic="http://schemas.openxmlformats.org/drawingml/2006/picture">
             <wp:extent cx="6172200" cy="4286250"/>
-            <wp:docPr id="6" name="Picture 6" descr="Dashboard overview"/>
+            <wp:docPr id="5" name="Picture 5" descr="Dashboard overview"/>
             <wp:cNvGraphicFramePr>
               <a:graphicFrameLocks noChangeAspect="1"/>
             </wp:cNvGraphicFramePr>
@@ -2365,7 +2325,7 @@
                     <pic:cNvPicPr/>
                   </pic:nvPicPr>
                   <pic:blipFill>
-                    <a:blip r:embed="rId16"/>
+                    <a:blip r:embed="rId15"/>
                     <a:stretch>
                       <a:fillRect/>
                     </a:stretch>
@@ -2810,7 +2770,7 @@
         <w:drawing>
           <wp:inline xmlns:a="http://schemas.openxmlformats.org/drawingml/2006/main" xmlns:pic="http://schemas.openxmlformats.org/drawingml/2006/picture">
             <wp:extent cx="6172200" cy="4288055"/>
-            <wp:docPr id="7" name="Picture 7" descr="Member search and registration screen"/>
+            <wp:docPr id="6" name="Picture 6" descr="Member search and registration screen"/>
             <wp:cNvGraphicFramePr>
               <a:graphicFrameLocks noChangeAspect="1"/>
             </wp:cNvGraphicFramePr>
@@ -2822,7 +2782,7 @@
                     <pic:cNvPicPr/>
                   </pic:nvPicPr>
                   <pic:blipFill>
-                    <a:blip r:embed="rId17"/>
+                    <a:blip r:embed="rId16"/>
                     <a:stretch>
                       <a:fillRect/>
                     </a:stretch>
@@ -3290,8 +3250,8 @@
       <w:r>
         <w:drawing>
           <wp:inline xmlns:a="http://schemas.openxmlformats.org/drawingml/2006/main" xmlns:pic="http://schemas.openxmlformats.org/drawingml/2006/picture">
-            <wp:extent cx="6172200" cy="4288055"/>
-            <wp:docPr id="8" name="Picture 8" descr="Offering list and entry form"/>
+            <wp:extent cx="6172200" cy="4286250"/>
+            <wp:docPr id="7" name="Picture 7" descr="Offering list and entry form"/>
             <wp:cNvGraphicFramePr>
               <a:graphicFrameLocks noChangeAspect="1"/>
             </wp:cNvGraphicFramePr>
@@ -3300,6 +3260,366 @@
                 <pic:pic>
                   <pic:nvPicPr>
                     <pic:cNvPr id="0" name="06-offerings.png"/>
+                    <pic:cNvPicPr/>
+                  </pic:nvPicPr>
+                  <pic:blipFill>
+                    <a:blip r:embed="rId17"/>
+                    <a:stretch>
+                      <a:fillRect/>
+                    </a:stretch>
+                  </pic:blipFill>
+                  <pic:spPr>
+                    <a:xfrm>
+                      <a:off x="0" y="0"/>
+                      <a:ext cx="6172200" cy="4286250"/>
+                    </a:xfrm>
+                    <a:prstGeom prst="rect"/>
+                  </pic:spPr>
+                </pic:pic>
+              </a:graphicData>
+            </a:graphic>
+          </wp:inline>
+        </w:drawing>
+      </w:r>
+    </w:p>
+    <w:p>
+      <w:pPr>
+        <w:spacing w:after="160"/>
+        <w:jc w:val="center"/>
+      </w:pPr>
+      <w:r>
+        <w:rPr>
+          <w:rFonts w:ascii="Aptos" w:hAnsi="Aptos"/>
+          <w:i/>
+          <w:color w:val="667085"/>
+          <w:sz w:val="17"/>
+        </w:rPr>
+        <w:t>Offering list and entry form</w:t>
+      </w:r>
+    </w:p>
+    <w:p>
+      <w:pPr>
+        <w:pStyle w:val="Heading1"/>
+        <w:pageBreakBefore/>
+      </w:pPr>
+      <w:r>
+        <w:t>Financial Management</w:t>
+      </w:r>
+    </w:p>
+    <w:p>
+      <w:r>
+        <w:rPr>
+          <w:b/>
+        </w:rPr>
+        <w:t>Available to:</w:t>
+      </w:r>
+      <w:r>
+        <w:t xml:space="preserve"> Admin, Treasurer</w:t>
+      </w:r>
+    </w:p>
+    <w:p>
+      <w:pPr>
+        <w:pStyle w:val="Heading2"/>
+      </w:pPr>
+      <w:r>
+        <w:t>Review financial activity</w:t>
+      </w:r>
+    </w:p>
+    <w:p>
+      <w:pPr>
+        <w:pStyle w:val="ListNumber"/>
+        <w:numPr>
+          <w:ilvl w:val="0"/>
+          <w:numId w:val="20"/>
+        </w:numPr>
+      </w:pPr>
+      <w:r>
+        <w:t xml:space="preserve">Select </w:t>
+      </w:r>
+      <w:r>
+        <w:rPr>
+          <w:b/>
+        </w:rPr>
+        <w:t>Finance</w:t>
+      </w:r>
+      <w:r>
+        <w:t>.</w:t>
+      </w:r>
+    </w:p>
+    <w:p>
+      <w:pPr>
+        <w:pStyle w:val="ListNumber"/>
+        <w:numPr>
+          <w:ilvl w:val="0"/>
+          <w:numId w:val="20"/>
+        </w:numPr>
+      </w:pPr>
+      <w:r>
+        <w:t xml:space="preserve">Filter by category and by </w:t>
+      </w:r>
+      <w:r>
+        <w:rPr>
+          <w:b/>
+        </w:rPr>
+        <w:t>Income</w:t>
+      </w:r>
+      <w:r>
+        <w:t xml:space="preserve">, </w:t>
+      </w:r>
+      <w:r>
+        <w:rPr>
+          <w:b/>
+        </w:rPr>
+        <w:t>Expense</w:t>
+      </w:r>
+      <w:r>
+        <w:t>, or both.</w:t>
+      </w:r>
+    </w:p>
+    <w:p>
+      <w:pPr>
+        <w:pStyle w:val="ListNumber"/>
+        <w:numPr>
+          <w:ilvl w:val="0"/>
+          <w:numId w:val="20"/>
+        </w:numPr>
+      </w:pPr>
+      <w:r>
+        <w:t xml:space="preserve">Select </w:t>
+      </w:r>
+      <w:r>
+        <w:rPr>
+          <w:b/>
+        </w:rPr>
+        <w:t>Refresh</w:t>
+      </w:r>
+      <w:r>
+        <w:t>.</w:t>
+      </w:r>
+    </w:p>
+    <w:p>
+      <w:pPr>
+        <w:pStyle w:val="ListNumber"/>
+        <w:numPr>
+          <w:ilvl w:val="0"/>
+          <w:numId w:val="20"/>
+        </w:numPr>
+      </w:pPr>
+      <w:r>
+        <w:t>Review net, income, and expense totals above the table.</w:t>
+      </w:r>
+    </w:p>
+    <w:p>
+      <w:r>
+        <w:t>Offering income is shown as daily category summaries and is read-only in Finance. Manual expenses can be maintained here.</w:t>
+      </w:r>
+    </w:p>
+    <w:p>
+      <w:pPr>
+        <w:pStyle w:val="Heading2"/>
+      </w:pPr>
+      <w:r>
+        <w:t>Record an expense</w:t>
+      </w:r>
+    </w:p>
+    <w:p>
+      <w:pPr>
+        <w:pStyle w:val="ListNumber"/>
+        <w:numPr>
+          <w:ilvl w:val="0"/>
+          <w:numId w:val="21"/>
+        </w:numPr>
+      </w:pPr>
+      <w:r>
+        <w:t xml:space="preserve">Select </w:t>
+      </w:r>
+      <w:r>
+        <w:rPr>
+          <w:b/>
+        </w:rPr>
+        <w:t>Add expense</w:t>
+      </w:r>
+      <w:r>
+        <w:t>.</w:t>
+      </w:r>
+    </w:p>
+    <w:p>
+      <w:pPr>
+        <w:pStyle w:val="ListNumber"/>
+        <w:numPr>
+          <w:ilvl w:val="0"/>
+          <w:numId w:val="21"/>
+        </w:numPr>
+      </w:pPr>
+      <w:r>
+        <w:t>Enter transaction date and amount.</w:t>
+      </w:r>
+    </w:p>
+    <w:p>
+      <w:pPr>
+        <w:pStyle w:val="ListNumber"/>
+        <w:numPr>
+          <w:ilvl w:val="0"/>
+          <w:numId w:val="21"/>
+        </w:numPr>
+      </w:pPr>
+      <w:r>
+        <w:t xml:space="preserve">Choose a category. The </w:t>
+      </w:r>
+      <w:r>
+        <w:rPr>
+          <w:b/>
+        </w:rPr>
+        <w:t>Sub-category</w:t>
+      </w:r>
+      <w:r>
+        <w:t xml:space="preserve"> list is filtered by the selected category.</w:t>
+      </w:r>
+    </w:p>
+    <w:p>
+      <w:pPr>
+        <w:pStyle w:val="ListNumber"/>
+        <w:numPr>
+          <w:ilvl w:val="0"/>
+          <w:numId w:val="21"/>
+        </w:numPr>
+      </w:pPr>
+      <w:r>
+        <w:t xml:space="preserve">Set </w:t>
+      </w:r>
+      <w:r>
+        <w:rPr>
+          <w:b/>
+        </w:rPr>
+        <w:t>HST included</w:t>
+      </w:r>
+      <w:r>
+        <w:t xml:space="preserve"> and </w:t>
+      </w:r>
+      <w:r>
+        <w:rPr>
+          <w:b/>
+        </w:rPr>
+        <w:t>Cheque cleared</w:t>
+      </w:r>
+      <w:r>
+        <w:t xml:space="preserve"> when applicable.</w:t>
+      </w:r>
+    </w:p>
+    <w:p>
+      <w:pPr>
+        <w:pStyle w:val="ListNumber"/>
+        <w:numPr>
+          <w:ilvl w:val="0"/>
+          <w:numId w:val="21"/>
+        </w:numPr>
+      </w:pPr>
+      <w:r>
+        <w:t>Enter cheque number, payable party, approving treasurer, and memo as available.</w:t>
+      </w:r>
+    </w:p>
+    <w:p>
+      <w:pPr>
+        <w:pStyle w:val="ListNumber"/>
+        <w:numPr>
+          <w:ilvl w:val="0"/>
+          <w:numId w:val="21"/>
+        </w:numPr>
+      </w:pPr>
+      <w:r>
+        <w:t xml:space="preserve">Select </w:t>
+      </w:r>
+      <w:r>
+        <w:rPr>
+          <w:b/>
+        </w:rPr>
+        <w:t>Save expense</w:t>
+      </w:r>
+      <w:r>
+        <w:t>.</w:t>
+      </w:r>
+    </w:p>
+    <w:p>
+      <w:pPr>
+        <w:pStyle w:val="Heading2"/>
+      </w:pPr>
+      <w:r>
+        <w:t>Edit or delete an expense</w:t>
+      </w:r>
+    </w:p>
+    <w:p>
+      <w:pPr>
+        <w:pStyle w:val="ListNumber"/>
+        <w:numPr>
+          <w:ilvl w:val="0"/>
+          <w:numId w:val="22"/>
+        </w:numPr>
+      </w:pPr>
+      <w:r>
+        <w:t>Select a manual expense row.</w:t>
+      </w:r>
+    </w:p>
+    <w:p>
+      <w:pPr>
+        <w:pStyle w:val="ListNumber"/>
+        <w:numPr>
+          <w:ilvl w:val="0"/>
+          <w:numId w:val="22"/>
+        </w:numPr>
+      </w:pPr>
+      <w:r>
+        <w:t xml:space="preserve">Update it and select </w:t>
+      </w:r>
+      <w:r>
+        <w:rPr>
+          <w:b/>
+        </w:rPr>
+        <w:t>Save changes</w:t>
+      </w:r>
+      <w:r>
+        <w:t xml:space="preserve">, or select </w:t>
+      </w:r>
+      <w:r>
+        <w:rPr>
+          <w:b/>
+        </w:rPr>
+        <w:t>Cancel</w:t>
+      </w:r>
+      <w:r>
+        <w:t>.</w:t>
+      </w:r>
+    </w:p>
+    <w:p>
+      <w:pPr>
+        <w:pStyle w:val="ListNumber"/>
+        <w:numPr>
+          <w:ilvl w:val="0"/>
+          <w:numId w:val="22"/>
+        </w:numPr>
+      </w:pPr>
+      <w:r>
+        <w:t>Use the row's trash-bin icon to delete a manual expense after confirmation.</w:t>
+      </w:r>
+    </w:p>
+    <w:p>
+      <w:pPr>
+        <w:keepNext/>
+        <w:spacing w:before="100" w:after="60"/>
+        <w:jc w:val="center"/>
+      </w:pPr>
+      <w:r>
+        <w:drawing>
+          <wp:inline xmlns:a="http://schemas.openxmlformats.org/drawingml/2006/main" xmlns:pic="http://schemas.openxmlformats.org/drawingml/2006/picture">
+            <wp:extent cx="6172200" cy="4288055"/>
+            <wp:docPr id="8" name="Picture 8" descr="Financial activity and expense form"/>
+            <wp:cNvGraphicFramePr>
+              <a:graphicFrameLocks noChangeAspect="1"/>
+            </wp:cNvGraphicFramePr>
+            <a:graphic>
+              <a:graphicData uri="http://schemas.openxmlformats.org/drawingml/2006/picture">
+                <pic:pic>
+                  <pic:nvPicPr>
+                    <pic:cNvPr id="0" name="07-finance.png"/>
                     <pic:cNvPicPr/>
                   </pic:nvPicPr>
                   <pic:blipFill>
@@ -3334,7 +3654,7 @@
           <w:color w:val="667085"/>
           <w:sz w:val="17"/>
         </w:rPr>
-        <w:t>Offering list and entry form</w:t>
+        <w:t>Financial activity and expense form</w:t>
       </w:r>
     </w:p>
     <w:p>
@@ -3343,7 +3663,7 @@
         <w:pageBreakBefore/>
       </w:pPr>
       <w:r>
-        <w:t>Financial Management</w:t>
+        <w:t>Budget Management</w:t>
       </w:r>
     </w:p>
     <w:p>
@@ -3358,11 +3678,16 @@
       </w:r>
     </w:p>
     <w:p>
+      <w:r>
+        <w:t>Budgets are prepared by fiscal year for offering income by fund/category and for expenses by category and sub-category.</w:t>
+      </w:r>
+    </w:p>
+    <w:p>
       <w:pPr>
         <w:pStyle w:val="Heading2"/>
       </w:pPr>
       <w:r>
-        <w:t>Review financial activity</w:t>
+        <w:t>Review budgets</w:t>
       </w:r>
     </w:p>
     <w:p>
@@ -3370,7 +3695,7 @@
         <w:pStyle w:val="ListNumber"/>
         <w:numPr>
           <w:ilvl w:val="0"/>
-          <w:numId w:val="20"/>
+          <w:numId w:val="23"/>
         </w:numPr>
       </w:pPr>
       <w:r>
@@ -3380,7 +3705,7 @@
         <w:rPr>
           <w:b/>
         </w:rPr>
-        <w:t>Finance</w:t>
+        <w:t>Budgets</w:t>
       </w:r>
       <w:r>
         <w:t>.</w:t>
@@ -3391,20 +3716,82 @@
         <w:pStyle w:val="ListNumber"/>
         <w:numPr>
           <w:ilvl w:val="0"/>
-          <w:numId w:val="20"/>
+          <w:numId w:val="23"/>
         </w:numPr>
       </w:pPr>
       <w:r>
-        <w:t xml:space="preserve">Filter by category and by </w:t>
+        <w:t>Enter the fiscal year and optionally choose a budget type.</w:t>
+      </w:r>
+    </w:p>
+    <w:p>
+      <w:pPr>
+        <w:pStyle w:val="ListNumber"/>
+        <w:numPr>
+          <w:ilvl w:val="0"/>
+          <w:numId w:val="23"/>
+        </w:numPr>
+      </w:pPr>
+      <w:r>
+        <w:t xml:space="preserve">Select </w:t>
       </w:r>
       <w:r>
         <w:rPr>
           <w:b/>
         </w:rPr>
-        <w:t>Income</w:t>
-      </w:r>
-      <w:r>
-        <w:t xml:space="preserve">, </w:t>
+        <w:t>Refresh</w:t>
+      </w:r>
+      <w:r>
+        <w:t>.</w:t>
+      </w:r>
+    </w:p>
+    <w:p>
+      <w:pPr>
+        <w:pStyle w:val="Heading2"/>
+      </w:pPr>
+      <w:r>
+        <w:t>Add or update a budget</w:t>
+      </w:r>
+    </w:p>
+    <w:p>
+      <w:pPr>
+        <w:pStyle w:val="ListNumber"/>
+        <w:numPr>
+          <w:ilvl w:val="0"/>
+          <w:numId w:val="24"/>
+        </w:numPr>
+      </w:pPr>
+      <w:r>
+        <w:t xml:space="preserve">Select </w:t>
+      </w:r>
+      <w:r>
+        <w:rPr>
+          <w:b/>
+        </w:rPr>
+        <w:t>Add budget</w:t>
+      </w:r>
+      <w:r>
+        <w:t>.</w:t>
+      </w:r>
+    </w:p>
+    <w:p>
+      <w:pPr>
+        <w:pStyle w:val="ListNumber"/>
+        <w:numPr>
+          <w:ilvl w:val="0"/>
+          <w:numId w:val="24"/>
+        </w:numPr>
+      </w:pPr>
+      <w:r>
+        <w:t xml:space="preserve">Choose </w:t>
+      </w:r>
+      <w:r>
+        <w:rPr>
+          <w:b/>
+        </w:rPr>
+        <w:t>Offering income</w:t>
+      </w:r>
+      <w:r>
+        <w:t xml:space="preserve"> or </w:t>
       </w:r>
       <w:r>
         <w:rPr>
@@ -3413,7 +3800,7 @@
         <w:t>Expense</w:t>
       </w:r>
       <w:r>
-        <w:t>, or both.</w:t>
+        <w:t>.</w:t>
       </w:r>
     </w:p>
     <w:p>
@@ -3421,20 +3808,20 @@
         <w:pStyle w:val="ListNumber"/>
         <w:numPr>
           <w:ilvl w:val="0"/>
-          <w:numId w:val="20"/>
+          <w:numId w:val="24"/>
         </w:numPr>
       </w:pPr>
       <w:r>
-        <w:t xml:space="preserve">Select </w:t>
+        <w:t xml:space="preserve">Enter the fiscal year and </w:t>
       </w:r>
       <w:r>
         <w:rPr>
           <w:b/>
         </w:rPr>
-        <w:t>Refresh</w:t>
-      </w:r>
-      <w:r>
-        <w:t>.</w:t>
+        <w:t>Budget</w:t>
+      </w:r>
+      <w:r>
+        <w:t xml:space="preserve"> amount.</w:t>
       </w:r>
     </w:p>
     <w:p>
@@ -3442,24 +3829,11 @@
         <w:pStyle w:val="ListNumber"/>
         <w:numPr>
           <w:ilvl w:val="0"/>
-          <w:numId w:val="20"/>
+          <w:numId w:val="24"/>
         </w:numPr>
       </w:pPr>
       <w:r>
-        <w:t>Review net, income, and expense totals above the table.</w:t>
-      </w:r>
-    </w:p>
-    <w:p>
-      <w:r>
-        <w:t>Offering income is shown as daily category summaries and is read-only in Finance. Manual expenses can be maintained here.</w:t>
-      </w:r>
-    </w:p>
-    <w:p>
-      <w:pPr>
-        <w:pStyle w:val="Heading2"/>
-      </w:pPr>
-      <w:r>
-        <w:t>Record an expense</w:t>
+        <w:t>Choose the category and, for expenses, the applicable sub-category.</w:t>
       </w:r>
     </w:p>
     <w:p>
@@ -3467,17 +3841,17 @@
         <w:pStyle w:val="ListNumber"/>
         <w:numPr>
           <w:ilvl w:val="0"/>
-          <w:numId w:val="21"/>
+          <w:numId w:val="24"/>
         </w:numPr>
       </w:pPr>
       <w:r>
-        <w:t xml:space="preserve">Select </w:t>
+        <w:t xml:space="preserve">Add an optional memo and select </w:t>
       </w:r>
       <w:r>
         <w:rPr>
           <w:b/>
         </w:rPr>
-        <w:t>Add expense</w:t>
+        <w:t>Save budget</w:t>
       </w:r>
       <w:r>
         <w:t>.</w:t>
@@ -3488,127 +3862,11 @@
         <w:pStyle w:val="ListNumber"/>
         <w:numPr>
           <w:ilvl w:val="0"/>
-          <w:numId w:val="21"/>
+          <w:numId w:val="24"/>
         </w:numPr>
       </w:pPr>
       <w:r>
-        <w:t>Enter transaction date and amount.</w:t>
-      </w:r>
-    </w:p>
-    <w:p>
-      <w:pPr>
-        <w:pStyle w:val="ListNumber"/>
-        <w:numPr>
-          <w:ilvl w:val="0"/>
-          <w:numId w:val="21"/>
-        </w:numPr>
-      </w:pPr>
-      <w:r>
-        <w:t xml:space="preserve">Choose a category. The </w:t>
-      </w:r>
-      <w:r>
-        <w:rPr>
-          <w:b/>
-        </w:rPr>
-        <w:t>Sub-category</w:t>
-      </w:r>
-      <w:r>
-        <w:t xml:space="preserve"> list is filtered by the selected category.</w:t>
-      </w:r>
-    </w:p>
-    <w:p>
-      <w:pPr>
-        <w:pStyle w:val="ListNumber"/>
-        <w:numPr>
-          <w:ilvl w:val="0"/>
-          <w:numId w:val="21"/>
-        </w:numPr>
-      </w:pPr>
-      <w:r>
-        <w:t xml:space="preserve">Set </w:t>
-      </w:r>
-      <w:r>
-        <w:rPr>
-          <w:b/>
-        </w:rPr>
-        <w:t>HST included</w:t>
-      </w:r>
-      <w:r>
-        <w:t xml:space="preserve"> and </w:t>
-      </w:r>
-      <w:r>
-        <w:rPr>
-          <w:b/>
-        </w:rPr>
-        <w:t>Cheque cleared</w:t>
-      </w:r>
-      <w:r>
-        <w:t xml:space="preserve"> when applicable.</w:t>
-      </w:r>
-    </w:p>
-    <w:p>
-      <w:pPr>
-        <w:pStyle w:val="ListNumber"/>
-        <w:numPr>
-          <w:ilvl w:val="0"/>
-          <w:numId w:val="21"/>
-        </w:numPr>
-      </w:pPr>
-      <w:r>
-        <w:t>Enter cheque number, payable party, approving treasurer, and memo as available.</w:t>
-      </w:r>
-    </w:p>
-    <w:p>
-      <w:pPr>
-        <w:pStyle w:val="ListNumber"/>
-        <w:numPr>
-          <w:ilvl w:val="0"/>
-          <w:numId w:val="21"/>
-        </w:numPr>
-      </w:pPr>
-      <w:r>
-        <w:t xml:space="preserve">Select </w:t>
-      </w:r>
-      <w:r>
-        <w:rPr>
-          <w:b/>
-        </w:rPr>
-        <w:t>Save expense</w:t>
-      </w:r>
-      <w:r>
-        <w:t>.</w:t>
-      </w:r>
-    </w:p>
-    <w:p>
-      <w:pPr>
-        <w:pStyle w:val="Heading2"/>
-      </w:pPr>
-      <w:r>
-        <w:t>Edit or delete an expense</w:t>
-      </w:r>
-    </w:p>
-    <w:p>
-      <w:pPr>
-        <w:pStyle w:val="ListNumber"/>
-        <w:numPr>
-          <w:ilvl w:val="0"/>
-          <w:numId w:val="22"/>
-        </w:numPr>
-      </w:pPr>
-      <w:r>
-        <w:t>Select a manual expense row.</w:t>
-      </w:r>
-    </w:p>
-    <w:p>
-      <w:pPr>
-        <w:pStyle w:val="ListNumber"/>
-        <w:numPr>
-          <w:ilvl w:val="0"/>
-          <w:numId w:val="22"/>
-        </w:numPr>
-      </w:pPr>
-      <w:r>
-        <w:t xml:space="preserve">Update it and select </w:t>
+        <w:t xml:space="preserve">To edit, select an existing row, update the details, and select </w:t>
       </w:r>
       <w:r>
         <w:rPr>
@@ -3617,28 +3875,7 @@
         <w:t>Save changes</w:t>
       </w:r>
       <w:r>
-        <w:t xml:space="preserve">, or select </w:t>
-      </w:r>
-      <w:r>
-        <w:rPr>
-          <w:b/>
-        </w:rPr>
-        <w:t>Cancel</w:t>
-      </w:r>
-      <w:r>
         <w:t>.</w:t>
-      </w:r>
-    </w:p>
-    <w:p>
-      <w:pPr>
-        <w:pStyle w:val="ListNumber"/>
-        <w:numPr>
-          <w:ilvl w:val="0"/>
-          <w:numId w:val="22"/>
-        </w:numPr>
-      </w:pPr>
-      <w:r>
-        <w:t>Use the row's trash-bin icon to delete a manual expense after confirmation.</w:t>
       </w:r>
     </w:p>
     <w:p>
@@ -3650,8 +3887,8 @@
       <w:r>
         <w:drawing>
           <wp:inline xmlns:a="http://schemas.openxmlformats.org/drawingml/2006/main" xmlns:pic="http://schemas.openxmlformats.org/drawingml/2006/picture">
-            <wp:extent cx="6172200" cy="4288055"/>
-            <wp:docPr id="9" name="Picture 9" descr="Financial activity and expense form"/>
+            <wp:extent cx="6172200" cy="4286250"/>
+            <wp:docPr id="9" name="Picture 9" descr="Fiscal-year budget list and entry form"/>
             <wp:cNvGraphicFramePr>
               <a:graphicFrameLocks noChangeAspect="1"/>
             </wp:cNvGraphicFramePr>
@@ -3659,7 +3896,7 @@
               <a:graphicData uri="http://schemas.openxmlformats.org/drawingml/2006/picture">
                 <pic:pic>
                   <pic:nvPicPr>
-                    <pic:cNvPr id="0" name="07-finance.png"/>
+                    <pic:cNvPr id="0" name="08-budgets.png"/>
                     <pic:cNvPicPr/>
                   </pic:nvPicPr>
                   <pic:blipFill>
@@ -3671,7 +3908,7 @@
                   <pic:spPr>
                     <a:xfrm>
                       <a:off x="0" y="0"/>
-                      <a:ext cx="6172200" cy="4288055"/>
+                      <a:ext cx="6172200" cy="4286250"/>
                     </a:xfrm>
                     <a:prstGeom prst="rect"/>
                   </pic:spPr>
@@ -3694,7 +3931,7 @@
           <w:color w:val="667085"/>
           <w:sz w:val="17"/>
         </w:rPr>
-        <w:t>Financial activity and expense form</w:t>
+        <w:t>Fiscal-year budget list and entry form</w:t>
       </w:r>
     </w:p>
     <w:p>
@@ -3703,7 +3940,7 @@
         <w:pageBreakBefore/>
       </w:pPr>
       <w:r>
-        <w:t>Budget Management</w:t>
+        <w:t>Reference Data</w:t>
       </w:r>
     </w:p>
     <w:p>
@@ -3714,20 +3951,25 @@
         <w:t>Available to:</w:t>
       </w:r>
       <w:r>
-        <w:t xml:space="preserve"> Admin, Treasurer</w:t>
+        <w:t xml:space="preserve"> Admin</w:t>
       </w:r>
     </w:p>
     <w:p>
       <w:r>
-        <w:t>Budgets are prepared by fiscal year for offering income by fund/category and for expenses by category and sub-category.</w:t>
+        <w:t>Reference data supplies church-specific dropdown values for member, offering, finance, and budget forms.</w:t>
       </w:r>
     </w:p>
     <w:p>
+      <w:r>
+        <w:t>Supported types include group code, membership status, committee code, offering fund/category, payment method, financial category, and financial sub-category.</w:t>
+      </w:r>
+    </w:p>
+    <w:p>
       <w:pPr>
         <w:pStyle w:val="Heading2"/>
       </w:pPr>
       <w:r>
-        <w:t>Review budgets</w:t>
+        <w:t>Create or update a value</w:t>
       </w:r>
     </w:p>
     <w:p>
@@ -3735,7 +3977,7 @@
         <w:pStyle w:val="ListNumber"/>
         <w:numPr>
           <w:ilvl w:val="0"/>
-          <w:numId w:val="23"/>
+          <w:numId w:val="25"/>
         </w:numPr>
       </w:pPr>
       <w:r>
@@ -3745,7 +3987,7 @@
         <w:rPr>
           <w:b/>
         </w:rPr>
-        <w:t>Budgets</w:t>
+        <w:t>Reference Data</w:t>
       </w:r>
       <w:r>
         <w:t>.</w:t>
@@ -3756,23 +3998,11 @@
         <w:pStyle w:val="ListNumber"/>
         <w:numPr>
           <w:ilvl w:val="0"/>
-          <w:numId w:val="23"/>
+          <w:numId w:val="25"/>
         </w:numPr>
       </w:pPr>
       <w:r>
-        <w:t>Enter the fiscal year and optionally choose a budget type.</w:t>
-      </w:r>
-    </w:p>
-    <w:p>
-      <w:pPr>
-        <w:pStyle w:val="ListNumber"/>
-        <w:numPr>
-          <w:ilvl w:val="0"/>
-          <w:numId w:val="23"/>
-        </w:numPr>
-      </w:pPr>
-      <w:r>
-        <w:t xml:space="preserve">Select </w:t>
+        <w:t xml:space="preserve">Choose the reference type and select </w:t>
       </w:r>
       <w:r>
         <w:rPr>
@@ -3786,18 +4016,10 @@
     </w:p>
     <w:p>
       <w:pPr>
-        <w:pStyle w:val="Heading2"/>
-      </w:pPr>
-      <w:r>
-        <w:t>Add or update a budget</w:t>
-      </w:r>
-    </w:p>
-    <w:p>
-      <w:pPr>
         <w:pStyle w:val="ListNumber"/>
         <w:numPr>
           <w:ilvl w:val="0"/>
-          <w:numId w:val="24"/>
+          <w:numId w:val="25"/>
         </w:numPr>
       </w:pPr>
       <w:r>
@@ -3807,10 +4029,10 @@
         <w:rPr>
           <w:b/>
         </w:rPr>
-        <w:t>Add budget</w:t>
-      </w:r>
-      <w:r>
-        <w:t>.</w:t>
+        <w:t>New value</w:t>
+      </w:r>
+      <w:r>
+        <w:t>, enter an uppercase code, user-facing label, sort order, and active status.</w:t>
       </w:r>
     </w:p>
     <w:p>
@@ -3818,26 +4040,29 @@
         <w:pStyle w:val="ListNumber"/>
         <w:numPr>
           <w:ilvl w:val="0"/>
-          <w:numId w:val="24"/>
+          <w:numId w:val="25"/>
         </w:numPr>
       </w:pPr>
       <w:r>
-        <w:t xml:space="preserve">Choose </w:t>
+        <w:t>For an offering category or financial sub-category, select its parent fund or category.</w:t>
+      </w:r>
+    </w:p>
+    <w:p>
+      <w:pPr>
+        <w:pStyle w:val="ListNumber"/>
+        <w:numPr>
+          <w:ilvl w:val="0"/>
+          <w:numId w:val="25"/>
+        </w:numPr>
+      </w:pPr>
+      <w:r>
+        <w:t xml:space="preserve">Select </w:t>
       </w:r>
       <w:r>
         <w:rPr>
           <w:b/>
         </w:rPr>
-        <w:t>Offering income</w:t>
-      </w:r>
-      <w:r>
-        <w:t xml:space="preserve"> or </w:t>
-      </w:r>
-      <w:r>
-        <w:rPr>
-          <w:b/>
-        </w:rPr>
-        <w:t>Expense</w:t>
+        <w:t>Create value</w:t>
       </w:r>
       <w:r>
         <w:t>.</w:t>
@@ -3848,74 +4073,16 @@
         <w:pStyle w:val="ListNumber"/>
         <w:numPr>
           <w:ilvl w:val="0"/>
-          <w:numId w:val="24"/>
+          <w:numId w:val="25"/>
         </w:numPr>
       </w:pPr>
       <w:r>
-        <w:t xml:space="preserve">Enter the fiscal year and </w:t>
-      </w:r>
-      <w:r>
-        <w:rPr>
-          <w:b/>
-        </w:rPr>
-        <w:t>Budget</w:t>
-      </w:r>
-      <w:r>
-        <w:t xml:space="preserve"> amount.</w:t>
+        <w:t>To edit, select a row, update the details, and save.</w:t>
       </w:r>
     </w:p>
     <w:p>
-      <w:pPr>
-        <w:pStyle w:val="ListNumber"/>
-        <w:numPr>
-          <w:ilvl w:val="0"/>
-          <w:numId w:val="24"/>
-        </w:numPr>
-      </w:pPr>
-      <w:r>
-        <w:t>Choose the category and, for expenses, the applicable sub-category.</w:t>
-      </w:r>
-    </w:p>
-    <w:p>
-      <w:pPr>
-        <w:pStyle w:val="ListNumber"/>
-        <w:numPr>
-          <w:ilvl w:val="0"/>
-          <w:numId w:val="24"/>
-        </w:numPr>
-      </w:pPr>
-      <w:r>
-        <w:t xml:space="preserve">Add an optional memo and select </w:t>
-      </w:r>
-      <w:r>
-        <w:rPr>
-          <w:b/>
-        </w:rPr>
-        <w:t>Save budget</w:t>
-      </w:r>
-      <w:r>
-        <w:t>.</w:t>
-      </w:r>
-    </w:p>
-    <w:p>
-      <w:pPr>
-        <w:pStyle w:val="ListNumber"/>
-        <w:numPr>
-          <w:ilvl w:val="0"/>
-          <w:numId w:val="24"/>
-        </w:numPr>
-      </w:pPr>
-      <w:r>
-        <w:t xml:space="preserve">To edit, select an existing row, update the details, and select </w:t>
-      </w:r>
-      <w:r>
-        <w:rPr>
-          <w:b/>
-        </w:rPr>
-        <w:t>Save changes</w:t>
-      </w:r>
-      <w:r>
-        <w:t>.</w:t>
+      <w:r>
+        <w:t>The code is the value's key and cannot be changed after creation. Inactive values remain stored but are omitted from normal dropdown choices. A value cannot be deleted while member, offering, finance, budget, or archive data uses it.</w:t>
       </w:r>
     </w:p>
     <w:p>
@@ -3928,7 +4095,7 @@
         <w:drawing>
           <wp:inline xmlns:a="http://schemas.openxmlformats.org/drawingml/2006/main" xmlns:pic="http://schemas.openxmlformats.org/drawingml/2006/picture">
             <wp:extent cx="6172200" cy="4286250"/>
-            <wp:docPr id="10" name="Picture 10" descr="Fiscal-year budget list and entry form"/>
+            <wp:docPr id="10" name="Picture 10" descr="Reference data maintenance"/>
             <wp:cNvGraphicFramePr>
               <a:graphicFrameLocks noChangeAspect="1"/>
             </wp:cNvGraphicFramePr>
@@ -3936,7 +4103,7 @@
               <a:graphicData uri="http://schemas.openxmlformats.org/drawingml/2006/picture">
                 <pic:pic>
                   <pic:nvPicPr>
-                    <pic:cNvPr id="0" name="08-budgets.png"/>
+                    <pic:cNvPr id="0" name="09-reference-data.png"/>
                     <pic:cNvPicPr/>
                   </pic:nvPicPr>
                   <pic:blipFill>
@@ -3971,7 +4138,7 @@
           <w:color w:val="667085"/>
           <w:sz w:val="17"/>
         </w:rPr>
-        <w:t>Fiscal-year budget list and entry form</w:t>
+        <w:t>Reference data maintenance</w:t>
       </w:r>
     </w:p>
     <w:p>
@@ -3980,7 +4147,7 @@
         <w:pageBreakBefore/>
       </w:pPr>
       <w:r>
-        <w:t>Reference Data</w:t>
+        <w:t>Reports</w:t>
       </w:r>
     </w:p>
     <w:p>
@@ -3991,25 +4158,15 @@
         <w:t>Available to:</w:t>
       </w:r>
       <w:r>
-        <w:t xml:space="preserve"> Admin</w:t>
+        <w:t xml:space="preserve"> Admin, Treasurer, Pastor, Viewer. The Official Tax Return is available only to Treasurer.</w:t>
       </w:r>
     </w:p>
     <w:p>
-      <w:r>
-        <w:t>Reference data supplies church-specific dropdown values for member, offering, finance, and budget forms.</w:t>
-      </w:r>
-    </w:p>
-    <w:p>
-      <w:r>
-        <w:t>Supported types include group code, membership status, committee code, offering fund/category, payment method, financial category, and financial sub-category.</w:t>
-      </w:r>
-    </w:p>
-    <w:p>
       <w:pPr>
         <w:pStyle w:val="Heading2"/>
       </w:pPr>
       <w:r>
-        <w:t>Create or update a value</w:t>
+        <w:t>Weekly Offering Status</w:t>
       </w:r>
     </w:p>
     <w:p>
@@ -4017,7 +4174,7 @@
         <w:pStyle w:val="ListNumber"/>
         <w:numPr>
           <w:ilvl w:val="0"/>
-          <w:numId w:val="25"/>
+          <w:numId w:val="26"/>
         </w:numPr>
       </w:pPr>
       <w:r>
@@ -4027,7 +4184,16 @@
         <w:rPr>
           <w:b/>
         </w:rPr>
-        <w:t>Reference Data</w:t>
+        <w:t>Reports</w:t>
+      </w:r>
+      <w:r>
+        <w:t xml:space="preserve">, then </w:t>
+      </w:r>
+      <w:r>
+        <w:rPr>
+          <w:b/>
+        </w:rPr>
+        <w:t>Weekly offerings</w:t>
       </w:r>
       <w:r>
         <w:t>.</w:t>
@@ -4038,17 +4204,41 @@
         <w:pStyle w:val="ListNumber"/>
         <w:numPr>
           <w:ilvl w:val="0"/>
-          <w:numId w:val="25"/>
+          <w:numId w:val="26"/>
         </w:numPr>
       </w:pPr>
       <w:r>
-        <w:t xml:space="preserve">Choose the reference type and select </w:t>
+        <w:t>Set start and end dates. The end date is included in the report range.</w:t>
+      </w:r>
+    </w:p>
+    <w:p>
+      <w:pPr>
+        <w:pStyle w:val="ListNumber"/>
+        <w:numPr>
+          <w:ilvl w:val="0"/>
+          <w:numId w:val="26"/>
+        </w:numPr>
+      </w:pPr>
+      <w:r>
+        <w:t>Optionally filter by fund/category and payment method.</w:t>
+      </w:r>
+    </w:p>
+    <w:p>
+      <w:pPr>
+        <w:pStyle w:val="ListNumber"/>
+        <w:numPr>
+          <w:ilvl w:val="0"/>
+          <w:numId w:val="26"/>
+        </w:numPr>
+      </w:pPr>
+      <w:r>
+        <w:t xml:space="preserve">Select </w:t>
       </w:r>
       <w:r>
         <w:rPr>
           <w:b/>
         </w:rPr>
-        <w:t>Refresh</w:t>
+        <w:t>Run report</w:t>
       </w:r>
       <w:r>
         <w:t>.</w:t>
@@ -4059,7 +4249,27 @@
         <w:pStyle w:val="ListNumber"/>
         <w:numPr>
           <w:ilvl w:val="0"/>
-          <w:numId w:val="25"/>
+          <w:numId w:val="26"/>
+        </w:numPr>
+      </w:pPr>
+      <w:r>
+        <w:t>Review labelled totals by offering Sunday, fund, category, giving type, and payment method.</w:t>
+      </w:r>
+    </w:p>
+    <w:p>
+      <w:pPr>
+        <w:pStyle w:val="Heading2"/>
+      </w:pPr>
+      <w:r>
+        <w:t>Offering Summary</w:t>
+      </w:r>
+    </w:p>
+    <w:p>
+      <w:pPr>
+        <w:pStyle w:val="ListNumber"/>
+        <w:numPr>
+          <w:ilvl w:val="0"/>
+          <w:numId w:val="27"/>
         </w:numPr>
       </w:pPr>
       <w:r>
@@ -4069,10 +4279,10 @@
         <w:rPr>
           <w:b/>
         </w:rPr>
-        <w:t>New value</w:t>
-      </w:r>
-      <w:r>
-        <w:t>, enter an uppercase code, user-facing label, sort order, and active status.</w:t>
+        <w:t>Member offerings</w:t>
+      </w:r>
+      <w:r>
+        <w:t>.</w:t>
       </w:r>
     </w:p>
     <w:p>
@@ -4080,11 +4290,11 @@
         <w:pStyle w:val="ListNumber"/>
         <w:numPr>
           <w:ilvl w:val="0"/>
-          <w:numId w:val="25"/>
+          <w:numId w:val="27"/>
         </w:numPr>
       </w:pPr>
       <w:r>
-        <w:t>For an offering category or financial sub-category, select its parent fund or category.</w:t>
+        <w:t>Set the inclusive date range.</w:t>
       </w:r>
     </w:p>
     <w:p>
@@ -4092,7 +4302,19 @@
         <w:pStyle w:val="ListNumber"/>
         <w:numPr>
           <w:ilvl w:val="0"/>
-          <w:numId w:val="25"/>
+          <w:numId w:val="27"/>
+        </w:numPr>
+      </w:pPr>
+      <w:r>
+        <w:t>Optionally enter an offering number and select a fund/category.</w:t>
+      </w:r>
+    </w:p>
+    <w:p>
+      <w:pPr>
+        <w:pStyle w:val="ListNumber"/>
+        <w:numPr>
+          <w:ilvl w:val="0"/>
+          <w:numId w:val="27"/>
         </w:numPr>
       </w:pPr>
       <w:r>
@@ -4102,10 +4324,29 @@
         <w:rPr>
           <w:b/>
         </w:rPr>
-        <w:t>Create value</w:t>
-      </w:r>
-      <w:r>
-        <w:t>.</w:t>
+        <w:t>Run report</w:t>
+      </w:r>
+      <w:r>
+        <w:t>. Results are ordered by offering number.</w:t>
+      </w:r>
+    </w:p>
+    <w:p>
+      <w:pPr>
+        <w:pStyle w:val="Heading2"/>
+      </w:pPr>
+      <w:r>
+        <w:t>Official Tax Return</w:t>
+      </w:r>
+    </w:p>
+    <w:p>
+      <w:r>
+        <w:rPr>
+          <w:b/>
+        </w:rPr>
+        <w:t>Available to:</w:t>
+      </w:r>
+      <w:r>
+        <w:t xml:space="preserve"> Treasurer</w:t>
       </w:r>
     </w:p>
     <w:p>
@@ -4113,16 +4354,263 @@
         <w:pStyle w:val="ListNumber"/>
         <w:numPr>
           <w:ilvl w:val="0"/>
-          <w:numId w:val="25"/>
+          <w:numId w:val="28"/>
         </w:numPr>
       </w:pPr>
       <w:r>
-        <w:t>To edit, select a row, update the details, and save.</w:t>
+        <w:t xml:space="preserve">Select </w:t>
+      </w:r>
+      <w:r>
+        <w:rPr>
+          <w:b/>
+        </w:rPr>
+        <w:t>Official tax</w:t>
+      </w:r>
+      <w:r>
+        <w:t>.</w:t>
       </w:r>
     </w:p>
     <w:p>
-      <w:r>
-        <w:t>The code is the value's key and cannot be changed after creation. Inactive values remain stored but are omitted from normal dropdown choices. A value cannot be deleted while member, offering, finance, budget, or archive data uses it.</w:t>
+      <w:pPr>
+        <w:pStyle w:val="ListNumber"/>
+        <w:numPr>
+          <w:ilvl w:val="0"/>
+          <w:numId w:val="28"/>
+        </w:numPr>
+      </w:pPr>
+      <w:r>
+        <w:t>Enter the tax year and optionally an offering number.</w:t>
+      </w:r>
+    </w:p>
+    <w:p>
+      <w:pPr>
+        <w:pStyle w:val="ListNumber"/>
+        <w:numPr>
+          <w:ilvl w:val="0"/>
+          <w:numId w:val="28"/>
+        </w:numPr>
+      </w:pPr>
+      <w:r>
+        <w:t xml:space="preserve">Select </w:t>
+      </w:r>
+      <w:r>
+        <w:rPr>
+          <w:b/>
+        </w:rPr>
+        <w:t>Run report</w:t>
+      </w:r>
+      <w:r>
+        <w:t>.</w:t>
+      </w:r>
+    </w:p>
+    <w:p>
+      <w:pPr>
+        <w:pStyle w:val="ListNumber"/>
+        <w:numPr>
+          <w:ilvl w:val="0"/>
+          <w:numId w:val="28"/>
+        </w:numPr>
+      </w:pPr>
+      <w:r>
+        <w:t>Review results ordered by offering number and giving date.</w:t>
+      </w:r>
+    </w:p>
+    <w:p>
+      <w:pPr>
+        <w:pStyle w:val="ListNumber"/>
+        <w:numPr>
+          <w:ilvl w:val="0"/>
+          <w:numId w:val="28"/>
+        </w:numPr>
+      </w:pPr>
+      <w:r>
+        <w:t xml:space="preserve">Select </w:t>
+      </w:r>
+      <w:r>
+        <w:rPr>
+          <w:b/>
+        </w:rPr>
+        <w:t>Export CSV</w:t>
+      </w:r>
+      <w:r>
+        <w:t xml:space="preserve"> for tax-receipt preparation.</w:t>
+      </w:r>
+    </w:p>
+    <w:p>
+      <w:pPr>
+        <w:pStyle w:val="Heading2"/>
+      </w:pPr>
+      <w:r>
+        <w:t>Financial Actual vs Budget</w:t>
+      </w:r>
+    </w:p>
+    <w:p>
+      <w:pPr>
+        <w:pStyle w:val="ListNumber"/>
+        <w:numPr>
+          <w:ilvl w:val="0"/>
+          <w:numId w:val="29"/>
+        </w:numPr>
+      </w:pPr>
+      <w:r>
+        <w:t xml:space="preserve">Select </w:t>
+      </w:r>
+      <w:r>
+        <w:rPr>
+          <w:b/>
+        </w:rPr>
+        <w:t>Budget performance</w:t>
+      </w:r>
+      <w:r>
+        <w:t>.</w:t>
+      </w:r>
+    </w:p>
+    <w:p>
+      <w:pPr>
+        <w:pStyle w:val="ListNumber"/>
+        <w:numPr>
+          <w:ilvl w:val="0"/>
+          <w:numId w:val="29"/>
+        </w:numPr>
+      </w:pPr>
+      <w:r>
+        <w:t xml:space="preserve">Enter the fiscal year and select </w:t>
+      </w:r>
+      <w:r>
+        <w:rPr>
+          <w:b/>
+        </w:rPr>
+        <w:t>Run report</w:t>
+      </w:r>
+      <w:r>
+        <w:t>.</w:t>
+      </w:r>
+    </w:p>
+    <w:p>
+      <w:pPr>
+        <w:pStyle w:val="ListNumber"/>
+        <w:numPr>
+          <w:ilvl w:val="0"/>
+          <w:numId w:val="29"/>
+        </w:numPr>
+      </w:pPr>
+      <w:r>
+        <w:t xml:space="preserve">Review labelled income/expense categories, budget, actual, Budget vs. Actual percentage, and variance. A zero budget shows </w:t>
+      </w:r>
+      <w:r>
+        <w:rPr>
+          <w:rFonts w:ascii="Courier New" w:hAnsi="Courier New"/>
+          <w:color w:val="123047"/>
+          <w:sz w:val="19"/>
+        </w:rPr>
+        <w:t>-</w:t>
+      </w:r>
+      <w:r>
+        <w:t xml:space="preserve"> for the percentage.</w:t>
+      </w:r>
+    </w:p>
+    <w:p>
+      <w:pPr>
+        <w:pStyle w:val="Heading2"/>
+      </w:pPr>
+      <w:r>
+        <w:t>Quarterly Financial Report</w:t>
+      </w:r>
+    </w:p>
+    <w:p>
+      <w:pPr>
+        <w:pStyle w:val="ListNumber"/>
+        <w:numPr>
+          <w:ilvl w:val="0"/>
+          <w:numId w:val="30"/>
+        </w:numPr>
+      </w:pPr>
+      <w:r>
+        <w:t xml:space="preserve">Select </w:t>
+      </w:r>
+      <w:r>
+        <w:rPr>
+          <w:b/>
+        </w:rPr>
+        <w:t>Quarterly Financial Report</w:t>
+      </w:r>
+      <w:r>
+        <w:t>.</w:t>
+      </w:r>
+    </w:p>
+    <w:p>
+      <w:pPr>
+        <w:pStyle w:val="ListNumber"/>
+        <w:numPr>
+          <w:ilvl w:val="0"/>
+          <w:numId w:val="30"/>
+        </w:numPr>
+      </w:pPr>
+      <w:r>
+        <w:t>Select the calendar year and quarter.</w:t>
+      </w:r>
+    </w:p>
+    <w:p>
+      <w:pPr>
+        <w:pStyle w:val="ListNumber"/>
+        <w:numPr>
+          <w:ilvl w:val="0"/>
+          <w:numId w:val="30"/>
+        </w:numPr>
+      </w:pPr>
+      <w:r>
+        <w:t>Select the Offering download for the quarterly offering workbook or the Expenditure download for the quarterly expense workbook.</w:t>
+      </w:r>
+    </w:p>
+    <w:p>
+      <w:pPr>
+        <w:pStyle w:val="ListNumber"/>
+        <w:numPr>
+          <w:ilvl w:val="0"/>
+          <w:numId w:val="30"/>
+        </w:numPr>
+      </w:pPr>
+      <w:r>
+        <w:t xml:space="preserve">Review the configured carry-over row in Offering and the configured </w:t>
+      </w:r>
+      <w:r>
+        <w:rPr>
+          <w:rFonts w:ascii="Courier New" w:hAnsi="Courier New"/>
+          <w:color w:val="123047"/>
+          <w:sz w:val="19"/>
+        </w:rPr>
+        <w:t>CONTINGENCY</w:t>
+      </w:r>
+      <w:r>
+        <w:t xml:space="preserve"> Financial Category label in Expenditure.</w:t>
+      </w:r>
+    </w:p>
+    <w:p>
+      <w:r>
+        <w:t xml:space="preserve">Both workbooks use Letter landscape print settings with scaling set to </w:t>
+      </w:r>
+      <w:r>
+        <w:rPr>
+          <w:b/>
+        </w:rPr>
+        <w:t>Adjust to 100%</w:t>
+      </w:r>
+      <w:r>
+        <w:t>.</w:t>
+      </w:r>
+    </w:p>
+    <w:p>
+      <w:r>
+        <w:t xml:space="preserve">For table reports that show </w:t>
+      </w:r>
+      <w:r>
+        <w:rPr>
+          <w:b/>
+        </w:rPr>
+        <w:t>Export CSV</w:t>
+      </w:r>
+      <w:r>
+        <w:t>, select it to download the current report results.</w:t>
       </w:r>
     </w:p>
     <w:p>
@@ -4135,7 +4623,7 @@
         <w:drawing>
           <wp:inline xmlns:a="http://schemas.openxmlformats.org/drawingml/2006/main" xmlns:pic="http://schemas.openxmlformats.org/drawingml/2006/picture">
             <wp:extent cx="6172200" cy="4286250"/>
-            <wp:docPr id="11" name="Picture 11" descr="Reference data maintenance"/>
+            <wp:docPr id="11" name="Picture 11" descr="Quarterly Financial Report controls and Excel downloads"/>
             <wp:cNvGraphicFramePr>
               <a:graphicFrameLocks noChangeAspect="1"/>
             </wp:cNvGraphicFramePr>
@@ -4143,7 +4631,7 @@
               <a:graphicData uri="http://schemas.openxmlformats.org/drawingml/2006/picture">
                 <pic:pic>
                   <pic:nvPicPr>
-                    <pic:cNvPr id="0" name="09-reference-data.png"/>
+                    <pic:cNvPr id="0" name="10-reports.png"/>
                     <pic:cNvPicPr/>
                   </pic:nvPicPr>
                   <pic:blipFill>
@@ -4178,7 +4666,7 @@
           <w:color w:val="667085"/>
           <w:sz w:val="17"/>
         </w:rPr>
-        <w:t>Reference data maintenance</w:t>
+        <w:t>Quarterly Financial Report controls and Excel downloads</w:t>
       </w:r>
     </w:p>
     <w:p>
@@ -4187,7 +4675,7 @@
         <w:pageBreakBefore/>
       </w:pPr>
       <w:r>
-        <w:t>Reports</w:t>
+        <w:t>My Profile</w:t>
       </w:r>
     </w:p>
     <w:p>
@@ -4198,15 +4686,7 @@
         <w:t>Available to:</w:t>
       </w:r>
       <w:r>
-        <w:t xml:space="preserve"> Admin, Treasurer, Pastor, Viewer. The Official Tax Return is available only to Treasurer.</w:t>
-      </w:r>
-    </w:p>
-    <w:p>
-      <w:pPr>
-        <w:pStyle w:val="Heading2"/>
-      </w:pPr>
-      <w:r>
-        <w:t>Weekly Offering Status</w:t>
+        <w:t xml:space="preserve"> Admin, Member</w:t>
       </w:r>
     </w:p>
     <w:p>
@@ -4214,7 +4694,7 @@
         <w:pStyle w:val="ListNumber"/>
         <w:numPr>
           <w:ilvl w:val="0"/>
-          <w:numId w:val="26"/>
+          <w:numId w:val="31"/>
         </w:numPr>
       </w:pPr>
       <w:r>
@@ -4224,433 +4704,55 @@
         <w:rPr>
           <w:b/>
         </w:rPr>
-        <w:t>Reports</w:t>
-      </w:r>
-      <w:r>
-        <w:t xml:space="preserve">, then </w:t>
+        <w:t>My Profile</w:t>
+      </w:r>
+      <w:r>
+        <w:t>.</w:t>
+      </w:r>
+    </w:p>
+    <w:p>
+      <w:pPr>
+        <w:pStyle w:val="ListNumber"/>
+        <w:numPr>
+          <w:ilvl w:val="0"/>
+          <w:numId w:val="31"/>
+        </w:numPr>
+      </w:pPr>
+      <w:r>
+        <w:t>Review the primary email, which is the login ID and cannot be changed here.</w:t>
+      </w:r>
+    </w:p>
+    <w:p>
+      <w:pPr>
+        <w:pStyle w:val="ListNumber"/>
+        <w:numPr>
+          <w:ilvl w:val="0"/>
+          <w:numId w:val="31"/>
+        </w:numPr>
+      </w:pPr>
+      <w:r>
+        <w:t>Update display name, nickname, secondary email, phone numbers, address, and notes.</w:t>
+      </w:r>
+    </w:p>
+    <w:p>
+      <w:pPr>
+        <w:pStyle w:val="ListNumber"/>
+        <w:numPr>
+          <w:ilvl w:val="0"/>
+          <w:numId w:val="31"/>
+        </w:numPr>
+      </w:pPr>
+      <w:r>
+        <w:t xml:space="preserve">Select </w:t>
       </w:r>
       <w:r>
         <w:rPr>
           <w:b/>
         </w:rPr>
-        <w:t>Weekly offerings</w:t>
+        <w:t>Save profile</w:t>
       </w:r>
       <w:r>
         <w:t>.</w:t>
-      </w:r>
-    </w:p>
-    <w:p>
-      <w:pPr>
-        <w:pStyle w:val="ListNumber"/>
-        <w:numPr>
-          <w:ilvl w:val="0"/>
-          <w:numId w:val="26"/>
-        </w:numPr>
-      </w:pPr>
-      <w:r>
-        <w:t>Set start and end dates. The end date is included in the report range.</w:t>
-      </w:r>
-    </w:p>
-    <w:p>
-      <w:pPr>
-        <w:pStyle w:val="ListNumber"/>
-        <w:numPr>
-          <w:ilvl w:val="0"/>
-          <w:numId w:val="26"/>
-        </w:numPr>
-      </w:pPr>
-      <w:r>
-        <w:t>Optionally filter by fund/category and payment method.</w:t>
-      </w:r>
-    </w:p>
-    <w:p>
-      <w:pPr>
-        <w:pStyle w:val="ListNumber"/>
-        <w:numPr>
-          <w:ilvl w:val="0"/>
-          <w:numId w:val="26"/>
-        </w:numPr>
-      </w:pPr>
-      <w:r>
-        <w:t xml:space="preserve">Select </w:t>
-      </w:r>
-      <w:r>
-        <w:rPr>
-          <w:b/>
-        </w:rPr>
-        <w:t>Run report</w:t>
-      </w:r>
-      <w:r>
-        <w:t>.</w:t>
-      </w:r>
-    </w:p>
-    <w:p>
-      <w:pPr>
-        <w:pStyle w:val="ListNumber"/>
-        <w:numPr>
-          <w:ilvl w:val="0"/>
-          <w:numId w:val="26"/>
-        </w:numPr>
-      </w:pPr>
-      <w:r>
-        <w:t>Review labelled totals by offering Sunday, fund, category, giving type, and payment method.</w:t>
-      </w:r>
-    </w:p>
-    <w:p>
-      <w:pPr>
-        <w:pStyle w:val="Heading2"/>
-      </w:pPr>
-      <w:r>
-        <w:t>Offering Summary</w:t>
-      </w:r>
-    </w:p>
-    <w:p>
-      <w:pPr>
-        <w:pStyle w:val="ListNumber"/>
-        <w:numPr>
-          <w:ilvl w:val="0"/>
-          <w:numId w:val="27"/>
-        </w:numPr>
-      </w:pPr>
-      <w:r>
-        <w:t xml:space="preserve">Select </w:t>
-      </w:r>
-      <w:r>
-        <w:rPr>
-          <w:b/>
-        </w:rPr>
-        <w:t>Member offerings</w:t>
-      </w:r>
-      <w:r>
-        <w:t>.</w:t>
-      </w:r>
-    </w:p>
-    <w:p>
-      <w:pPr>
-        <w:pStyle w:val="ListNumber"/>
-        <w:numPr>
-          <w:ilvl w:val="0"/>
-          <w:numId w:val="27"/>
-        </w:numPr>
-      </w:pPr>
-      <w:r>
-        <w:t>Set the inclusive date range.</w:t>
-      </w:r>
-    </w:p>
-    <w:p>
-      <w:pPr>
-        <w:pStyle w:val="ListNumber"/>
-        <w:numPr>
-          <w:ilvl w:val="0"/>
-          <w:numId w:val="27"/>
-        </w:numPr>
-      </w:pPr>
-      <w:r>
-        <w:t>Optionally enter an offering number and select a fund/category.</w:t>
-      </w:r>
-    </w:p>
-    <w:p>
-      <w:pPr>
-        <w:pStyle w:val="ListNumber"/>
-        <w:numPr>
-          <w:ilvl w:val="0"/>
-          <w:numId w:val="27"/>
-        </w:numPr>
-      </w:pPr>
-      <w:r>
-        <w:t xml:space="preserve">Select </w:t>
-      </w:r>
-      <w:r>
-        <w:rPr>
-          <w:b/>
-        </w:rPr>
-        <w:t>Run report</w:t>
-      </w:r>
-      <w:r>
-        <w:t>. Results are ordered by offering number.</w:t>
-      </w:r>
-    </w:p>
-    <w:p>
-      <w:pPr>
-        <w:pStyle w:val="Heading2"/>
-      </w:pPr>
-      <w:r>
-        <w:t>Official Tax Return</w:t>
-      </w:r>
-    </w:p>
-    <w:p>
-      <w:r>
-        <w:rPr>
-          <w:b/>
-        </w:rPr>
-        <w:t>Available to:</w:t>
-      </w:r>
-      <w:r>
-        <w:t xml:space="preserve"> Treasurer</w:t>
-      </w:r>
-    </w:p>
-    <w:p>
-      <w:pPr>
-        <w:pStyle w:val="ListNumber"/>
-        <w:numPr>
-          <w:ilvl w:val="0"/>
-          <w:numId w:val="28"/>
-        </w:numPr>
-      </w:pPr>
-      <w:r>
-        <w:t xml:space="preserve">Select </w:t>
-      </w:r>
-      <w:r>
-        <w:rPr>
-          <w:b/>
-        </w:rPr>
-        <w:t>Official tax</w:t>
-      </w:r>
-      <w:r>
-        <w:t>.</w:t>
-      </w:r>
-    </w:p>
-    <w:p>
-      <w:pPr>
-        <w:pStyle w:val="ListNumber"/>
-        <w:numPr>
-          <w:ilvl w:val="0"/>
-          <w:numId w:val="28"/>
-        </w:numPr>
-      </w:pPr>
-      <w:r>
-        <w:t>Enter the tax year and optionally an offering number.</w:t>
-      </w:r>
-    </w:p>
-    <w:p>
-      <w:pPr>
-        <w:pStyle w:val="ListNumber"/>
-        <w:numPr>
-          <w:ilvl w:val="0"/>
-          <w:numId w:val="28"/>
-        </w:numPr>
-      </w:pPr>
-      <w:r>
-        <w:t xml:space="preserve">Select </w:t>
-      </w:r>
-      <w:r>
-        <w:rPr>
-          <w:b/>
-        </w:rPr>
-        <w:t>Run report</w:t>
-      </w:r>
-      <w:r>
-        <w:t>.</w:t>
-      </w:r>
-    </w:p>
-    <w:p>
-      <w:pPr>
-        <w:pStyle w:val="ListNumber"/>
-        <w:numPr>
-          <w:ilvl w:val="0"/>
-          <w:numId w:val="28"/>
-        </w:numPr>
-      </w:pPr>
-      <w:r>
-        <w:t>Review results ordered by offering number and giving date.</w:t>
-      </w:r>
-    </w:p>
-    <w:p>
-      <w:pPr>
-        <w:pStyle w:val="ListNumber"/>
-        <w:numPr>
-          <w:ilvl w:val="0"/>
-          <w:numId w:val="28"/>
-        </w:numPr>
-      </w:pPr>
-      <w:r>
-        <w:t xml:space="preserve">Select </w:t>
-      </w:r>
-      <w:r>
-        <w:rPr>
-          <w:b/>
-        </w:rPr>
-        <w:t>Export CSV</w:t>
-      </w:r>
-      <w:r>
-        <w:t xml:space="preserve"> for tax-receipt preparation.</w:t>
-      </w:r>
-    </w:p>
-    <w:p>
-      <w:pPr>
-        <w:pStyle w:val="Heading2"/>
-      </w:pPr>
-      <w:r>
-        <w:t>Financial Actual vs Budget</w:t>
-      </w:r>
-    </w:p>
-    <w:p>
-      <w:pPr>
-        <w:pStyle w:val="ListNumber"/>
-        <w:numPr>
-          <w:ilvl w:val="0"/>
-          <w:numId w:val="29"/>
-        </w:numPr>
-      </w:pPr>
-      <w:r>
-        <w:t xml:space="preserve">Select </w:t>
-      </w:r>
-      <w:r>
-        <w:rPr>
-          <w:b/>
-        </w:rPr>
-        <w:t>Budget performance</w:t>
-      </w:r>
-      <w:r>
-        <w:t>.</w:t>
-      </w:r>
-    </w:p>
-    <w:p>
-      <w:pPr>
-        <w:pStyle w:val="ListNumber"/>
-        <w:numPr>
-          <w:ilvl w:val="0"/>
-          <w:numId w:val="29"/>
-        </w:numPr>
-      </w:pPr>
-      <w:r>
-        <w:t xml:space="preserve">Enter the fiscal year and select </w:t>
-      </w:r>
-      <w:r>
-        <w:rPr>
-          <w:b/>
-        </w:rPr>
-        <w:t>Run report</w:t>
-      </w:r>
-      <w:r>
-        <w:t>.</w:t>
-      </w:r>
-    </w:p>
-    <w:p>
-      <w:pPr>
-        <w:pStyle w:val="ListNumber"/>
-        <w:numPr>
-          <w:ilvl w:val="0"/>
-          <w:numId w:val="29"/>
-        </w:numPr>
-      </w:pPr>
-      <w:r>
-        <w:t xml:space="preserve">Review labelled income/expense categories, budget, actual, Budget vs. Actual percentage, and variance. A zero budget shows </w:t>
-      </w:r>
-      <w:r>
-        <w:rPr>
-          <w:rFonts w:ascii="Courier New" w:hAnsi="Courier New"/>
-          <w:color w:val="123047"/>
-          <w:sz w:val="19"/>
-        </w:rPr>
-        <w:t>-</w:t>
-      </w:r>
-      <w:r>
-        <w:t xml:space="preserve"> for the percentage.</w:t>
-      </w:r>
-    </w:p>
-    <w:p>
-      <w:pPr>
-        <w:pStyle w:val="Heading2"/>
-      </w:pPr>
-      <w:r>
-        <w:t>Quarterly Financial Report</w:t>
-      </w:r>
-    </w:p>
-    <w:p>
-      <w:pPr>
-        <w:pStyle w:val="ListNumber"/>
-        <w:numPr>
-          <w:ilvl w:val="0"/>
-          <w:numId w:val="30"/>
-        </w:numPr>
-      </w:pPr>
-      <w:r>
-        <w:t xml:space="preserve">Select </w:t>
-      </w:r>
-      <w:r>
-        <w:rPr>
-          <w:b/>
-        </w:rPr>
-        <w:t>Quarterly Financial Report</w:t>
-      </w:r>
-      <w:r>
-        <w:t>.</w:t>
-      </w:r>
-    </w:p>
-    <w:p>
-      <w:pPr>
-        <w:pStyle w:val="ListNumber"/>
-        <w:numPr>
-          <w:ilvl w:val="0"/>
-          <w:numId w:val="30"/>
-        </w:numPr>
-      </w:pPr>
-      <w:r>
-        <w:t>Select the calendar year and quarter.</w:t>
-      </w:r>
-    </w:p>
-    <w:p>
-      <w:pPr>
-        <w:pStyle w:val="ListNumber"/>
-        <w:numPr>
-          <w:ilvl w:val="0"/>
-          <w:numId w:val="30"/>
-        </w:numPr>
-      </w:pPr>
-      <w:r>
-        <w:t>Select the Offering download for the quarterly offering workbook or the Expenditure download for the quarterly expense workbook.</w:t>
-      </w:r>
-    </w:p>
-    <w:p>
-      <w:pPr>
-        <w:pStyle w:val="ListNumber"/>
-        <w:numPr>
-          <w:ilvl w:val="0"/>
-          <w:numId w:val="30"/>
-        </w:numPr>
-      </w:pPr>
-      <w:r>
-        <w:t xml:space="preserve">Review the configured carry-over row in Offering and the configured </w:t>
-      </w:r>
-      <w:r>
-        <w:rPr>
-          <w:rFonts w:ascii="Courier New" w:hAnsi="Courier New"/>
-          <w:color w:val="123047"/>
-          <w:sz w:val="19"/>
-        </w:rPr>
-        <w:t>CONTINGENCY</w:t>
-      </w:r>
-      <w:r>
-        <w:t xml:space="preserve"> Financial Category label in Expenditure.</w:t>
-      </w:r>
-    </w:p>
-    <w:p>
-      <w:r>
-        <w:t xml:space="preserve">Both workbooks use Letter landscape print settings with scaling set to </w:t>
-      </w:r>
-      <w:r>
-        <w:rPr>
-          <w:b/>
-        </w:rPr>
-        <w:t>Adjust to 100%</w:t>
-      </w:r>
-      <w:r>
-        <w:t>.</w:t>
-      </w:r>
-    </w:p>
-    <w:p>
-      <w:r>
-        <w:t xml:space="preserve">For table reports that show </w:t>
-      </w:r>
-      <w:r>
-        <w:rPr>
-          <w:b/>
-        </w:rPr>
-        <w:t>Export CSV</w:t>
-      </w:r>
-      <w:r>
-        <w:t>, select it to download the current report results.</w:t>
       </w:r>
     </w:p>
     <w:p>
@@ -4663,7 +4765,7 @@
         <w:drawing>
           <wp:inline xmlns:a="http://schemas.openxmlformats.org/drawingml/2006/main" xmlns:pic="http://schemas.openxmlformats.org/drawingml/2006/picture">
             <wp:extent cx="6172200" cy="4286250"/>
-            <wp:docPr id="12" name="Picture 12" descr="Quarterly Financial Report controls and Excel downloads"/>
+            <wp:docPr id="12" name="Picture 12" descr="Personal profile maintenance"/>
             <wp:cNvGraphicFramePr>
               <a:graphicFrameLocks noChangeAspect="1"/>
             </wp:cNvGraphicFramePr>
@@ -4671,7 +4773,7 @@
               <a:graphicData uri="http://schemas.openxmlformats.org/drawingml/2006/picture">
                 <pic:pic>
                   <pic:nvPicPr>
-                    <pic:cNvPr id="0" name="10-reports.png"/>
+                    <pic:cNvPr id="0" name="11-profile.png"/>
                     <pic:cNvPicPr/>
                   </pic:nvPicPr>
                   <pic:blipFill>
@@ -4706,7 +4808,7 @@
           <w:color w:val="667085"/>
           <w:sz w:val="17"/>
         </w:rPr>
-        <w:t>Quarterly Financial Report controls and Excel downloads</w:t>
+        <w:t>Personal profile maintenance</w:t>
       </w:r>
     </w:p>
     <w:p>
@@ -4715,7 +4817,7 @@
         <w:pageBreakBefore/>
       </w:pPr>
       <w:r>
-        <w:t>My Profile</w:t>
+        <w:t>System Administration</w:t>
       </w:r>
     </w:p>
     <w:p>
@@ -4726,7 +4828,25 @@
         <w:t>Available to:</w:t>
       </w:r>
       <w:r>
-        <w:t xml:space="preserve"> Admin, Member</w:t>
+        <w:t xml:space="preserve"> Admin</w:t>
+      </w:r>
+    </w:p>
+    <w:p>
+      <w:r>
+        <w:t>System Administration contains the Full Backup, Full Restore, Fiscal Archive, Church Settings, and Email Settings workflows. These functions affect the whole church database or application-wide configuration and should be used only from an authorized church device.</w:t>
+      </w:r>
+    </w:p>
+    <w:p>
+      <w:pPr>
+        <w:pStyle w:val="Heading2"/>
+      </w:pPr>
+      <w:r>
+        <w:t>Church Settings</w:t>
+      </w:r>
+    </w:p>
+    <w:p>
+      <w:r>
+        <w:t>Administrators can change the church identity and branding without editing server files or restarting the application.</w:t>
       </w:r>
     </w:p>
     <w:p>
@@ -4734,7 +4854,7 @@
         <w:pStyle w:val="ListNumber"/>
         <w:numPr>
           <w:ilvl w:val="0"/>
-          <w:numId w:val="31"/>
+          <w:numId w:val="32"/>
         </w:numPr>
       </w:pPr>
       <w:r>
@@ -4744,7 +4864,16 @@
         <w:rPr>
           <w:b/>
         </w:rPr>
-        <w:t>My Profile</w:t>
+        <w:t>System Administration</w:t>
+      </w:r>
+      <w:r>
+        <w:t xml:space="preserve">, then </w:t>
+      </w:r>
+      <w:r>
+        <w:rPr>
+          <w:b/>
+        </w:rPr>
+        <w:t>Church Settings</w:t>
       </w:r>
       <w:r>
         <w:t>.</w:t>
@@ -4755,11 +4884,11 @@
         <w:pStyle w:val="ListNumber"/>
         <w:numPr>
           <w:ilvl w:val="0"/>
-          <w:numId w:val="31"/>
+          <w:numId w:val="32"/>
         </w:numPr>
       </w:pPr>
       <w:r>
-        <w:t>Review the primary email, which is the login ID and cannot be changed here.</w:t>
+        <w:t>Enter the church name and address. These two fields are required.</w:t>
       </w:r>
     </w:p>
     <w:p>
@@ -4767,11 +4896,11 @@
         <w:pStyle w:val="ListNumber"/>
         <w:numPr>
           <w:ilvl w:val="0"/>
-          <w:numId w:val="31"/>
+          <w:numId w:val="32"/>
         </w:numPr>
       </w:pPr>
       <w:r>
-        <w:t>Update display name, nickname, secondary email, phone numbers, address, and notes.</w:t>
+        <w:t>Enter the contact information, treasurer name, charity registration number, receipt issue location, and church website as applicable.</w:t>
       </w:r>
     </w:p>
     <w:p>
@@ -4779,17 +4908,71 @@
         <w:pStyle w:val="ListNumber"/>
         <w:numPr>
           <w:ilvl w:val="0"/>
-          <w:numId w:val="31"/>
+          <w:numId w:val="32"/>
         </w:numPr>
       </w:pPr>
       <w:r>
-        <w:t xml:space="preserve">Select </w:t>
+        <w:t xml:space="preserve">Under </w:t>
       </w:r>
       <w:r>
         <w:rPr>
           <w:b/>
         </w:rPr>
-        <w:t>Save profile</w:t>
+        <w:t>Operational Settings</w:t>
+      </w:r>
+      <w:r>
+        <w:t>, select the church time zone and the month when the fiscal year starts.</w:t>
+      </w:r>
+    </w:p>
+    <w:p>
+      <w:pPr>
+        <w:pStyle w:val="ListNumber"/>
+        <w:numPr>
+          <w:ilvl w:val="0"/>
+          <w:numId w:val="32"/>
+        </w:numPr>
+      </w:pPr>
+      <w:r>
+        <w:t xml:space="preserve">Set </w:t>
+      </w:r>
+      <w:r>
+        <w:rPr>
+          <w:b/>
+        </w:rPr>
+        <w:t>List page size</w:t>
+      </w:r>
+      <w:r>
+        <w:t xml:space="preserve"> from 5 through 100 and select how long a prepared data operation remains available.</w:t>
+      </w:r>
+    </w:p>
+    <w:p>
+      <w:pPr>
+        <w:pStyle w:val="ListNumber"/>
+        <w:numPr>
+          <w:ilvl w:val="0"/>
+          <w:numId w:val="32"/>
+        </w:numPr>
+      </w:pPr>
+      <w:r>
+        <w:t>To replace the church logo or dashboard banner, select a PNG or JPEG image no larger than 5 MB. The preview shows the current image until a replacement is selected.</w:t>
+      </w:r>
+    </w:p>
+    <w:p>
+      <w:pPr>
+        <w:pStyle w:val="ListNumber"/>
+        <w:numPr>
+          <w:ilvl w:val="0"/>
+          <w:numId w:val="32"/>
+        </w:numPr>
+      </w:pPr>
+      <w:r>
+        <w:t xml:space="preserve">Select </w:t>
+      </w:r>
+      <w:r>
+        <w:rPr>
+          <w:b/>
+        </w:rPr>
+        <w:t>Save church settings</w:t>
       </w:r>
       <w:r>
         <w:t>.</w:t>
@@ -4804,8 +4987,8 @@
       <w:r>
         <w:drawing>
           <wp:inline xmlns:a="http://schemas.openxmlformats.org/drawingml/2006/main" xmlns:pic="http://schemas.openxmlformats.org/drawingml/2006/picture">
-            <wp:extent cx="6172200" cy="4286250"/>
-            <wp:docPr id="13" name="Picture 13" descr="Personal profile maintenance"/>
+            <wp:extent cx="6172200" cy="4288055"/>
+            <wp:docPr id="13" name="Picture 13" descr="Church information, operational settings, and branding"/>
             <wp:cNvGraphicFramePr>
               <a:graphicFrameLocks noChangeAspect="1"/>
             </wp:cNvGraphicFramePr>
@@ -4813,7 +4996,7 @@
               <a:graphicData uri="http://schemas.openxmlformats.org/drawingml/2006/picture">
                 <pic:pic>
                   <pic:nvPicPr>
-                    <pic:cNvPr id="0" name="11-profile.png"/>
+                    <pic:cNvPr id="0" name="13-church-settings.png"/>
                     <pic:cNvPicPr/>
                   </pic:nvPicPr>
                   <pic:blipFill>
@@ -4825,230 +5008,7 @@
                   <pic:spPr>
                     <a:xfrm>
                       <a:off x="0" y="0"/>
-                      <a:ext cx="6172200" cy="4286250"/>
-                    </a:xfrm>
-                    <a:prstGeom prst="rect"/>
-                  </pic:spPr>
-                </pic:pic>
-              </a:graphicData>
-            </a:graphic>
-          </wp:inline>
-        </w:drawing>
-      </w:r>
-    </w:p>
-    <w:p>
-      <w:pPr>
-        <w:spacing w:after="160"/>
-        <w:jc w:val="center"/>
-      </w:pPr>
-      <w:r>
-        <w:rPr>
-          <w:rFonts w:ascii="Aptos" w:hAnsi="Aptos"/>
-          <w:i/>
-          <w:color w:val="667085"/>
-          <w:sz w:val="17"/>
-        </w:rPr>
-        <w:t>Personal profile maintenance</w:t>
-      </w:r>
-    </w:p>
-    <w:p>
-      <w:pPr>
-        <w:pStyle w:val="Heading1"/>
-        <w:pageBreakBefore/>
-      </w:pPr>
-      <w:r>
-        <w:t>System Administration</w:t>
-      </w:r>
-    </w:p>
-    <w:p>
-      <w:r>
-        <w:rPr>
-          <w:b/>
-        </w:rPr>
-        <w:t>Available to:</w:t>
-      </w:r>
-      <w:r>
-        <w:t xml:space="preserve"> Admin</w:t>
-      </w:r>
-    </w:p>
-    <w:p>
-      <w:r>
-        <w:t>System Administration contains the Full Backup, Full Restore, Fiscal Archive, Church Settings, and Email Settings workflows. These functions affect the whole church database or application-wide configuration and should be used only from an authorized church device.</w:t>
-      </w:r>
-    </w:p>
-    <w:p>
-      <w:pPr>
-        <w:pStyle w:val="Heading2"/>
-      </w:pPr>
-      <w:r>
-        <w:t>Church Settings</w:t>
-      </w:r>
-    </w:p>
-    <w:p>
-      <w:r>
-        <w:t>Administrators can change the church identity and branding without editing server files or restarting the application.</w:t>
-      </w:r>
-    </w:p>
-    <w:p>
-      <w:pPr>
-        <w:pStyle w:val="ListNumber"/>
-        <w:numPr>
-          <w:ilvl w:val="0"/>
-          <w:numId w:val="32"/>
-        </w:numPr>
-      </w:pPr>
-      <w:r>
-        <w:t xml:space="preserve">Select </w:t>
-      </w:r>
-      <w:r>
-        <w:rPr>
-          <w:b/>
-        </w:rPr>
-        <w:t>System Administration</w:t>
-      </w:r>
-      <w:r>
-        <w:t xml:space="preserve">, then </w:t>
-      </w:r>
-      <w:r>
-        <w:rPr>
-          <w:b/>
-        </w:rPr>
-        <w:t>Church Settings</w:t>
-      </w:r>
-      <w:r>
-        <w:t>.</w:t>
-      </w:r>
-    </w:p>
-    <w:p>
-      <w:pPr>
-        <w:pStyle w:val="ListNumber"/>
-        <w:numPr>
-          <w:ilvl w:val="0"/>
-          <w:numId w:val="32"/>
-        </w:numPr>
-      </w:pPr>
-      <w:r>
-        <w:t>Enter the church name and address. These two fields are required.</w:t>
-      </w:r>
-    </w:p>
-    <w:p>
-      <w:pPr>
-        <w:pStyle w:val="ListNumber"/>
-        <w:numPr>
-          <w:ilvl w:val="0"/>
-          <w:numId w:val="32"/>
-        </w:numPr>
-      </w:pPr>
-      <w:r>
-        <w:t>Enter the contact information, treasurer name, charity registration number, receipt issue location, and church website as applicable.</w:t>
-      </w:r>
-    </w:p>
-    <w:p>
-      <w:pPr>
-        <w:pStyle w:val="ListNumber"/>
-        <w:numPr>
-          <w:ilvl w:val="0"/>
-          <w:numId w:val="32"/>
-        </w:numPr>
-      </w:pPr>
-      <w:r>
-        <w:t xml:space="preserve">Under </w:t>
-      </w:r>
-      <w:r>
-        <w:rPr>
-          <w:b/>
-        </w:rPr>
-        <w:t>Operational Settings</w:t>
-      </w:r>
-      <w:r>
-        <w:t>, select the church time zone and the month when the fiscal year starts.</w:t>
-      </w:r>
-    </w:p>
-    <w:p>
-      <w:pPr>
-        <w:pStyle w:val="ListNumber"/>
-        <w:numPr>
-          <w:ilvl w:val="0"/>
-          <w:numId w:val="32"/>
-        </w:numPr>
-      </w:pPr>
-      <w:r>
-        <w:t xml:space="preserve">Set </w:t>
-      </w:r>
-      <w:r>
-        <w:rPr>
-          <w:b/>
-        </w:rPr>
-        <w:t>List page size</w:t>
-      </w:r>
-      <w:r>
-        <w:t xml:space="preserve"> from 5 through 100 and select how long a prepared data operation remains available.</w:t>
-      </w:r>
-    </w:p>
-    <w:p>
-      <w:pPr>
-        <w:pStyle w:val="ListNumber"/>
-        <w:numPr>
-          <w:ilvl w:val="0"/>
-          <w:numId w:val="32"/>
-        </w:numPr>
-      </w:pPr>
-      <w:r>
-        <w:t>To replace the church logo or dashboard banner, select a PNG or JPEG image no larger than 5 MB. The preview shows the current image until a replacement is selected.</w:t>
-      </w:r>
-    </w:p>
-    <w:p>
-      <w:pPr>
-        <w:pStyle w:val="ListNumber"/>
-        <w:numPr>
-          <w:ilvl w:val="0"/>
-          <w:numId w:val="32"/>
-        </w:numPr>
-      </w:pPr>
-      <w:r>
-        <w:t xml:space="preserve">Select </w:t>
-      </w:r>
-      <w:r>
-        <w:rPr>
-          <w:b/>
-        </w:rPr>
-        <w:t>Save church settings</w:t>
-      </w:r>
-      <w:r>
-        <w:t>.</w:t>
-      </w:r>
-    </w:p>
-    <w:p>
-      <w:pPr>
-        <w:keepNext/>
-        <w:spacing w:before="100" w:after="60"/>
-        <w:jc w:val="center"/>
-      </w:pPr>
-      <w:r>
-        <w:drawing>
-          <wp:inline xmlns:a="http://schemas.openxmlformats.org/drawingml/2006/main" xmlns:pic="http://schemas.openxmlformats.org/drawingml/2006/picture">
-            <wp:extent cx="6172200" cy="3859085"/>
-            <wp:docPr id="14" name="Picture 14" descr="Church information, operational settings, and branding"/>
-            <wp:cNvGraphicFramePr>
-              <a:graphicFrameLocks noChangeAspect="1"/>
-            </wp:cNvGraphicFramePr>
-            <a:graphic>
-              <a:graphicData uri="http://schemas.openxmlformats.org/drawingml/2006/picture">
-                <pic:pic>
-                  <pic:nvPicPr>
-                    <pic:cNvPr id="0" name="13-church-settings.png"/>
-                    <pic:cNvPicPr/>
-                  </pic:nvPicPr>
-                  <pic:blipFill>
-                    <a:blip r:embed="rId24"/>
-                    <a:stretch>
-                      <a:fillRect/>
-                    </a:stretch>
-                  </pic:blipFill>
-                  <pic:spPr>
-                    <a:xfrm>
-                      <a:off x="0" y="0"/>
-                      <a:ext cx="6172200" cy="3859085"/>
+                      <a:ext cx="6172200" cy="4288055"/>
                     </a:xfrm>
                     <a:prstGeom prst="rect"/>
                   </pic:spPr>

</xml_diff>